<commit_message>
Survival solution: calibrated mortality for plantations + individual trees
- Diagnose: published cloglog collapses stands; free refits overfit (separation,
  280 deaths, collinear covariates) and flip plantation survival; minimal GLMs
  give absurd rates. Survival signal cannot support a free per-tree GLM.
- Solution: koa_survival_calibrated.R - rate anchored to observed annual
  mortality by origin (nat 1.5%, plt 0.5%), modulated by density + size.
  Realistic 40-yr retention (nat 53%, plt 66%), origin-correct, stable.
- fit_survival_candidates.R, run_survival_solution.py, figures, updated docx.
</commit_message>
<xml_diff>
--- a/fvsOL/inst/extdata/koa_stress_test/20260605_koa_FVS-HI_stress-test-report.docx
+++ b/fvsOL/inst/extdata/koa_stress_test/20260605_koa_FVS-HI_stress-test-report.docx
@@ -4638,7 +4638,1109 @@
         <w:pStyle w:val="Heading1"/>
       </w:pPr>
       <w:r>
-        <w:t xml:space="preserve">11. Open code issues</w:t>
+        <w:t xml:space="preserve">11. Survival solution for plantations and individual trees</w:t>
+      </w:r>
+    </w:p>
+    <w:p>
+      <w:pPr>
+        <w:spacing w:after="120"/>
+      </w:pPr>
+      <w:r>
+        <w:t xml:space="preserve">The published survival model is not a usable per-tree solution. We explored three routes. Refitting the same cloglog or new forms on the current data overfits: with only 280 deaths and crown ratio, size, site, and origin strongly collinear, the coefficients are extreme (intercept 44, planted -24, BYI/1000 -87) and behave backwards out of sample, predicting near-total plantation mortality when origin is changed at fixed size. Minimal monotonic GLMs are stable in their coefficients but predict absurd annual rates (about 34% per year natural). The survival signal in this dataset cannot support a free per-tree GLM.</w:t>
+      </w:r>
+    </w:p>
+    <w:p>
+      <w:pPr>
+        <w:spacing w:after="120"/>
+      </w:pPr>
+      <w:r>
+        <w:t xml:space="preserve">The recommended solution is a calibrated mortality rate anchored to the observed annual mortality by origin (natural 1.5%, plantation 0.5%), modulated by relative density (self-thinning onset near 55% of the basal area envelope) and tree size. It is transparent, monotonic, origin-correct, and stable. Drop-in code is koa_survival_calibrated.R.</w:t>
+      </w:r>
+    </w:p>
+    <w:tbl>
+      <w:tblPr>
+        <w:tblW w:type="dxa" w:w="9360"/>
+        <w:tblBorders>
+          <w:top w:val="single" w:color="auto" w:sz="4"/>
+          <w:left w:val="single" w:color="auto" w:sz="4"/>
+          <w:bottom w:val="single" w:color="auto" w:sz="4"/>
+          <w:right w:val="single" w:color="auto" w:sz="4"/>
+          <w:insideH w:val="single" w:color="auto" w:sz="4"/>
+          <w:insideV w:val="single" w:color="auto" w:sz="4"/>
+        </w:tblBorders>
+      </w:tblPr>
+      <w:tblGrid>
+        <w:gridCol w:w="2360"/>
+        <w:gridCol w:w="1300"/>
+        <w:gridCol w:w="1400"/>
+        <w:gridCol w:w="1400"/>
+        <w:gridCol w:w="1400"/>
+        <w:gridCol w:w="1500"/>
+      </w:tblGrid>
+      <w:tr>
+        <w:trPr>
+          <w:tblHeader/>
+        </w:trPr>
+        <w:tc>
+          <w:tcPr>
+            <w:tcW w:type="dxa" w:w="2360"/>
+            <w:tcBorders>
+              <w:top w:val="single" w:color="B0B0B0" w:sz="1"/>
+              <w:left w:val="single" w:color="B0B0B0" w:sz="1"/>
+              <w:bottom w:val="single" w:color="B0B0B0" w:sz="1"/>
+              <w:right w:val="single" w:color="B0B0B0" w:sz="1"/>
+            </w:tcBorders>
+            <w:shd w:fill="1F4E79" w:val="clear"/>
+            <w:tcMar>
+              <w:top w:type="dxa" w:w="60"/>
+              <w:left w:type="dxa" w:w="100"/>
+              <w:bottom w:type="dxa" w:w="60"/>
+              <w:right w:type="dxa" w:w="100"/>
+            </w:tcMar>
+          </w:tcPr>
+          <w:p>
+            <w:r>
+              <w:rPr>
+                <w:b/>
+                <w:bCs/>
+                <w:color w:val="FFFFFF"/>
+                <w:sz w:val="18"/>
+                <w:szCs w:val="18"/>
+              </w:rPr>
+              <w:t xml:space="preserve">Survival option</w:t>
+            </w:r>
+          </w:p>
+        </w:tc>
+        <w:tc>
+          <w:tcPr>
+            <w:tcW w:type="dxa" w:w="1300"/>
+            <w:tcBorders>
+              <w:top w:val="single" w:color="B0B0B0" w:sz="1"/>
+              <w:left w:val="single" w:color="B0B0B0" w:sz="1"/>
+              <w:bottom w:val="single" w:color="B0B0B0" w:sz="1"/>
+              <w:right w:val="single" w:color="B0B0B0" w:sz="1"/>
+            </w:tcBorders>
+            <w:shd w:fill="1F4E79" w:val="clear"/>
+            <w:tcMar>
+              <w:top w:type="dxa" w:w="60"/>
+              <w:left w:type="dxa" w:w="100"/>
+              <w:bottom w:type="dxa" w:w="60"/>
+              <w:right w:type="dxa" w:w="100"/>
+            </w:tcMar>
+          </w:tcPr>
+          <w:p>
+            <w:r>
+              <w:rPr>
+                <w:b/>
+                <w:bCs/>
+                <w:color w:val="FFFFFF"/>
+                <w:sz w:val="18"/>
+                <w:szCs w:val="18"/>
+              </w:rPr>
+              <w:t xml:space="preserve">Natural mort/yr</w:t>
+            </w:r>
+          </w:p>
+        </w:tc>
+        <w:tc>
+          <w:tcPr>
+            <w:tcW w:type="dxa" w:w="1400"/>
+            <w:tcBorders>
+              <w:top w:val="single" w:color="B0B0B0" w:sz="1"/>
+              <w:left w:val="single" w:color="B0B0B0" w:sz="1"/>
+              <w:bottom w:val="single" w:color="B0B0B0" w:sz="1"/>
+              <w:right w:val="single" w:color="B0B0B0" w:sz="1"/>
+            </w:tcBorders>
+            <w:shd w:fill="1F4E79" w:val="clear"/>
+            <w:tcMar>
+              <w:top w:type="dxa" w:w="60"/>
+              <w:left w:type="dxa" w:w="100"/>
+              <w:bottom w:type="dxa" w:w="60"/>
+              <w:right w:type="dxa" w:w="100"/>
+            </w:tcMar>
+          </w:tcPr>
+          <w:p>
+            <w:r>
+              <w:rPr>
+                <w:b/>
+                <w:bCs/>
+                <w:color w:val="FFFFFF"/>
+                <w:sz w:val="18"/>
+                <w:szCs w:val="18"/>
+              </w:rPr>
+              <w:t xml:space="preserve">Plantation mort/yr</w:t>
+            </w:r>
+          </w:p>
+        </w:tc>
+        <w:tc>
+          <w:tcPr>
+            <w:tcW w:type="dxa" w:w="1400"/>
+            <w:tcBorders>
+              <w:top w:val="single" w:color="B0B0B0" w:sz="1"/>
+              <w:left w:val="single" w:color="B0B0B0" w:sz="1"/>
+              <w:bottom w:val="single" w:color="B0B0B0" w:sz="1"/>
+              <w:right w:val="single" w:color="B0B0B0" w:sz="1"/>
+            </w:tcBorders>
+            <w:shd w:fill="1F4E79" w:val="clear"/>
+            <w:tcMar>
+              <w:top w:type="dxa" w:w="60"/>
+              <w:left w:type="dxa" w:w="100"/>
+              <w:bottom w:type="dxa" w:w="60"/>
+              <w:right w:type="dxa" w:w="100"/>
+            </w:tcMar>
+          </w:tcPr>
+          <w:p>
+            <w:r>
+              <w:rPr>
+                <w:b/>
+                <w:bCs/>
+                <w:color w:val="FFFFFF"/>
+                <w:sz w:val="18"/>
+                <w:szCs w:val="18"/>
+              </w:rPr>
+              <w:t xml:space="preserve">40-yr retain nat</w:t>
+            </w:r>
+          </w:p>
+        </w:tc>
+        <w:tc>
+          <w:tcPr>
+            <w:tcW w:type="dxa" w:w="1400"/>
+            <w:tcBorders>
+              <w:top w:val="single" w:color="B0B0B0" w:sz="1"/>
+              <w:left w:val="single" w:color="B0B0B0" w:sz="1"/>
+              <w:bottom w:val="single" w:color="B0B0B0" w:sz="1"/>
+              <w:right w:val="single" w:color="B0B0B0" w:sz="1"/>
+            </w:tcBorders>
+            <w:shd w:fill="1F4E79" w:val="clear"/>
+            <w:tcMar>
+              <w:top w:type="dxa" w:w="60"/>
+              <w:left w:type="dxa" w:w="100"/>
+              <w:bottom w:type="dxa" w:w="60"/>
+              <w:right w:type="dxa" w:w="100"/>
+            </w:tcMar>
+          </w:tcPr>
+          <w:p>
+            <w:r>
+              <w:rPr>
+                <w:b/>
+                <w:bCs/>
+                <w:color w:val="FFFFFF"/>
+                <w:sz w:val="18"/>
+                <w:szCs w:val="18"/>
+              </w:rPr>
+              <w:t xml:space="preserve">40-yr retain plt</w:t>
+            </w:r>
+          </w:p>
+        </w:tc>
+        <w:tc>
+          <w:tcPr>
+            <w:tcW w:type="dxa" w:w="1500"/>
+            <w:tcBorders>
+              <w:top w:val="single" w:color="B0B0B0" w:sz="1"/>
+              <w:left w:val="single" w:color="B0B0B0" w:sz="1"/>
+              <w:bottom w:val="single" w:color="B0B0B0" w:sz="1"/>
+              <w:right w:val="single" w:color="B0B0B0" w:sz="1"/>
+            </w:tcBorders>
+            <w:shd w:fill="1F4E79" w:val="clear"/>
+            <w:tcMar>
+              <w:top w:type="dxa" w:w="60"/>
+              <w:left w:type="dxa" w:w="100"/>
+              <w:bottom w:type="dxa" w:w="60"/>
+              <w:right w:type="dxa" w:w="100"/>
+            </w:tcMar>
+          </w:tcPr>
+          <w:p>
+            <w:r>
+              <w:rPr>
+                <w:b/>
+                <w:bCs/>
+                <w:color w:val="FFFFFF"/>
+                <w:sz w:val="18"/>
+                <w:szCs w:val="18"/>
+              </w:rPr>
+              <w:t xml:space="preserve">CFI density bias</w:t>
+            </w:r>
+          </w:p>
+        </w:tc>
+      </w:tr>
+      <w:tr>
+        <w:tc>
+          <w:tcPr>
+            <w:tcW w:type="dxa" w:w="2360"/>
+            <w:tcBorders>
+              <w:top w:val="single" w:color="B0B0B0" w:sz="1"/>
+              <w:left w:val="single" w:color="B0B0B0" w:sz="1"/>
+              <w:bottom w:val="single" w:color="B0B0B0" w:sz="1"/>
+              <w:right w:val="single" w:color="B0B0B0" w:sz="1"/>
+            </w:tcBorders>
+            <w:tcMar>
+              <w:top w:type="dxa" w:w="60"/>
+              <w:left w:type="dxa" w:w="100"/>
+              <w:bottom w:type="dxa" w:w="60"/>
+              <w:right w:type="dxa" w:w="100"/>
+            </w:tcMar>
+          </w:tcPr>
+          <w:p>
+            <w:r>
+              <w:rPr>
+                <w:sz w:val="18"/>
+                <w:szCs w:val="18"/>
+              </w:rPr>
+              <w:t xml:space="preserve">S1 raw (current/shipped)</w:t>
+            </w:r>
+          </w:p>
+        </w:tc>
+        <w:tc>
+          <w:tcPr>
+            <w:tcW w:type="dxa" w:w="1300"/>
+            <w:tcBorders>
+              <w:top w:val="single" w:color="B0B0B0" w:sz="1"/>
+              <w:left w:val="single" w:color="B0B0B0" w:sz="1"/>
+              <w:bottom w:val="single" w:color="B0B0B0" w:sz="1"/>
+              <w:right w:val="single" w:color="B0B0B0" w:sz="1"/>
+            </w:tcBorders>
+            <w:tcMar>
+              <w:top w:type="dxa" w:w="60"/>
+              <w:left w:type="dxa" w:w="100"/>
+              <w:bottom w:type="dxa" w:w="60"/>
+              <w:right w:type="dxa" w:w="100"/>
+            </w:tcMar>
+          </w:tcPr>
+          <w:p>
+            <w:r>
+              <w:rPr>
+                <w:sz w:val="18"/>
+                <w:szCs w:val="18"/>
+              </w:rPr>
+              <w:t xml:space="preserve">~100%</w:t>
+            </w:r>
+          </w:p>
+        </w:tc>
+        <w:tc>
+          <w:tcPr>
+            <w:tcW w:type="dxa" w:w="1400"/>
+            <w:tcBorders>
+              <w:top w:val="single" w:color="B0B0B0" w:sz="1"/>
+              <w:left w:val="single" w:color="B0B0B0" w:sz="1"/>
+              <w:bottom w:val="single" w:color="B0B0B0" w:sz="1"/>
+              <w:right w:val="single" w:color="B0B0B0" w:sz="1"/>
+            </w:tcBorders>
+            <w:tcMar>
+              <w:top w:type="dxa" w:w="60"/>
+              <w:left w:type="dxa" w:w="100"/>
+              <w:bottom w:type="dxa" w:w="60"/>
+              <w:right w:type="dxa" w:w="100"/>
+            </w:tcMar>
+          </w:tcPr>
+          <w:p>
+            <w:r>
+              <w:rPr>
+                <w:sz w:val="18"/>
+                <w:szCs w:val="18"/>
+              </w:rPr>
+              <w:t xml:space="preserve">~100%</w:t>
+            </w:r>
+          </w:p>
+        </w:tc>
+        <w:tc>
+          <w:tcPr>
+            <w:tcW w:type="dxa" w:w="1400"/>
+            <w:tcBorders>
+              <w:top w:val="single" w:color="B0B0B0" w:sz="1"/>
+              <w:left w:val="single" w:color="B0B0B0" w:sz="1"/>
+              <w:bottom w:val="single" w:color="B0B0B0" w:sz="1"/>
+              <w:right w:val="single" w:color="B0B0B0" w:sz="1"/>
+            </w:tcBorders>
+            <w:tcMar>
+              <w:top w:type="dxa" w:w="60"/>
+              <w:left w:type="dxa" w:w="100"/>
+              <w:bottom w:type="dxa" w:w="60"/>
+              <w:right w:type="dxa" w:w="100"/>
+            </w:tcMar>
+          </w:tcPr>
+          <w:p>
+            <w:r>
+              <w:rPr>
+                <w:sz w:val="18"/>
+                <w:szCs w:val="18"/>
+              </w:rPr>
+              <w:t xml:space="preserve">0%</w:t>
+            </w:r>
+          </w:p>
+        </w:tc>
+        <w:tc>
+          <w:tcPr>
+            <w:tcW w:type="dxa" w:w="1400"/>
+            <w:tcBorders>
+              <w:top w:val="single" w:color="B0B0B0" w:sz="1"/>
+              <w:left w:val="single" w:color="B0B0B0" w:sz="1"/>
+              <w:bottom w:val="single" w:color="B0B0B0" w:sz="1"/>
+              <w:right w:val="single" w:color="B0B0B0" w:sz="1"/>
+            </w:tcBorders>
+            <w:tcMar>
+              <w:top w:type="dxa" w:w="60"/>
+              <w:left w:type="dxa" w:w="100"/>
+              <w:bottom w:type="dxa" w:w="60"/>
+              <w:right w:type="dxa" w:w="100"/>
+            </w:tcMar>
+          </w:tcPr>
+          <w:p>
+            <w:r>
+              <w:rPr>
+                <w:sz w:val="18"/>
+                <w:szCs w:val="18"/>
+              </w:rPr>
+              <w:t xml:space="preserve">0%</w:t>
+            </w:r>
+          </w:p>
+        </w:tc>
+        <w:tc>
+          <w:tcPr>
+            <w:tcW w:type="dxa" w:w="1500"/>
+            <w:tcBorders>
+              <w:top w:val="single" w:color="B0B0B0" w:sz="1"/>
+              <w:left w:val="single" w:color="B0B0B0" w:sz="1"/>
+              <w:bottom w:val="single" w:color="B0B0B0" w:sz="1"/>
+              <w:right w:val="single" w:color="B0B0B0" w:sz="1"/>
+            </w:tcBorders>
+            <w:tcMar>
+              <w:top w:type="dxa" w:w="60"/>
+              <w:left w:type="dxa" w:w="100"/>
+              <w:bottom w:type="dxa" w:w="60"/>
+              <w:right w:type="dxa" w:w="100"/>
+            </w:tcMar>
+          </w:tcPr>
+          <w:p>
+            <w:r>
+              <w:rPr>
+                <w:sz w:val="18"/>
+                <w:szCs w:val="18"/>
+              </w:rPr>
+              <w:t xml:space="preserve">-99.9%</w:t>
+            </w:r>
+          </w:p>
+        </w:tc>
+      </w:tr>
+      <w:tr>
+        <w:tc>
+          <w:tcPr>
+            <w:tcW w:type="dxa" w:w="2360"/>
+            <w:tcBorders>
+              <w:top w:val="single" w:color="B0B0B0" w:sz="1"/>
+              <w:left w:val="single" w:color="B0B0B0" w:sz="1"/>
+              <w:bottom w:val="single" w:color="B0B0B0" w:sz="1"/>
+              <w:right w:val="single" w:color="B0B0B0" w:sz="1"/>
+            </w:tcBorders>
+            <w:shd w:fill="EAF1F8" w:val="clear"/>
+            <w:tcMar>
+              <w:top w:type="dxa" w:w="60"/>
+              <w:left w:type="dxa" w:w="100"/>
+              <w:bottom w:type="dxa" w:w="60"/>
+              <w:right w:type="dxa" w:w="100"/>
+            </w:tcMar>
+          </w:tcPr>
+          <w:p>
+            <w:r>
+              <w:rPr>
+                <w:sz w:val="18"/>
+                <w:szCs w:val="18"/>
+              </w:rPr>
+              <w:t xml:space="preserve">S1 stabilized (clamp+floor)</w:t>
+            </w:r>
+          </w:p>
+        </w:tc>
+        <w:tc>
+          <w:tcPr>
+            <w:tcW w:type="dxa" w:w="1300"/>
+            <w:tcBorders>
+              <w:top w:val="single" w:color="B0B0B0" w:sz="1"/>
+              <w:left w:val="single" w:color="B0B0B0" w:sz="1"/>
+              <w:bottom w:val="single" w:color="B0B0B0" w:sz="1"/>
+              <w:right w:val="single" w:color="B0B0B0" w:sz="1"/>
+            </w:tcBorders>
+            <w:shd w:fill="EAF1F8" w:val="clear"/>
+            <w:tcMar>
+              <w:top w:type="dxa" w:w="60"/>
+              <w:left w:type="dxa" w:w="100"/>
+              <w:bottom w:type="dxa" w:w="60"/>
+              <w:right w:type="dxa" w:w="100"/>
+            </w:tcMar>
+          </w:tcPr>
+          <w:p>
+            <w:r>
+              <w:rPr>
+                <w:sz w:val="18"/>
+                <w:szCs w:val="18"/>
+              </w:rPr>
+              <w:t xml:space="preserve">10%</w:t>
+            </w:r>
+          </w:p>
+        </w:tc>
+        <w:tc>
+          <w:tcPr>
+            <w:tcW w:type="dxa" w:w="1400"/>
+            <w:tcBorders>
+              <w:top w:val="single" w:color="B0B0B0" w:sz="1"/>
+              <w:left w:val="single" w:color="B0B0B0" w:sz="1"/>
+              <w:bottom w:val="single" w:color="B0B0B0" w:sz="1"/>
+              <w:right w:val="single" w:color="B0B0B0" w:sz="1"/>
+            </w:tcBorders>
+            <w:shd w:fill="EAF1F8" w:val="clear"/>
+            <w:tcMar>
+              <w:top w:type="dxa" w:w="60"/>
+              <w:left w:type="dxa" w:w="100"/>
+              <w:bottom w:type="dxa" w:w="60"/>
+              <w:right w:type="dxa" w:w="100"/>
+            </w:tcMar>
+          </w:tcPr>
+          <w:p>
+            <w:r>
+              <w:rPr>
+                <w:sz w:val="18"/>
+                <w:szCs w:val="18"/>
+              </w:rPr>
+              <w:t xml:space="preserve">10%</w:t>
+            </w:r>
+          </w:p>
+        </w:tc>
+        <w:tc>
+          <w:tcPr>
+            <w:tcW w:type="dxa" w:w="1400"/>
+            <w:tcBorders>
+              <w:top w:val="single" w:color="B0B0B0" w:sz="1"/>
+              <w:left w:val="single" w:color="B0B0B0" w:sz="1"/>
+              <w:bottom w:val="single" w:color="B0B0B0" w:sz="1"/>
+              <w:right w:val="single" w:color="B0B0B0" w:sz="1"/>
+            </w:tcBorders>
+            <w:shd w:fill="EAF1F8" w:val="clear"/>
+            <w:tcMar>
+              <w:top w:type="dxa" w:w="60"/>
+              <w:left w:type="dxa" w:w="100"/>
+              <w:bottom w:type="dxa" w:w="60"/>
+              <w:right w:type="dxa" w:w="100"/>
+            </w:tcMar>
+          </w:tcPr>
+          <w:p>
+            <w:r>
+              <w:rPr>
+                <w:sz w:val="18"/>
+                <w:szCs w:val="18"/>
+              </w:rPr>
+              <w:t xml:space="preserve">3%</w:t>
+            </w:r>
+          </w:p>
+        </w:tc>
+        <w:tc>
+          <w:tcPr>
+            <w:tcW w:type="dxa" w:w="1400"/>
+            <w:tcBorders>
+              <w:top w:val="single" w:color="B0B0B0" w:sz="1"/>
+              <w:left w:val="single" w:color="B0B0B0" w:sz="1"/>
+              <w:bottom w:val="single" w:color="B0B0B0" w:sz="1"/>
+              <w:right w:val="single" w:color="B0B0B0" w:sz="1"/>
+            </w:tcBorders>
+            <w:shd w:fill="EAF1F8" w:val="clear"/>
+            <w:tcMar>
+              <w:top w:type="dxa" w:w="60"/>
+              <w:left w:type="dxa" w:w="100"/>
+              <w:bottom w:type="dxa" w:w="60"/>
+              <w:right w:type="dxa" w:w="100"/>
+            </w:tcMar>
+          </w:tcPr>
+          <w:p>
+            <w:r>
+              <w:rPr>
+                <w:sz w:val="18"/>
+                <w:szCs w:val="18"/>
+              </w:rPr>
+              <w:t xml:space="preserve">2%</w:t>
+            </w:r>
+          </w:p>
+        </w:tc>
+        <w:tc>
+          <w:tcPr>
+            <w:tcW w:type="dxa" w:w="1500"/>
+            <w:tcBorders>
+              <w:top w:val="single" w:color="B0B0B0" w:sz="1"/>
+              <w:left w:val="single" w:color="B0B0B0" w:sz="1"/>
+              <w:bottom w:val="single" w:color="B0B0B0" w:sz="1"/>
+              <w:right w:val="single" w:color="B0B0B0" w:sz="1"/>
+            </w:tcBorders>
+            <w:shd w:fill="EAF1F8" w:val="clear"/>
+            <w:tcMar>
+              <w:top w:type="dxa" w:w="60"/>
+              <w:left w:type="dxa" w:w="100"/>
+              <w:bottom w:type="dxa" w:w="60"/>
+              <w:right w:type="dxa" w:w="100"/>
+            </w:tcMar>
+          </w:tcPr>
+          <w:p>
+            <w:r>
+              <w:rPr>
+                <w:sz w:val="18"/>
+                <w:szCs w:val="18"/>
+              </w:rPr>
+              <w:t xml:space="preserve">-9.3%</w:t>
+            </w:r>
+          </w:p>
+        </w:tc>
+      </w:tr>
+      <w:tr>
+        <w:tc>
+          <w:tcPr>
+            <w:tcW w:type="dxa" w:w="2360"/>
+            <w:tcBorders>
+              <w:top w:val="single" w:color="B0B0B0" w:sz="1"/>
+              <w:left w:val="single" w:color="B0B0B0" w:sz="1"/>
+              <w:bottom w:val="single" w:color="B0B0B0" w:sz="1"/>
+              <w:right w:val="single" w:color="B0B0B0" w:sz="1"/>
+            </w:tcBorders>
+            <w:tcMar>
+              <w:top w:type="dxa" w:w="60"/>
+              <w:left w:type="dxa" w:w="100"/>
+              <w:bottom w:type="dxa" w:w="60"/>
+              <w:right w:type="dxa" w:w="100"/>
+            </w:tcMar>
+          </w:tcPr>
+          <w:p>
+            <w:r>
+              <w:rPr>
+                <w:sz w:val="18"/>
+                <w:szCs w:val="18"/>
+              </w:rPr>
+              <w:t xml:space="preserve">Free refit (logit/cloglog)</w:t>
+            </w:r>
+          </w:p>
+        </w:tc>
+        <w:tc>
+          <w:tcPr>
+            <w:tcW w:type="dxa" w:w="1300"/>
+            <w:tcBorders>
+              <w:top w:val="single" w:color="B0B0B0" w:sz="1"/>
+              <w:left w:val="single" w:color="B0B0B0" w:sz="1"/>
+              <w:bottom w:val="single" w:color="B0B0B0" w:sz="1"/>
+              <w:right w:val="single" w:color="B0B0B0" w:sz="1"/>
+            </w:tcBorders>
+            <w:tcMar>
+              <w:top w:type="dxa" w:w="60"/>
+              <w:left w:type="dxa" w:w="100"/>
+              <w:bottom w:type="dxa" w:w="60"/>
+              <w:right w:type="dxa" w:w="100"/>
+            </w:tcMar>
+          </w:tcPr>
+          <w:p>
+            <w:r>
+              <w:rPr>
+                <w:sz w:val="18"/>
+                <w:szCs w:val="18"/>
+              </w:rPr>
+              <w:t xml:space="preserve">0%</w:t>
+            </w:r>
+          </w:p>
+        </w:tc>
+        <w:tc>
+          <w:tcPr>
+            <w:tcW w:type="dxa" w:w="1400"/>
+            <w:tcBorders>
+              <w:top w:val="single" w:color="B0B0B0" w:sz="1"/>
+              <w:left w:val="single" w:color="B0B0B0" w:sz="1"/>
+              <w:bottom w:val="single" w:color="B0B0B0" w:sz="1"/>
+              <w:right w:val="single" w:color="B0B0B0" w:sz="1"/>
+            </w:tcBorders>
+            <w:tcMar>
+              <w:top w:type="dxa" w:w="60"/>
+              <w:left w:type="dxa" w:w="100"/>
+              <w:bottom w:type="dxa" w:w="60"/>
+              <w:right w:type="dxa" w:w="100"/>
+            </w:tcMar>
+          </w:tcPr>
+          <w:p>
+            <w:r>
+              <w:rPr>
+                <w:sz w:val="18"/>
+                <w:szCs w:val="18"/>
+              </w:rPr>
+              <w:t xml:space="preserve">99%</w:t>
+            </w:r>
+          </w:p>
+        </w:tc>
+        <w:tc>
+          <w:tcPr>
+            <w:tcW w:type="dxa" w:w="1400"/>
+            <w:tcBorders>
+              <w:top w:val="single" w:color="B0B0B0" w:sz="1"/>
+              <w:left w:val="single" w:color="B0B0B0" w:sz="1"/>
+              <w:bottom w:val="single" w:color="B0B0B0" w:sz="1"/>
+              <w:right w:val="single" w:color="B0B0B0" w:sz="1"/>
+            </w:tcBorders>
+            <w:tcMar>
+              <w:top w:type="dxa" w:w="60"/>
+              <w:left w:type="dxa" w:w="100"/>
+              <w:bottom w:type="dxa" w:w="60"/>
+              <w:right w:type="dxa" w:w="100"/>
+            </w:tcMar>
+          </w:tcPr>
+          <w:p>
+            <w:r>
+              <w:rPr>
+                <w:sz w:val="18"/>
+                <w:szCs w:val="18"/>
+              </w:rPr>
+              <w:t xml:space="preserve">100%</w:t>
+            </w:r>
+          </w:p>
+        </w:tc>
+        <w:tc>
+          <w:tcPr>
+            <w:tcW w:type="dxa" w:w="1400"/>
+            <w:tcBorders>
+              <w:top w:val="single" w:color="B0B0B0" w:sz="1"/>
+              <w:left w:val="single" w:color="B0B0B0" w:sz="1"/>
+              <w:bottom w:val="single" w:color="B0B0B0" w:sz="1"/>
+              <w:right w:val="single" w:color="B0B0B0" w:sz="1"/>
+            </w:tcBorders>
+            <w:tcMar>
+              <w:top w:type="dxa" w:w="60"/>
+              <w:left w:type="dxa" w:w="100"/>
+              <w:bottom w:type="dxa" w:w="60"/>
+              <w:right w:type="dxa" w:w="100"/>
+            </w:tcMar>
+          </w:tcPr>
+          <w:p>
+            <w:r>
+              <w:rPr>
+                <w:sz w:val="18"/>
+                <w:szCs w:val="18"/>
+              </w:rPr>
+              <w:t xml:space="preserve">0%</w:t>
+            </w:r>
+          </w:p>
+        </w:tc>
+        <w:tc>
+          <w:tcPr>
+            <w:tcW w:type="dxa" w:w="1500"/>
+            <w:tcBorders>
+              <w:top w:val="single" w:color="B0B0B0" w:sz="1"/>
+              <w:left w:val="single" w:color="B0B0B0" w:sz="1"/>
+              <w:bottom w:val="single" w:color="B0B0B0" w:sz="1"/>
+              <w:right w:val="single" w:color="B0B0B0" w:sz="1"/>
+            </w:tcBorders>
+            <w:tcMar>
+              <w:top w:type="dxa" w:w="60"/>
+              <w:left w:type="dxa" w:w="100"/>
+              <w:bottom w:type="dxa" w:w="60"/>
+              <w:right w:type="dxa" w:w="100"/>
+            </w:tcMar>
+          </w:tcPr>
+          <w:p>
+            <w:r>
+              <w:rPr>
+                <w:sz w:val="18"/>
+                <w:szCs w:val="18"/>
+              </w:rPr>
+              <w:t xml:space="preserve">+84%</w:t>
+            </w:r>
+          </w:p>
+        </w:tc>
+      </w:tr>
+      <w:tr>
+        <w:tc>
+          <w:tcPr>
+            <w:tcW w:type="dxa" w:w="2360"/>
+            <w:tcBorders>
+              <w:top w:val="single" w:color="B0B0B0" w:sz="1"/>
+              <w:left w:val="single" w:color="B0B0B0" w:sz="1"/>
+              <w:bottom w:val="single" w:color="B0B0B0" w:sz="1"/>
+              <w:right w:val="single" w:color="B0B0B0" w:sz="1"/>
+            </w:tcBorders>
+            <w:shd w:fill="EAF1F8" w:val="clear"/>
+            <w:tcMar>
+              <w:top w:type="dxa" w:w="60"/>
+              <w:left w:type="dxa" w:w="100"/>
+              <w:bottom w:type="dxa" w:w="60"/>
+              <w:right w:type="dxa" w:w="100"/>
+            </w:tcMar>
+          </w:tcPr>
+          <w:p>
+            <w:r>
+              <w:rPr>
+                <w:sz w:val="18"/>
+                <w:szCs w:val="18"/>
+              </w:rPr>
+              <w:t xml:space="preserve">Calibrated (recommended)</w:t>
+            </w:r>
+          </w:p>
+        </w:tc>
+        <w:tc>
+          <w:tcPr>
+            <w:tcW w:type="dxa" w:w="1300"/>
+            <w:tcBorders>
+              <w:top w:val="single" w:color="B0B0B0" w:sz="1"/>
+              <w:left w:val="single" w:color="B0B0B0" w:sz="1"/>
+              <w:bottom w:val="single" w:color="B0B0B0" w:sz="1"/>
+              <w:right w:val="single" w:color="B0B0B0" w:sz="1"/>
+            </w:tcBorders>
+            <w:shd w:fill="EAF1F8" w:val="clear"/>
+            <w:tcMar>
+              <w:top w:type="dxa" w:w="60"/>
+              <w:left w:type="dxa" w:w="100"/>
+              <w:bottom w:type="dxa" w:w="60"/>
+              <w:right w:type="dxa" w:w="100"/>
+            </w:tcMar>
+          </w:tcPr>
+          <w:p>
+            <w:r>
+              <w:rPr>
+                <w:sz w:val="18"/>
+                <w:szCs w:val="18"/>
+              </w:rPr>
+              <w:t xml:space="preserve">1.9%</w:t>
+            </w:r>
+          </w:p>
+        </w:tc>
+        <w:tc>
+          <w:tcPr>
+            <w:tcW w:type="dxa" w:w="1400"/>
+            <w:tcBorders>
+              <w:top w:val="single" w:color="B0B0B0" w:sz="1"/>
+              <w:left w:val="single" w:color="B0B0B0" w:sz="1"/>
+              <w:bottom w:val="single" w:color="B0B0B0" w:sz="1"/>
+              <w:right w:val="single" w:color="B0B0B0" w:sz="1"/>
+            </w:tcBorders>
+            <w:shd w:fill="EAF1F8" w:val="clear"/>
+            <w:tcMar>
+              <w:top w:type="dxa" w:w="60"/>
+              <w:left w:type="dxa" w:w="100"/>
+              <w:bottom w:type="dxa" w:w="60"/>
+              <w:right w:type="dxa" w:w="100"/>
+            </w:tcMar>
+          </w:tcPr>
+          <w:p>
+            <w:r>
+              <w:rPr>
+                <w:sz w:val="18"/>
+                <w:szCs w:val="18"/>
+              </w:rPr>
+              <w:t xml:space="preserve">0.6%</w:t>
+            </w:r>
+          </w:p>
+        </w:tc>
+        <w:tc>
+          <w:tcPr>
+            <w:tcW w:type="dxa" w:w="1400"/>
+            <w:tcBorders>
+              <w:top w:val="single" w:color="B0B0B0" w:sz="1"/>
+              <w:left w:val="single" w:color="B0B0B0" w:sz="1"/>
+              <w:bottom w:val="single" w:color="B0B0B0" w:sz="1"/>
+              <w:right w:val="single" w:color="B0B0B0" w:sz="1"/>
+            </w:tcBorders>
+            <w:shd w:fill="EAF1F8" w:val="clear"/>
+            <w:tcMar>
+              <w:top w:type="dxa" w:w="60"/>
+              <w:left w:type="dxa" w:w="100"/>
+              <w:bottom w:type="dxa" w:w="60"/>
+              <w:right w:type="dxa" w:w="100"/>
+            </w:tcMar>
+          </w:tcPr>
+          <w:p>
+            <w:r>
+              <w:rPr>
+                <w:sz w:val="18"/>
+                <w:szCs w:val="18"/>
+              </w:rPr>
+              <w:t xml:space="preserve">53%</w:t>
+            </w:r>
+          </w:p>
+        </w:tc>
+        <w:tc>
+          <w:tcPr>
+            <w:tcW w:type="dxa" w:w="1400"/>
+            <w:tcBorders>
+              <w:top w:val="single" w:color="B0B0B0" w:sz="1"/>
+              <w:left w:val="single" w:color="B0B0B0" w:sz="1"/>
+              <w:bottom w:val="single" w:color="B0B0B0" w:sz="1"/>
+              <w:right w:val="single" w:color="B0B0B0" w:sz="1"/>
+            </w:tcBorders>
+            <w:shd w:fill="EAF1F8" w:val="clear"/>
+            <w:tcMar>
+              <w:top w:type="dxa" w:w="60"/>
+              <w:left w:type="dxa" w:w="100"/>
+              <w:bottom w:type="dxa" w:w="60"/>
+              <w:right w:type="dxa" w:w="100"/>
+            </w:tcMar>
+          </w:tcPr>
+          <w:p>
+            <w:r>
+              <w:rPr>
+                <w:sz w:val="18"/>
+                <w:szCs w:val="18"/>
+              </w:rPr>
+              <w:t xml:space="preserve">66%</w:t>
+            </w:r>
+          </w:p>
+        </w:tc>
+        <w:tc>
+          <w:tcPr>
+            <w:tcW w:type="dxa" w:w="1500"/>
+            <w:tcBorders>
+              <w:top w:val="single" w:color="B0B0B0" w:sz="1"/>
+              <w:left w:val="single" w:color="B0B0B0" w:sz="1"/>
+              <w:bottom w:val="single" w:color="B0B0B0" w:sz="1"/>
+              <w:right w:val="single" w:color="B0B0B0" w:sz="1"/>
+            </w:tcBorders>
+            <w:shd w:fill="EAF1F8" w:val="clear"/>
+            <w:tcMar>
+              <w:top w:type="dxa" w:w="60"/>
+              <w:left w:type="dxa" w:w="100"/>
+              <w:bottom w:type="dxa" w:w="60"/>
+              <w:right w:type="dxa" w:w="100"/>
+            </w:tcMar>
+          </w:tcPr>
+          <w:p>
+            <w:r>
+              <w:rPr>
+                <w:sz w:val="18"/>
+                <w:szCs w:val="18"/>
+              </w:rPr>
+              <w:t xml:space="preserve">+59%</w:t>
+            </w:r>
+          </w:p>
+        </w:tc>
+      </w:tr>
+      <w:tr>
+        <w:tc>
+          <w:tcPr>
+            <w:tcW w:type="dxa" w:w="2360"/>
+            <w:tcBorders>
+              <w:top w:val="single" w:color="B0B0B0" w:sz="1"/>
+              <w:left w:val="single" w:color="B0B0B0" w:sz="1"/>
+              <w:bottom w:val="single" w:color="B0B0B0" w:sz="1"/>
+              <w:right w:val="single" w:color="B0B0B0" w:sz="1"/>
+            </w:tcBorders>
+            <w:tcMar>
+              <w:top w:type="dxa" w:w="60"/>
+              <w:left w:type="dxa" w:w="100"/>
+              <w:bottom w:type="dxa" w:w="60"/>
+              <w:right w:type="dxa" w:w="100"/>
+            </w:tcMar>
+          </w:tcPr>
+          <w:p>
+            <w:r>
+              <w:rPr>
+                <w:sz w:val="18"/>
+                <w:szCs w:val="18"/>
+              </w:rPr>
+              <w:t xml:space="preserve">Observed</w:t>
+            </w:r>
+          </w:p>
+        </w:tc>
+        <w:tc>
+          <w:tcPr>
+            <w:tcW w:type="dxa" w:w="1300"/>
+            <w:tcBorders>
+              <w:top w:val="single" w:color="B0B0B0" w:sz="1"/>
+              <w:left w:val="single" w:color="B0B0B0" w:sz="1"/>
+              <w:bottom w:val="single" w:color="B0B0B0" w:sz="1"/>
+              <w:right w:val="single" w:color="B0B0B0" w:sz="1"/>
+            </w:tcBorders>
+            <w:tcMar>
+              <w:top w:type="dxa" w:w="60"/>
+              <w:left w:type="dxa" w:w="100"/>
+              <w:bottom w:type="dxa" w:w="60"/>
+              <w:right w:type="dxa" w:w="100"/>
+            </w:tcMar>
+          </w:tcPr>
+          <w:p>
+            <w:r>
+              <w:rPr>
+                <w:sz w:val="18"/>
+                <w:szCs w:val="18"/>
+              </w:rPr>
+              <w:t xml:space="preserve">~1.6%</w:t>
+            </w:r>
+          </w:p>
+        </w:tc>
+        <w:tc>
+          <w:tcPr>
+            <w:tcW w:type="dxa" w:w="1400"/>
+            <w:tcBorders>
+              <w:top w:val="single" w:color="B0B0B0" w:sz="1"/>
+              <w:left w:val="single" w:color="B0B0B0" w:sz="1"/>
+              <w:bottom w:val="single" w:color="B0B0B0" w:sz="1"/>
+              <w:right w:val="single" w:color="B0B0B0" w:sz="1"/>
+            </w:tcBorders>
+            <w:tcMar>
+              <w:top w:type="dxa" w:w="60"/>
+              <w:left w:type="dxa" w:w="100"/>
+              <w:bottom w:type="dxa" w:w="60"/>
+              <w:right w:type="dxa" w:w="100"/>
+            </w:tcMar>
+          </w:tcPr>
+          <w:p>
+            <w:r>
+              <w:rPr>
+                <w:sz w:val="18"/>
+                <w:szCs w:val="18"/>
+              </w:rPr>
+              <w:t xml:space="preserve">~0.5%</w:t>
+            </w:r>
+          </w:p>
+        </w:tc>
+        <w:tc>
+          <w:tcPr>
+            <w:tcW w:type="dxa" w:w="1400"/>
+            <w:tcBorders>
+              <w:top w:val="single" w:color="B0B0B0" w:sz="1"/>
+              <w:left w:val="single" w:color="B0B0B0" w:sz="1"/>
+              <w:bottom w:val="single" w:color="B0B0B0" w:sz="1"/>
+              <w:right w:val="single" w:color="B0B0B0" w:sz="1"/>
+            </w:tcBorders>
+            <w:tcMar>
+              <w:top w:type="dxa" w:w="60"/>
+              <w:left w:type="dxa" w:w="100"/>
+              <w:bottom w:type="dxa" w:w="60"/>
+              <w:right w:type="dxa" w:w="100"/>
+            </w:tcMar>
+          </w:tcPr>
+          <w:p>
+            <w:r>
+              <w:rPr>
+                <w:sz w:val="18"/>
+                <w:szCs w:val="18"/>
+              </w:rPr>
+              <w:t xml:space="preserve">high</w:t>
+            </w:r>
+          </w:p>
+        </w:tc>
+        <w:tc>
+          <w:tcPr>
+            <w:tcW w:type="dxa" w:w="1400"/>
+            <w:tcBorders>
+              <w:top w:val="single" w:color="B0B0B0" w:sz="1"/>
+              <w:left w:val="single" w:color="B0B0B0" w:sz="1"/>
+              <w:bottom w:val="single" w:color="B0B0B0" w:sz="1"/>
+              <w:right w:val="single" w:color="B0B0B0" w:sz="1"/>
+            </w:tcBorders>
+            <w:tcMar>
+              <w:top w:type="dxa" w:w="60"/>
+              <w:left w:type="dxa" w:w="100"/>
+              <w:bottom w:type="dxa" w:w="60"/>
+              <w:right w:type="dxa" w:w="100"/>
+            </w:tcMar>
+          </w:tcPr>
+          <w:p>
+            <w:r>
+              <w:rPr>
+                <w:sz w:val="18"/>
+                <w:szCs w:val="18"/>
+              </w:rPr>
+              <w:t xml:space="preserve">high</w:t>
+            </w:r>
+          </w:p>
+        </w:tc>
+        <w:tc>
+          <w:tcPr>
+            <w:tcW w:type="dxa" w:w="1500"/>
+            <w:tcBorders>
+              <w:top w:val="single" w:color="B0B0B0" w:sz="1"/>
+              <w:left w:val="single" w:color="B0B0B0" w:sz="1"/>
+              <w:bottom w:val="single" w:color="B0B0B0" w:sz="1"/>
+              <w:right w:val="single" w:color="B0B0B0" w:sz="1"/>
+            </w:tcBorders>
+            <w:tcMar>
+              <w:top w:type="dxa" w:w="60"/>
+              <w:left w:type="dxa" w:w="100"/>
+              <w:bottom w:type="dxa" w:w="60"/>
+              <w:right w:type="dxa" w:w="100"/>
+            </w:tcMar>
+          </w:tcPr>
+          <w:p>
+            <w:r>
+              <w:rPr>
+                <w:sz w:val="18"/>
+                <w:szCs w:val="18"/>
+              </w:rPr>
+              <w:t xml:space="preserve">--</w:t>
+            </w:r>
+          </w:p>
+        </w:tc>
+      </w:tr>
+    </w:tbl>
+    <w:p>
+      <w:pPr>
+        <w:spacing w:after="80" w:before="80"/>
+        <w:jc w:val="center"/>
+      </w:pPr>
+      <w:r>
+        <w:drawing>
+          <wp:inline distT="0" distB="0" distL="0" distR="0">
+            <wp:extent cx="4476750" cy="1752600"/>
+            <wp:effectExtent t="0" r="0" b="0" l="0"/>
+            <wp:docPr id="1" name="fig_survival_solution.png" descr="fig_survival_solution.png" title="fig_survival_solution.png"/>
+            <wp:cNvGraphicFramePr>
+              <a:graphicFrameLocks xmlns:a="http://schemas.openxmlformats.org/drawingml/2006/main" noChangeAspect="1"/>
+            </wp:cNvGraphicFramePr>
+            <a:graphic xmlns:a="http://schemas.openxmlformats.org/drawingml/2006/main">
+              <a:graphicData uri="http://schemas.openxmlformats.org/drawingml/2006/picture">
+                <pic:pic xmlns:pic="http://schemas.openxmlformats.org/drawingml/2006/picture">
+                  <pic:nvPicPr>
+                    <pic:cNvPr id="0" name="" descr=""/>
+                    <pic:cNvPicPr>
+                      <a:picLocks noChangeAspect="1" noChangeArrowheads="1"/>
+                    </pic:cNvPicPr>
+                  </pic:nvPicPr>
+                  <pic:blipFill>
+                    <a:blip r:embed="rId11" cstate="none"/>
+                    <a:srcRect/>
+                    <a:stretch>
+                      <a:fillRect/>
+                    </a:stretch>
+                  </pic:blipFill>
+                  <pic:spPr bwMode="auto">
+                    <a:xfrm>
+                      <a:off x="0" y="0"/>
+                      <a:ext cx="4476750" cy="1752600"/>
+                    </a:xfrm>
+                    <a:prstGeom prst="rect">
+                      <a:avLst/>
+                    </a:prstGeom>
+                  </pic:spPr>
+                </pic:pic>
+              </a:graphicData>
+            </a:graphic>
+          </wp:inline>
+        </w:drawing>
+      </w:r>
+    </w:p>
+    <w:p>
+      <w:pPr>
+        <w:spacing w:after="160"/>
+        <w:jc w:val="center"/>
+      </w:pPr>
+      <w:r>
+        <w:rPr>
+          <w:i/>
+          <w:iCs/>
+          <w:color w:val="555555"/>
+          <w:sz w:val="16"/>
+          <w:szCs w:val="16"/>
+        </w:rPr>
+        <w:t xml:space="preserve">Figure 4. Survival options. Left: 40-year cohort retention versus a realistic band; only the calibrated rate is sensible for both origins. Right: typical-tree annual mortality versus observed (dotted).</w:t>
+      </w:r>
+    </w:p>
+    <w:p>
+      <w:pPr>
+        <w:spacing w:after="120"/>
+      </w:pPr>
+      <w:r>
+        <w:t xml:space="preserve">The calibrated rate is the only option that reproduces both the observed annual mortality and realistic cohort retention for plantations and natural stands. The residual CFI density over-prediction reflects the missing ingrowth submodel in young building stands, not the survival rate. Refit the four constants as Kahikinui, KMR, and Kualoa remeasurement data accumulate.</w:t>
+      </w:r>
+    </w:p>
+    <w:p>
+      <w:pPr>
+        <w:pStyle w:val="Heading1"/>
+      </w:pPr>
+      <w:r>
+        <w:t xml:space="preserve">12. Open code issues</w:t>
       </w:r>
     </w:p>
     <w:p>
@@ -4698,7 +5800,7 @@
         <w:pStyle w:val="Heading1"/>
       </w:pPr>
       <w:r>
-        <w:t xml:space="preserve">12. Recommendations</w:t>
+        <w:t xml:space="preserve">13. Recommendations</w:t>
       </w:r>
     </w:p>
     <w:p>
@@ -4710,7 +5812,7 @@
         </w:numPr>
       </w:pPr>
       <w:r>
-        <w:t xml:space="preserve">Do not ship the raw survival cloglog unguarded. Ship the stabilizer (clamp plus floor) as an interim, or refit survival for individual-tree use.</w:t>
+        <w:t xml:space="preserve">Replace the published survival cloglog with the calibrated rate (koa_survival_calibrated.R). Do not ship the raw cloglog; a free refit is not better.</w:t>
       </w:r>
     </w:p>
     <w:p>

</xml_diff>

<commit_message>
Tune calibrated survival on data; validate 150-yr long-term behavior
- tune_survival.R: exposure-based diagnostics. Mortality lowest in small trees;
  apparent BYI effect is one high-BYI natural cluster (no plantations) -> drop
  BYI as a direct mortality driver. Origin + density are the robust signals.
- Tuned model: base(origin) + self-thinning ramp on SDI/SDImax; BYI acts via
  growth. 150-yr cohorts: SDI peaks ~83% SDImax then tracks self-thinning line,
  QMD -> ~90cm natural / 60cm plantation cap, no collapse/runaway.
- Updated koa_survival_calibrated.R drop-in, report docx, long-term figure.
</commit_message>
<xml_diff>
--- a/fvsOL/inst/extdata/koa_stress_test/20260605_koa_FVS-HI_stress-test-report.docx
+++ b/fvsOL/inst/extdata/koa_stress_test/20260605_koa_FVS-HI_stress-test-report.docx
@@ -4646,7 +4646,15 @@
         <w:spacing w:after="120"/>
       </w:pPr>
       <w:r>
-        <w:t xml:space="preserve">The published survival model is not a usable per-tree solution. We explored three routes. Refitting the same cloglog or new forms on the current data overfits: with only 280 deaths and crown ratio, size, site, and origin strongly collinear, the coefficients are extreme (intercept 44, planted -24, BYI/1000 -87) and behave backwards out of sample, predicting near-total plantation mortality when origin is changed at fixed size. Minimal monotonic GLMs are stable in their coefficients but predict absurd annual rates (about 34% per year natural). The survival signal in this dataset cannot support a free per-tree GLM.</w:t>
+        <w:t xml:space="preserve">The published survival model is not a usable per-tree solution, and a free refit does not fix it. With only 280 deaths and crown ratio, size, site, and origin strongly collinear, fitted GLMs overfit: coefficients are extreme (intercept 44, planted -24, BYI/1000 -87) and behave backwards out of sample, predicting near-total plantation mortality when origin is flipped at fixed size; minimal stable-coefficient GLMs instead predict absurd rates (about 34% per year). The survival signal cannot support a free per-tree GLM.</w:t>
+      </w:r>
+    </w:p>
+    <w:p>
+      <w:pPr>
+        <w:pStyle w:val="Heading2"/>
+      </w:pPr>
+      <w:r>
+        <w:t xml:space="preserve">11.1 What the data actually show</w:t>
       </w:r>
     </w:p>
     <w:p>
@@ -4654,7 +4662,93 @@
         <w:spacing w:after="120"/>
       </w:pPr>
       <w:r>
-        <w:t xml:space="preserve">The recommended solution is a calibrated mortality rate anchored to the observed annual mortality by origin (natural 1.5%, plantation 0.5%), modulated by relative density (self-thinning onset near 55% of the basal area envelope) and tree size. It is transparent, monotonic, origin-correct, and stable. Drop-in code is koa_survival_calibrated.R.</w:t>
+        <w:t xml:space="preserve">Exposure-based (deaths per tree-year) diagnostics on the 6,489-record survival dataset reframe the problem:</w:t>
+      </w:r>
+    </w:p>
+    <w:p>
+      <w:pPr>
+        <w:pStyle w:val="ListParagraph"/>
+        <w:numPr>
+          <w:ilvl w:val="0"/>
+          <w:numId w:val="2"/>
+        </w:numPr>
+        <w:spacing w:after="80"/>
+      </w:pPr>
+      <w:r>
+        <w:t xml:space="preserve">Mortality is lowest in small trees (0 to 5 cm: 0.04%/yr; 5 to 10 cm: 0.56%/yr) and peaks in the 10 to 20 cm class (2.77%/yr). A small-tree mortality term is therefore wrong for koa.</w:t>
+      </w:r>
+    </w:p>
+    <w:p>
+      <w:pPr>
+        <w:pStyle w:val="ListParagraph"/>
+        <w:numPr>
+          <w:ilvl w:val="0"/>
+          <w:numId w:val="2"/>
+        </w:numPr>
+        <w:spacing w:after="80"/>
+      </w:pPr>
+      <w:r>
+        <w:t xml:space="preserve">The apparent BYI effect is an artifact of one cluster: the top BYI tercile (above 408) shows 3.3%/yr versus about 0.15%/yr in the lower two, and that cluster is entirely natural stands. Plantations do not span high BYI, so a BYI mortality effect cannot be estimated for plantations at all. Forcing BYI into a GLM produces unstable 890-fold rate ratios.</w:t>
+      </w:r>
+    </w:p>
+    <w:p>
+      <w:pPr>
+        <w:pStyle w:val="ListParagraph"/>
+        <w:numPr>
+          <w:ilvl w:val="0"/>
+          <w:numId w:val="2"/>
+        </w:numPr>
+        <w:spacing w:after="80"/>
+      </w:pPr>
+      <w:r>
+        <w:t xml:space="preserve">The robust, real signals are origin (plantations about 0.5%/yr versus natural) and density (mortality rises through the 0.55 to 0.8 relative-density self-thinning zone).</w:t>
+      </w:r>
+    </w:p>
+    <w:p>
+      <w:pPr>
+        <w:pStyle w:val="Heading2"/>
+      </w:pPr>
+      <w:r>
+        <w:t xml:space="preserve">11.2 Recommended model</w:t>
+      </w:r>
+    </w:p>
+    <w:p>
+      <w:pPr>
+        <w:spacing w:after="120"/>
+      </w:pPr>
+      <w:r>
+        <w:t xml:space="preserve">Annual mortality is a low density-independent background that differs by origin, plus a density-dependent self-thinning term that ramps as relative density (SDI/SDImax) passes the self-thinning onset. BYI is deliberately not a direct mortality driver; it influences long-term density correctly through growth, by driving stands into self-thinning sooner. Drop-in code is koa_survival_calibrated.R; four interpretable constants to refine as data accrue.</w:t>
+      </w:r>
+    </w:p>
+    <w:p>
+      <w:pPr>
+        <w:spacing w:after="120"/>
+      </w:pPr>
+      <w:r>
+        <w:rPr>
+          <w:i/>
+          <w:iCs/>
+        </w:rPr>
+        <w:t xml:space="preserve">mortality = base(origin) + ramp × max(0, SDI/SDImax − 0.55)^2,</w:t>
+      </w:r>
+      <w:r>
+        <w:t xml:space="preserve">  with base 0.005/yr natural, 0.003/yr plantation, ramp 0.55, capped at 0.15/yr.</w:t>
+      </w:r>
+    </w:p>
+    <w:p>
+      <w:pPr>
+        <w:pStyle w:val="Heading2"/>
+      </w:pPr>
+      <w:r>
+        <w:t xml:space="preserve">11.3 Long-term behavior (150-year projections)</w:t>
+      </w:r>
+    </w:p>
+    <w:p>
+      <w:pPr>
+        <w:spacing w:after="120"/>
+      </w:pPr>
+      <w:r>
+        <w:t xml:space="preserve">Cohort QMD (cm) / trees per hectare / percent of SDImax at decade marks, tuned model:</w:t>
       </w:r>
     </w:p>
     <w:tbl>
@@ -4671,11 +4765,11 @@
       </w:tblPr>
       <w:tblGrid>
         <w:gridCol w:w="2360"/>
-        <w:gridCol w:w="1300"/>
         <w:gridCol w:w="1400"/>
         <w:gridCol w:w="1400"/>
         <w:gridCol w:w="1400"/>
-        <w:gridCol w:w="1500"/>
+        <w:gridCol w:w="1400"/>
+        <w:gridCol w:w="1400"/>
       </w:tblGrid>
       <w:tr>
         <w:trPr>
@@ -4707,13 +4801,13 @@
                 <w:sz w:val="18"/>
                 <w:szCs w:val="18"/>
               </w:rPr>
-              <w:t xml:space="preserve">Survival option</w:t>
-            </w:r>
-          </w:p>
-        </w:tc>
-        <w:tc>
-          <w:tcPr>
-            <w:tcW w:type="dxa" w:w="1300"/>
+              <w:t xml:space="preserve">Origin / BYI</w:t>
+            </w:r>
+          </w:p>
+        </w:tc>
+        <w:tc>
+          <w:tcPr>
+            <w:tcW w:type="dxa" w:w="1400"/>
             <w:tcBorders>
               <w:top w:val="single" w:color="B0B0B0" w:sz="1"/>
               <w:left w:val="single" w:color="B0B0B0" w:sz="1"/>
@@ -4737,7 +4831,7 @@
                 <w:sz w:val="18"/>
                 <w:szCs w:val="18"/>
               </w:rPr>
-              <w:t xml:space="preserve">Natural mort/yr</w:t>
+              <w:t xml:space="preserve">Age 20</w:t>
             </w:r>
           </w:p>
         </w:tc>
@@ -4767,7 +4861,7 @@
                 <w:sz w:val="18"/>
                 <w:szCs w:val="18"/>
               </w:rPr>
-              <w:t xml:space="preserve">Plantation mort/yr</w:t>
+              <w:t xml:space="preserve">Age 40</w:t>
             </w:r>
           </w:p>
         </w:tc>
@@ -4797,7 +4891,7 @@
                 <w:sz w:val="18"/>
                 <w:szCs w:val="18"/>
               </w:rPr>
-              <w:t xml:space="preserve">40-yr retain nat</w:t>
+              <w:t xml:space="preserve">Age 60</w:t>
             </w:r>
           </w:p>
         </w:tc>
@@ -4827,13 +4921,13 @@
                 <w:sz w:val="18"/>
                 <w:szCs w:val="18"/>
               </w:rPr>
-              <w:t xml:space="preserve">40-yr retain plt</w:t>
-            </w:r>
-          </w:p>
-        </w:tc>
-        <w:tc>
-          <w:tcPr>
-            <w:tcW w:type="dxa" w:w="1500"/>
+              <w:t xml:space="preserve">Age 100</w:t>
+            </w:r>
+          </w:p>
+        </w:tc>
+        <w:tc>
+          <w:tcPr>
+            <w:tcW w:type="dxa" w:w="1400"/>
             <w:tcBorders>
               <w:top w:val="single" w:color="B0B0B0" w:sz="1"/>
               <w:left w:val="single" w:color="B0B0B0" w:sz="1"/>
@@ -4857,7 +4951,7 @@
                 <w:sz w:val="18"/>
                 <w:szCs w:val="18"/>
               </w:rPr>
-              <w:t xml:space="preserve">CFI density bias</w:t>
+              <w:t xml:space="preserve">Age 150</w:t>
             </w:r>
           </w:p>
         </w:tc>
@@ -4885,33 +4979,7 @@
                 <w:sz w:val="18"/>
                 <w:szCs w:val="18"/>
               </w:rPr>
-              <w:t xml:space="preserve">S1 raw (current/shipped)</w:t>
-            </w:r>
-          </w:p>
-        </w:tc>
-        <w:tc>
-          <w:tcPr>
-            <w:tcW w:type="dxa" w:w="1300"/>
-            <w:tcBorders>
-              <w:top w:val="single" w:color="B0B0B0" w:sz="1"/>
-              <w:left w:val="single" w:color="B0B0B0" w:sz="1"/>
-              <w:bottom w:val="single" w:color="B0B0B0" w:sz="1"/>
-              <w:right w:val="single" w:color="B0B0B0" w:sz="1"/>
-            </w:tcBorders>
-            <w:tcMar>
-              <w:top w:type="dxa" w:w="60"/>
-              <w:left w:type="dxa" w:w="100"/>
-              <w:bottom w:type="dxa" w:w="60"/>
-              <w:right w:type="dxa" w:w="100"/>
-            </w:tcMar>
-          </w:tcPr>
-          <w:p>
-            <w:r>
-              <w:rPr>
-                <w:sz w:val="18"/>
-                <w:szCs w:val="18"/>
-              </w:rPr>
-              <w:t xml:space="preserve">~100%</w:t>
+              <w:t xml:space="preserve">Natural BYI 100</w:t>
             </w:r>
           </w:p>
         </w:tc>
@@ -4937,7 +5005,7 @@
                 <w:sz w:val="18"/>
                 <w:szCs w:val="18"/>
               </w:rPr>
-              <w:t xml:space="preserve">~100%</w:t>
+              <w:t xml:space="preserve">24/415/77</w:t>
             </w:r>
           </w:p>
         </w:tc>
@@ -4963,7 +5031,7 @@
                 <w:sz w:val="18"/>
                 <w:szCs w:val="18"/>
               </w:rPr>
-              <w:t xml:space="preserve">0%</w:t>
+              <w:t xml:space="preserve">35/220/74</w:t>
             </w:r>
           </w:p>
         </w:tc>
@@ -4989,33 +5057,59 @@
                 <w:sz w:val="18"/>
                 <w:szCs w:val="18"/>
               </w:rPr>
-              <w:t xml:space="preserve">0%</w:t>
-            </w:r>
-          </w:p>
-        </w:tc>
-        <w:tc>
-          <w:tcPr>
-            <w:tcW w:type="dxa" w:w="1500"/>
-            <w:tcBorders>
-              <w:top w:val="single" w:color="B0B0B0" w:sz="1"/>
-              <w:left w:val="single" w:color="B0B0B0" w:sz="1"/>
-              <w:bottom w:val="single" w:color="B0B0B0" w:sz="1"/>
-              <w:right w:val="single" w:color="B0B0B0" w:sz="1"/>
-            </w:tcBorders>
-            <w:tcMar>
-              <w:top w:type="dxa" w:w="60"/>
-              <w:left w:type="dxa" w:w="100"/>
-              <w:bottom w:type="dxa" w:w="60"/>
-              <w:right w:type="dxa" w:w="100"/>
-            </w:tcMar>
-          </w:tcPr>
-          <w:p>
-            <w:r>
-              <w:rPr>
-                <w:sz w:val="18"/>
-                <w:szCs w:val="18"/>
-              </w:rPr>
-              <w:t xml:space="preserve">-99.9%</w:t>
+              <w:t xml:space="preserve">44/143/70</w:t>
+            </w:r>
+          </w:p>
+        </w:tc>
+        <w:tc>
+          <w:tcPr>
+            <w:tcW w:type="dxa" w:w="1400"/>
+            <w:tcBorders>
+              <w:top w:val="single" w:color="B0B0B0" w:sz="1"/>
+              <w:left w:val="single" w:color="B0B0B0" w:sz="1"/>
+              <w:bottom w:val="single" w:color="B0B0B0" w:sz="1"/>
+              <w:right w:val="single" w:color="B0B0B0" w:sz="1"/>
+            </w:tcBorders>
+            <w:tcMar>
+              <w:top w:type="dxa" w:w="60"/>
+              <w:left w:type="dxa" w:w="100"/>
+              <w:bottom w:type="dxa" w:w="60"/>
+              <w:right w:type="dxa" w:w="100"/>
+            </w:tcMar>
+          </w:tcPr>
+          <w:p>
+            <w:r>
+              <w:rPr>
+                <w:sz w:val="18"/>
+                <w:szCs w:val="18"/>
+              </w:rPr>
+              <w:t xml:space="preserve">58/84/65</w:t>
+            </w:r>
+          </w:p>
+        </w:tc>
+        <w:tc>
+          <w:tcPr>
+            <w:tcW w:type="dxa" w:w="1400"/>
+            <w:tcBorders>
+              <w:top w:val="single" w:color="B0B0B0" w:sz="1"/>
+              <w:left w:val="single" w:color="B0B0B0" w:sz="1"/>
+              <w:bottom w:val="single" w:color="B0B0B0" w:sz="1"/>
+              <w:right w:val="single" w:color="B0B0B0" w:sz="1"/>
+            </w:tcBorders>
+            <w:tcMar>
+              <w:top w:type="dxa" w:w="60"/>
+              <w:left w:type="dxa" w:w="100"/>
+              <w:bottom w:type="dxa" w:w="60"/>
+              <w:right w:type="dxa" w:w="100"/>
+            </w:tcMar>
+          </w:tcPr>
+          <w:p>
+            <w:r>
+              <w:rPr>
+                <w:sz w:val="18"/>
+                <w:szCs w:val="18"/>
+              </w:rPr>
+              <w:t xml:space="preserve">72/55/60</w:t>
             </w:r>
           </w:p>
         </w:tc>
@@ -5044,13 +5138,13 @@
                 <w:sz w:val="18"/>
                 <w:szCs w:val="18"/>
               </w:rPr>
-              <w:t xml:space="preserve">S1 stabilized (clamp+floor)</w:t>
-            </w:r>
-          </w:p>
-        </w:tc>
-        <w:tc>
-          <w:tcPr>
-            <w:tcW w:type="dxa" w:w="1300"/>
+              <w:t xml:space="preserve">Natural BYI 264</w:t>
+            </w:r>
+          </w:p>
+        </w:tc>
+        <w:tc>
+          <w:tcPr>
+            <w:tcW w:type="dxa" w:w="1400"/>
             <w:tcBorders>
               <w:top w:val="single" w:color="B0B0B0" w:sz="1"/>
               <w:left w:val="single" w:color="B0B0B0" w:sz="1"/>
@@ -5071,7 +5165,7 @@
                 <w:sz w:val="18"/>
                 <w:szCs w:val="18"/>
               </w:rPr>
-              <w:t xml:space="preserve">10%</w:t>
+              <w:t xml:space="preserve">29/323/82</w:t>
             </w:r>
           </w:p>
         </w:tc>
@@ -5098,7 +5192,7 @@
                 <w:sz w:val="18"/>
                 <w:szCs w:val="18"/>
               </w:rPr>
-              <w:t xml:space="preserve">10%</w:t>
+              <w:t xml:space="preserve">43/156/75</w:t>
             </w:r>
           </w:p>
         </w:tc>
@@ -5125,7 +5219,7 @@
                 <w:sz w:val="18"/>
                 <w:szCs w:val="18"/>
               </w:rPr>
-              <w:t xml:space="preserve">3%</w:t>
+              <w:t xml:space="preserve">54/101/70</w:t>
             </w:r>
           </w:p>
         </w:tc>
@@ -5152,13 +5246,13 @@
                 <w:sz w:val="18"/>
                 <w:szCs w:val="18"/>
               </w:rPr>
-              <w:t xml:space="preserve">2%</w:t>
-            </w:r>
-          </w:p>
-        </w:tc>
-        <w:tc>
-          <w:tcPr>
-            <w:tcW w:type="dxa" w:w="1500"/>
+              <w:t xml:space="preserve">71/60/64</w:t>
+            </w:r>
+          </w:p>
+        </w:tc>
+        <w:tc>
+          <w:tcPr>
+            <w:tcW w:type="dxa" w:w="1400"/>
             <w:tcBorders>
               <w:top w:val="single" w:color="B0B0B0" w:sz="1"/>
               <w:left w:val="single" w:color="B0B0B0" w:sz="1"/>
@@ -5179,7 +5273,7 @@
                 <w:sz w:val="18"/>
                 <w:szCs w:val="18"/>
               </w:rPr>
-              <w:t xml:space="preserve">-9.3%</w:t>
+              <w:t xml:space="preserve">87/41/60</w:t>
             </w:r>
           </w:p>
         </w:tc>
@@ -5207,33 +5301,7 @@
                 <w:sz w:val="18"/>
                 <w:szCs w:val="18"/>
               </w:rPr>
-              <w:t xml:space="preserve">Free refit (logit/cloglog)</w:t>
-            </w:r>
-          </w:p>
-        </w:tc>
-        <w:tc>
-          <w:tcPr>
-            <w:tcW w:type="dxa" w:w="1300"/>
-            <w:tcBorders>
-              <w:top w:val="single" w:color="B0B0B0" w:sz="1"/>
-              <w:left w:val="single" w:color="B0B0B0" w:sz="1"/>
-              <w:bottom w:val="single" w:color="B0B0B0" w:sz="1"/>
-              <w:right w:val="single" w:color="B0B0B0" w:sz="1"/>
-            </w:tcBorders>
-            <w:tcMar>
-              <w:top w:type="dxa" w:w="60"/>
-              <w:left w:type="dxa" w:w="100"/>
-              <w:bottom w:type="dxa" w:w="60"/>
-              <w:right w:type="dxa" w:w="100"/>
-            </w:tcMar>
-          </w:tcPr>
-          <w:p>
-            <w:r>
-              <w:rPr>
-                <w:sz w:val="18"/>
-                <w:szCs w:val="18"/>
-              </w:rPr>
-              <w:t xml:space="preserve">0%</w:t>
+              <w:t xml:space="preserve">Natural BYI 450</w:t>
             </w:r>
           </w:p>
         </w:tc>
@@ -5259,7 +5327,7 @@
                 <w:sz w:val="18"/>
                 <w:szCs w:val="18"/>
               </w:rPr>
-              <w:t xml:space="preserve">99%</w:t>
+              <w:t xml:space="preserve">33/272/84</w:t>
             </w:r>
           </w:p>
         </w:tc>
@@ -5285,7 +5353,7 @@
                 <w:sz w:val="18"/>
                 <w:szCs w:val="18"/>
               </w:rPr>
-              <w:t xml:space="preserve">100%</w:t>
+              <w:t xml:space="preserve">48/129/75</w:t>
             </w:r>
           </w:p>
         </w:tc>
@@ -5311,33 +5379,59 @@
                 <w:sz w:val="18"/>
                 <w:szCs w:val="18"/>
               </w:rPr>
-              <w:t xml:space="preserve">0%</w:t>
-            </w:r>
-          </w:p>
-        </w:tc>
-        <w:tc>
-          <w:tcPr>
-            <w:tcW w:type="dxa" w:w="1500"/>
-            <w:tcBorders>
-              <w:top w:val="single" w:color="B0B0B0" w:sz="1"/>
-              <w:left w:val="single" w:color="B0B0B0" w:sz="1"/>
-              <w:bottom w:val="single" w:color="B0B0B0" w:sz="1"/>
-              <w:right w:val="single" w:color="B0B0B0" w:sz="1"/>
-            </w:tcBorders>
-            <w:tcMar>
-              <w:top w:type="dxa" w:w="60"/>
-              <w:left w:type="dxa" w:w="100"/>
-              <w:bottom w:type="dxa" w:w="60"/>
-              <w:right w:type="dxa" w:w="100"/>
-            </w:tcMar>
-          </w:tcPr>
-          <w:p>
-            <w:r>
-              <w:rPr>
-                <w:sz w:val="18"/>
-                <w:szCs w:val="18"/>
-              </w:rPr>
-              <w:t xml:space="preserve">+84%</w:t>
+              <w:t xml:space="preserve">61/84/70</w:t>
+            </w:r>
+          </w:p>
+        </w:tc>
+        <w:tc>
+          <w:tcPr>
+            <w:tcW w:type="dxa" w:w="1400"/>
+            <w:tcBorders>
+              <w:top w:val="single" w:color="B0B0B0" w:sz="1"/>
+              <w:left w:val="single" w:color="B0B0B0" w:sz="1"/>
+              <w:bottom w:val="single" w:color="B0B0B0" w:sz="1"/>
+              <w:right w:val="single" w:color="B0B0B0" w:sz="1"/>
+            </w:tcBorders>
+            <w:tcMar>
+              <w:top w:type="dxa" w:w="60"/>
+              <w:left w:type="dxa" w:w="100"/>
+              <w:bottom w:type="dxa" w:w="60"/>
+              <w:right w:type="dxa" w:w="100"/>
+            </w:tcMar>
+          </w:tcPr>
+          <w:p>
+            <w:r>
+              <w:rPr>
+                <w:sz w:val="18"/>
+                <w:szCs w:val="18"/>
+              </w:rPr>
+              <w:t xml:space="preserve">79/51/64</w:t>
+            </w:r>
+          </w:p>
+        </w:tc>
+        <w:tc>
+          <w:tcPr>
+            <w:tcW w:type="dxa" w:w="1400"/>
+            <w:tcBorders>
+              <w:top w:val="single" w:color="B0B0B0" w:sz="1"/>
+              <w:left w:val="single" w:color="B0B0B0" w:sz="1"/>
+              <w:bottom w:val="single" w:color="B0B0B0" w:sz="1"/>
+              <w:right w:val="single" w:color="B0B0B0" w:sz="1"/>
+            </w:tcBorders>
+            <w:tcMar>
+              <w:top w:type="dxa" w:w="60"/>
+              <w:left w:type="dxa" w:w="100"/>
+              <w:bottom w:type="dxa" w:w="60"/>
+              <w:right w:type="dxa" w:w="100"/>
+            </w:tcMar>
+          </w:tcPr>
+          <w:p>
+            <w:r>
+              <w:rPr>
+                <w:sz w:val="18"/>
+                <w:szCs w:val="18"/>
+              </w:rPr>
+              <w:t xml:space="preserve">90/35/55</w:t>
             </w:r>
           </w:p>
         </w:tc>
@@ -5366,13 +5460,13 @@
                 <w:sz w:val="18"/>
                 <w:szCs w:val="18"/>
               </w:rPr>
-              <w:t xml:space="preserve">Calibrated (recommended)</w:t>
-            </w:r>
-          </w:p>
-        </w:tc>
-        <w:tc>
-          <w:tcPr>
-            <w:tcW w:type="dxa" w:w="1300"/>
+              <w:t xml:space="preserve">Plantation BYI 264</w:t>
+            </w:r>
+          </w:p>
+        </w:tc>
+        <w:tc>
+          <w:tcPr>
+            <w:tcW w:type="dxa" w:w="1400"/>
             <w:tcBorders>
               <w:top w:val="single" w:color="B0B0B0" w:sz="1"/>
               <w:left w:val="single" w:color="B0B0B0" w:sz="1"/>
@@ -5393,7 +5487,7 @@
                 <w:sz w:val="18"/>
                 <w:szCs w:val="18"/>
               </w:rPr>
-              <w:t xml:space="preserve">1.9%</w:t>
+              <w:t xml:space="preserve">32/297/90</w:t>
             </w:r>
           </w:p>
         </w:tc>
@@ -5420,7 +5514,7 @@
                 <w:sz w:val="18"/>
                 <w:szCs w:val="18"/>
               </w:rPr>
-              <w:t xml:space="preserve">0.6%</w:t>
+              <w:t xml:space="preserve">56/108/78</w:t>
             </w:r>
           </w:p>
         </w:tc>
@@ -5447,7 +5541,7 @@
                 <w:sz w:val="18"/>
                 <w:szCs w:val="18"/>
               </w:rPr>
-              <w:t xml:space="preserve">53%</w:t>
+              <w:t xml:space="preserve">60/77/62</w:t>
             </w:r>
           </w:p>
         </w:tc>
@@ -5474,13 +5568,13 @@
                 <w:sz w:val="18"/>
                 <w:szCs w:val="18"/>
               </w:rPr>
-              <w:t xml:space="preserve">66%</w:t>
-            </w:r>
-          </w:p>
-        </w:tc>
-        <w:tc>
-          <w:tcPr>
-            <w:tcW w:type="dxa" w:w="1500"/>
+              <w:t xml:space="preserve">60/66/54</w:t>
+            </w:r>
+          </w:p>
+        </w:tc>
+        <w:tc>
+          <w:tcPr>
+            <w:tcW w:type="dxa" w:w="1400"/>
             <w:tcBorders>
               <w:top w:val="single" w:color="B0B0B0" w:sz="1"/>
               <w:left w:val="single" w:color="B0B0B0" w:sz="1"/>
@@ -5501,165 +5595,7 @@
                 <w:sz w:val="18"/>
                 <w:szCs w:val="18"/>
               </w:rPr>
-              <w:t xml:space="preserve">+59%</w:t>
-            </w:r>
-          </w:p>
-        </w:tc>
-      </w:tr>
-      <w:tr>
-        <w:tc>
-          <w:tcPr>
-            <w:tcW w:type="dxa" w:w="2360"/>
-            <w:tcBorders>
-              <w:top w:val="single" w:color="B0B0B0" w:sz="1"/>
-              <w:left w:val="single" w:color="B0B0B0" w:sz="1"/>
-              <w:bottom w:val="single" w:color="B0B0B0" w:sz="1"/>
-              <w:right w:val="single" w:color="B0B0B0" w:sz="1"/>
-            </w:tcBorders>
-            <w:tcMar>
-              <w:top w:type="dxa" w:w="60"/>
-              <w:left w:type="dxa" w:w="100"/>
-              <w:bottom w:type="dxa" w:w="60"/>
-              <w:right w:type="dxa" w:w="100"/>
-            </w:tcMar>
-          </w:tcPr>
-          <w:p>
-            <w:r>
-              <w:rPr>
-                <w:sz w:val="18"/>
-                <w:szCs w:val="18"/>
-              </w:rPr>
-              <w:t xml:space="preserve">Observed</w:t>
-            </w:r>
-          </w:p>
-        </w:tc>
-        <w:tc>
-          <w:tcPr>
-            <w:tcW w:type="dxa" w:w="1300"/>
-            <w:tcBorders>
-              <w:top w:val="single" w:color="B0B0B0" w:sz="1"/>
-              <w:left w:val="single" w:color="B0B0B0" w:sz="1"/>
-              <w:bottom w:val="single" w:color="B0B0B0" w:sz="1"/>
-              <w:right w:val="single" w:color="B0B0B0" w:sz="1"/>
-            </w:tcBorders>
-            <w:tcMar>
-              <w:top w:type="dxa" w:w="60"/>
-              <w:left w:type="dxa" w:w="100"/>
-              <w:bottom w:type="dxa" w:w="60"/>
-              <w:right w:type="dxa" w:w="100"/>
-            </w:tcMar>
-          </w:tcPr>
-          <w:p>
-            <w:r>
-              <w:rPr>
-                <w:sz w:val="18"/>
-                <w:szCs w:val="18"/>
-              </w:rPr>
-              <w:t xml:space="preserve">~1.6%</w:t>
-            </w:r>
-          </w:p>
-        </w:tc>
-        <w:tc>
-          <w:tcPr>
-            <w:tcW w:type="dxa" w:w="1400"/>
-            <w:tcBorders>
-              <w:top w:val="single" w:color="B0B0B0" w:sz="1"/>
-              <w:left w:val="single" w:color="B0B0B0" w:sz="1"/>
-              <w:bottom w:val="single" w:color="B0B0B0" w:sz="1"/>
-              <w:right w:val="single" w:color="B0B0B0" w:sz="1"/>
-            </w:tcBorders>
-            <w:tcMar>
-              <w:top w:type="dxa" w:w="60"/>
-              <w:left w:type="dxa" w:w="100"/>
-              <w:bottom w:type="dxa" w:w="60"/>
-              <w:right w:type="dxa" w:w="100"/>
-            </w:tcMar>
-          </w:tcPr>
-          <w:p>
-            <w:r>
-              <w:rPr>
-                <w:sz w:val="18"/>
-                <w:szCs w:val="18"/>
-              </w:rPr>
-              <w:t xml:space="preserve">~0.5%</w:t>
-            </w:r>
-          </w:p>
-        </w:tc>
-        <w:tc>
-          <w:tcPr>
-            <w:tcW w:type="dxa" w:w="1400"/>
-            <w:tcBorders>
-              <w:top w:val="single" w:color="B0B0B0" w:sz="1"/>
-              <w:left w:val="single" w:color="B0B0B0" w:sz="1"/>
-              <w:bottom w:val="single" w:color="B0B0B0" w:sz="1"/>
-              <w:right w:val="single" w:color="B0B0B0" w:sz="1"/>
-            </w:tcBorders>
-            <w:tcMar>
-              <w:top w:type="dxa" w:w="60"/>
-              <w:left w:type="dxa" w:w="100"/>
-              <w:bottom w:type="dxa" w:w="60"/>
-              <w:right w:type="dxa" w:w="100"/>
-            </w:tcMar>
-          </w:tcPr>
-          <w:p>
-            <w:r>
-              <w:rPr>
-                <w:sz w:val="18"/>
-                <w:szCs w:val="18"/>
-              </w:rPr>
-              <w:t xml:space="preserve">high</w:t>
-            </w:r>
-          </w:p>
-        </w:tc>
-        <w:tc>
-          <w:tcPr>
-            <w:tcW w:type="dxa" w:w="1400"/>
-            <w:tcBorders>
-              <w:top w:val="single" w:color="B0B0B0" w:sz="1"/>
-              <w:left w:val="single" w:color="B0B0B0" w:sz="1"/>
-              <w:bottom w:val="single" w:color="B0B0B0" w:sz="1"/>
-              <w:right w:val="single" w:color="B0B0B0" w:sz="1"/>
-            </w:tcBorders>
-            <w:tcMar>
-              <w:top w:type="dxa" w:w="60"/>
-              <w:left w:type="dxa" w:w="100"/>
-              <w:bottom w:type="dxa" w:w="60"/>
-              <w:right w:type="dxa" w:w="100"/>
-            </w:tcMar>
-          </w:tcPr>
-          <w:p>
-            <w:r>
-              <w:rPr>
-                <w:sz w:val="18"/>
-                <w:szCs w:val="18"/>
-              </w:rPr>
-              <w:t xml:space="preserve">high</w:t>
-            </w:r>
-          </w:p>
-        </w:tc>
-        <w:tc>
-          <w:tcPr>
-            <w:tcW w:type="dxa" w:w="1500"/>
-            <w:tcBorders>
-              <w:top w:val="single" w:color="B0B0B0" w:sz="1"/>
-              <w:left w:val="single" w:color="B0B0B0" w:sz="1"/>
-              <w:bottom w:val="single" w:color="B0B0B0" w:sz="1"/>
-              <w:right w:val="single" w:color="B0B0B0" w:sz="1"/>
-            </w:tcBorders>
-            <w:tcMar>
-              <w:top w:type="dxa" w:w="60"/>
-              <w:left w:type="dxa" w:w="100"/>
-              <w:bottom w:type="dxa" w:w="60"/>
-              <w:right w:type="dxa" w:w="100"/>
-            </w:tcMar>
-          </w:tcPr>
-          <w:p>
-            <w:r>
-              <w:rPr>
-                <w:sz w:val="18"/>
-                <w:szCs w:val="18"/>
-              </w:rPr>
-              <w:t xml:space="preserve">--</w:t>
+              <w:t xml:space="preserve">60/57/46</w:t>
             </w:r>
           </w:p>
         </w:tc>
@@ -5673,9 +5609,9 @@
       <w:r>
         <w:drawing>
           <wp:inline distT="0" distB="0" distL="0" distR="0">
-            <wp:extent cx="4476750" cy="1752600"/>
+            <wp:extent cx="4572000" cy="1409700"/>
             <wp:effectExtent t="0" r="0" b="0" l="0"/>
-            <wp:docPr id="1" name="fig_survival_solution.png" descr="fig_survival_solution.png" title="fig_survival_solution.png"/>
+            <wp:docPr id="1" name="fig_longterm_calibrated.png" descr="fig_longterm_calibrated.png" title="fig_longterm_calibrated.png"/>
             <wp:cNvGraphicFramePr>
               <a:graphicFrameLocks xmlns:a="http://schemas.openxmlformats.org/drawingml/2006/main" noChangeAspect="1"/>
             </wp:cNvGraphicFramePr>
@@ -5698,7 +5634,7 @@
                   <pic:spPr bwMode="auto">
                     <a:xfrm>
                       <a:off x="0" y="0"/>
-                      <a:ext cx="4476750" cy="1752600"/>
+                      <a:ext cx="4572000" cy="1409700"/>
                     </a:xfrm>
                     <a:prstGeom prst="rect">
                       <a:avLst/>
@@ -5724,7 +5660,7 @@
           <w:sz w:val="16"/>
           <w:szCs w:val="16"/>
         </w:rPr>
-        <w:t xml:space="preserve">Figure 4. Survival options. Left: 40-year cohort retention versus a realistic band; only the calibrated rate is sensible for both origins. Right: typical-tree annual mortality versus observed (dotted).</w:t>
+        <w:t xml:space="preserve">Figure 4. 150-year behavior, tuned calibrated survival. Left: SDI rises to about 83% of SDImax then tracks the self-thinning line. Center: QMD approaches ~90 cm (natural) or the 60 cm cap (plantation). Right: stand trajectory in QMD by density space.</w:t>
       </w:r>
     </w:p>
     <w:p>
@@ -5732,7 +5668,7 @@
         <w:spacing w:after="120"/>
       </w:pPr>
       <w:r>
-        <w:t xml:space="preserve">The calibrated rate is the only option that reproduces both the observed annual mortality and realistic cohort retention for plantations and natural stands. The residual CFI density over-prediction reflects the missing ingrowth submodel in young building stands, not the survival rate. Refit the four constants as Kahikinui, KMR, and Kualoa remeasurement data accumulate.</w:t>
+        <w:t xml:space="preserve">SDI peaks near 83% of SDImax then declines along the self-thinning trajectory: no runaway, no collapse. Higher BYI reaches the self-thinning onset sooner (natural age 12 at BYI 100 versus age 7 at BYI 450) and grows larger, so BYI shapes density through growth rather than a confounded mortality term. Plantations self-thin earlier from denser starts and plateau at the 60 cm cap. This is the long-term behavior the model was missing.</w:t>
       </w:r>
     </w:p>
     <w:p>

</xml_diff>

<commit_message>
Final survival: linear self-thinning ramp 0.65-0.85 RD + PAI/MAI assessment
- koa_survival_calibrated.R/py: mortality = base(origin) + linear lift from 0.65
  to 0.85 RD (maxlift 0.15/yr), plateau above. 200-yr stress test: no runaway
  (peak 70-88% SDImax), no collapse, QMD monotonic for all origin x BYI.
- run_mai_pai.py: PAI/MAI for natural and planted from establishment. MAI peak
  rises with BYI (nat 4.3-8.2, plt 5.4-10.3 m3/ha/yr); culmination earlier on
  better sites and for plantations; PAI peaks before MAI culmination.
- Report updated with final ramp, 200-yr grid, and PAI/MAI section + figures.
</commit_message>
<xml_diff>
--- a/fvsOL/inst/extdata/koa_stress_test/20260605_koa_FVS-HI_stress-test-report.docx
+++ b/fvsOL/inst/extdata/koa_stress_test/20260605_koa_FVS-HI_stress-test-report.docx
@@ -4717,7 +4717,7 @@
         <w:spacing w:after="120"/>
       </w:pPr>
       <w:r>
-        <w:t xml:space="preserve">Annual mortality is a low density-independent background that differs by origin, plus a density-dependent self-thinning term that ramps as relative density (SDI/SDImax) passes the self-thinning onset. BYI is deliberately not a direct mortality driver; it influences long-term density correctly through growth, by driving stands into self-thinning sooner. Drop-in code is koa_survival_calibrated.R; four interpretable constants to refine as data accrue.</w:t>
+        <w:t xml:space="preserve">Annual mortality is a low density-independent background that differs by origin, plus a density-dependent self-thinning lift that starts at 0.65 relative density (SDI/SDImax), increases linearly to a maximum at 0.85 RD, and plateaus above. BYI is deliberately not a direct mortality driver; it influences long-term density correctly through growth, by driving stands into self-thinning sooner. Drop-in code is koa_survival_calibrated.R; the constants are interpretable and meant to be refined as data accrue.</w:t>
       </w:r>
     </w:p>
     <w:p>
@@ -4729,10 +4729,10 @@
           <w:i/>
           <w:iCs/>
         </w:rPr>
-        <w:t xml:space="preserve">mortality = base(origin) + ramp × max(0, SDI/SDImax − 0.55)^2,</w:t>
-      </w:r>
-      <w:r>
-        <w:t xml:space="preserve">  with base 0.005/yr natural, 0.003/yr plantation, ramp 0.55, capped at 0.15/yr.</w:t>
+        <w:t xml:space="preserve">mortality = base(origin) + maxlift × clamp((SDI/SDImax − 0.65) / 0.20, 0, 1),</w:t>
+      </w:r>
+      <w:r>
+        <w:t xml:space="preserve">  with base 0.005/yr natural, 0.003/yr plantation, maxlift 0.15/yr reached at 0.85 RD, capped at 0.20/yr.</w:t>
       </w:r>
     </w:p>
     <w:p>
@@ -4740,7 +4740,7 @@
         <w:pStyle w:val="Heading2"/>
       </w:pPr>
       <w:r>
-        <w:t xml:space="preserve">11.3 Long-term behavior (150-year projections)</w:t>
+        <w:t xml:space="preserve">11.3 Final long-term stress test (200-year projections)</w:t>
       </w:r>
     </w:p>
     <w:p>
@@ -4748,7 +4748,7 @@
         <w:spacing w:after="120"/>
       </w:pPr>
       <w:r>
-        <w:t xml:space="preserve">Cohort QMD (cm) / trees per hectare / percent of SDImax at decade marks, tuned model:</w:t>
+        <w:t xml:space="preserve">Cohort QMD (cm) / trees per hectare / percent of SDImax, final model, across origin and site:</w:t>
       </w:r>
     </w:p>
     <w:tbl>
@@ -4831,7 +4831,7 @@
                 <w:sz w:val="18"/>
                 <w:szCs w:val="18"/>
               </w:rPr>
-              <w:t xml:space="preserve">Age 20</w:t>
+              <w:t xml:space="preserve">Age 25</w:t>
             </w:r>
           </w:p>
         </w:tc>
@@ -4861,7 +4861,7 @@
                 <w:sz w:val="18"/>
                 <w:szCs w:val="18"/>
               </w:rPr>
-              <w:t xml:space="preserve">Age 40</w:t>
+              <w:t xml:space="preserve">Age 50</w:t>
             </w:r>
           </w:p>
         </w:tc>
@@ -4891,7 +4891,7 @@
                 <w:sz w:val="18"/>
                 <w:szCs w:val="18"/>
               </w:rPr>
-              <w:t xml:space="preserve">Age 60</w:t>
+              <w:t xml:space="preserve">Age 100</w:t>
             </w:r>
           </w:p>
         </w:tc>
@@ -4921,7 +4921,7 @@
                 <w:sz w:val="18"/>
                 <w:szCs w:val="18"/>
               </w:rPr>
-              <w:t xml:space="preserve">Age 100</w:t>
+              <w:t xml:space="preserve">Age 150</w:t>
             </w:r>
           </w:p>
         </w:tc>
@@ -4951,7 +4951,7 @@
                 <w:sz w:val="18"/>
                 <w:szCs w:val="18"/>
               </w:rPr>
-              <w:t xml:space="preserve">Age 150</w:t>
+              <w:t xml:space="preserve">Age 200</w:t>
             </w:r>
           </w:p>
         </w:tc>
@@ -5005,7 +5005,7 @@
                 <w:sz w:val="18"/>
                 <w:szCs w:val="18"/>
               </w:rPr>
-              <w:t xml:space="preserve">24/415/77</w:t>
+              <w:t xml:space="preserve">27/307/69</w:t>
             </w:r>
           </w:p>
         </w:tc>
@@ -5031,7 +5031,7 @@
                 <w:sz w:val="18"/>
                 <w:szCs w:val="18"/>
               </w:rPr>
-              <w:t xml:space="preserve">35/220/74</w:t>
+              <w:t xml:space="preserve">40/157/67</w:t>
             </w:r>
           </w:p>
         </w:tc>
@@ -5057,7 +5057,7 @@
                 <w:sz w:val="18"/>
                 <w:szCs w:val="18"/>
               </w:rPr>
-              <w:t xml:space="preserve">44/143/70</w:t>
+              <w:t xml:space="preserve">59/83/65</w:t>
             </w:r>
           </w:p>
         </w:tc>
@@ -5083,7 +5083,7 @@
                 <w:sz w:val="18"/>
                 <w:szCs w:val="18"/>
               </w:rPr>
-              <w:t xml:space="preserve">58/84/65</w:t>
+              <w:t xml:space="preserve">72/59/65</w:t>
             </w:r>
           </w:p>
         </w:tc>
@@ -5109,7 +5109,7 @@
                 <w:sz w:val="18"/>
                 <w:szCs w:val="18"/>
               </w:rPr>
-              <w:t xml:space="preserve">72/55/60</w:t>
+              <w:t xml:space="preserve">83/46/63</w:t>
             </w:r>
           </w:p>
         </w:tc>
@@ -5165,7 +5165,7 @@
                 <w:sz w:val="18"/>
                 <w:szCs w:val="18"/>
               </w:rPr>
-              <w:t xml:space="preserve">29/323/82</w:t>
+              <w:t xml:space="preserve">34/217/70</w:t>
             </w:r>
           </w:p>
         </w:tc>
@@ -5192,7 +5192,7 @@
                 <w:sz w:val="18"/>
                 <w:szCs w:val="18"/>
               </w:rPr>
-              <w:t xml:space="preserve">43/156/75</w:t>
+              <w:t xml:space="preserve">50/110/67</w:t>
             </w:r>
           </w:p>
         </w:tc>
@@ -5219,7 +5219,7 @@
                 <w:sz w:val="18"/>
                 <w:szCs w:val="18"/>
               </w:rPr>
-              <w:t xml:space="preserve">54/101/70</w:t>
+              <w:t xml:space="preserve">72/60/65</w:t>
             </w:r>
           </w:p>
         </w:tc>
@@ -5246,7 +5246,7 @@
                 <w:sz w:val="18"/>
                 <w:szCs w:val="18"/>
               </w:rPr>
-              <w:t xml:space="preserve">71/60/64</w:t>
+              <w:t xml:space="preserve">87/44/65</w:t>
             </w:r>
           </w:p>
         </w:tc>
@@ -5273,7 +5273,7 @@
                 <w:sz w:val="18"/>
                 <w:szCs w:val="18"/>
               </w:rPr>
-              <w:t xml:space="preserve">87/41/60</w:t>
+              <w:t xml:space="preserve">90/34/53</w:t>
             </w:r>
           </w:p>
         </w:tc>
@@ -5327,7 +5327,7 @@
                 <w:sz w:val="18"/>
                 <w:szCs w:val="18"/>
               </w:rPr>
-              <w:t xml:space="preserve">33/272/84</w:t>
+              <w:t xml:space="preserve">38/178/70</w:t>
             </w:r>
           </w:p>
         </w:tc>
@@ -5353,7 +5353,7 @@
                 <w:sz w:val="18"/>
                 <w:szCs w:val="18"/>
               </w:rPr>
-              <w:t xml:space="preserve">48/129/75</w:t>
+              <w:t xml:space="preserve">56/91/67</w:t>
             </w:r>
           </w:p>
         </w:tc>
@@ -5379,7 +5379,7 @@
                 <w:sz w:val="18"/>
                 <w:szCs w:val="18"/>
               </w:rPr>
-              <w:t xml:space="preserve">61/84/70</w:t>
+              <w:t xml:space="preserve">80/51/65</w:t>
             </w:r>
           </w:p>
         </w:tc>
@@ -5405,7 +5405,7 @@
                 <w:sz w:val="18"/>
                 <w:szCs w:val="18"/>
               </w:rPr>
-              <w:t xml:space="preserve">79/51/64</w:t>
+              <w:t xml:space="preserve">90/38/59</w:t>
             </w:r>
           </w:p>
         </w:tc>
@@ -5431,7 +5431,7 @@
                 <w:sz w:val="18"/>
                 <w:szCs w:val="18"/>
               </w:rPr>
-              <w:t xml:space="preserve">90/35/55</w:t>
+              <w:t xml:space="preserve">90/29/46</w:t>
             </w:r>
           </w:p>
         </w:tc>
@@ -5487,7 +5487,7 @@
                 <w:sz w:val="18"/>
                 <w:szCs w:val="18"/>
               </w:rPr>
-              <w:t xml:space="preserve">32/297/90</w:t>
+              <w:t xml:space="preserve">41/163/72</w:t>
             </w:r>
           </w:p>
         </w:tc>
@@ -5514,7 +5514,7 @@
                 <w:sz w:val="18"/>
                 <w:szCs w:val="18"/>
               </w:rPr>
-              <w:t xml:space="preserve">56/108/78</w:t>
+              <w:t xml:space="preserve">60/79/64</w:t>
             </w:r>
           </w:p>
         </w:tc>
@@ -5541,7 +5541,7 @@
                 <w:sz w:val="18"/>
                 <w:szCs w:val="18"/>
               </w:rPr>
-              <w:t xml:space="preserve">60/77/62</w:t>
+              <w:t xml:space="preserve">60/68/55</w:t>
             </w:r>
           </w:p>
         </w:tc>
@@ -5568,7 +5568,7 @@
                 <w:sz w:val="18"/>
                 <w:szCs w:val="18"/>
               </w:rPr>
-              <w:t xml:space="preserve">60/66/54</w:t>
+              <w:t xml:space="preserve">60/58/47</w:t>
             </w:r>
           </w:p>
         </w:tc>
@@ -5595,7 +5595,7 @@
                 <w:sz w:val="18"/>
                 <w:szCs w:val="18"/>
               </w:rPr>
-              <w:t xml:space="preserve">60/57/46</w:t>
+              <w:t xml:space="preserve">60/50/41</w:t>
             </w:r>
           </w:p>
         </w:tc>
@@ -5660,7 +5660,7 @@
           <w:sz w:val="16"/>
           <w:szCs w:val="16"/>
         </w:rPr>
-        <w:t xml:space="preserve">Figure 4. 150-year behavior, tuned calibrated survival. Left: SDI rises to about 83% of SDImax then tracks the self-thinning line. Center: QMD approaches ~90 cm (natural) or the 60 cm cap (plantation). Right: stand trajectory in QMD by density space.</w:t>
+        <w:t xml:space="preserve">Figure 4. 200-year behavior, final calibrated survival (ramp 0.65 to 0.85 RD). Left: SDI rises to 72-88% of SDImax then tracks the self-thinning line. Center: QMD approaches ~90 cm (natural) or the 60 cm cap (plantation). Right: stand trajectory in QMD by density space.</w:t>
       </w:r>
     </w:p>
     <w:p>
@@ -5668,7 +5668,1075 @@
         <w:spacing w:after="120"/>
       </w:pPr>
       <w:r>
-        <w:t xml:space="preserve">SDI peaks near 83% of SDImax then declines along the self-thinning trajectory: no runaway, no collapse. Higher BYI reaches the self-thinning onset sooner (natural age 12 at BYI 100 versus age 7 at BYI 450) and grows larger, so BYI shapes density through growth rather than a confounded mortality term. Plantations self-thin earlier from denser starts and plateau at the 60 cm cap. This is the long-term behavior the model was missing.</w:t>
+        <w:t xml:space="preserve">Robustness checks across all six origin by BYI combinations pass: no runaway (peak 70 to 88% of SDImax), no collapse, and monotonic QMD over 200 years. Background annual mortality is 0.5% natural and 0.3% plantation, rising to about 15% per year at full self-thinning. Higher BYI reaches the self-thinning onset sooner and grows larger, so BYI shapes density through growth rather than a confounded mortality term. Plantations self-thin earlier from denser starts and plateau at the 60 cm cap. This is the long-term behavior the model was missing.</w:t>
+      </w:r>
+    </w:p>
+    <w:p>
+      <w:pPr>
+        <w:pStyle w:val="Heading2"/>
+      </w:pPr>
+      <w:r>
+        <w:t xml:space="preserve">11.4 Volume increment: PAI and MAI culmination</w:t>
+      </w:r>
+    </w:p>
+    <w:p>
+      <w:pPr>
+        <w:spacing w:after="120"/>
+      </w:pPr>
+      <w:r>
+        <w:t xml:space="preserve">Projecting from establishment (2 cm, age 1) to 200 years, periodic annual increment (PAI) and mean annual increment (MAI) of stem volume behave as expected, and MAI culmination (biological rotation age) responds correctly to site and origin:</w:t>
+      </w:r>
+    </w:p>
+    <w:tbl>
+      <w:tblPr>
+        <w:tblW w:type="dxa" w:w="9360"/>
+        <w:tblBorders>
+          <w:top w:val="single" w:color="auto" w:sz="4"/>
+          <w:left w:val="single" w:color="auto" w:sz="4"/>
+          <w:bottom w:val="single" w:color="auto" w:sz="4"/>
+          <w:right w:val="single" w:color="auto" w:sz="4"/>
+          <w:insideH w:val="single" w:color="auto" w:sz="4"/>
+          <w:insideV w:val="single" w:color="auto" w:sz="4"/>
+        </w:tblBorders>
+      </w:tblPr>
+      <w:tblGrid>
+        <w:gridCol w:w="2360"/>
+        <w:gridCol w:w="1900"/>
+        <w:gridCol w:w="1850"/>
+        <w:gridCol w:w="1450"/>
+        <w:gridCol w:w="1800"/>
+      </w:tblGrid>
+      <w:tr>
+        <w:trPr>
+          <w:tblHeader/>
+        </w:trPr>
+        <w:tc>
+          <w:tcPr>
+            <w:tcW w:type="dxa" w:w="2360"/>
+            <w:tcBorders>
+              <w:top w:val="single" w:color="B0B0B0" w:sz="1"/>
+              <w:left w:val="single" w:color="B0B0B0" w:sz="1"/>
+              <w:bottom w:val="single" w:color="B0B0B0" w:sz="1"/>
+              <w:right w:val="single" w:color="B0B0B0" w:sz="1"/>
+            </w:tcBorders>
+            <w:shd w:fill="1F4E79" w:val="clear"/>
+            <w:tcMar>
+              <w:top w:type="dxa" w:w="60"/>
+              <w:left w:type="dxa" w:w="100"/>
+              <w:bottom w:type="dxa" w:w="60"/>
+              <w:right w:type="dxa" w:w="100"/>
+            </w:tcMar>
+          </w:tcPr>
+          <w:p>
+            <w:r>
+              <w:rPr>
+                <w:b/>
+                <w:bCs/>
+                <w:color w:val="FFFFFF"/>
+                <w:sz w:val="18"/>
+                <w:szCs w:val="18"/>
+              </w:rPr>
+              <w:t xml:space="preserve">Origin / BYI</w:t>
+            </w:r>
+          </w:p>
+        </w:tc>
+        <w:tc>
+          <w:tcPr>
+            <w:tcW w:type="dxa" w:w="1900"/>
+            <w:tcBorders>
+              <w:top w:val="single" w:color="B0B0B0" w:sz="1"/>
+              <w:left w:val="single" w:color="B0B0B0" w:sz="1"/>
+              <w:bottom w:val="single" w:color="B0B0B0" w:sz="1"/>
+              <w:right w:val="single" w:color="B0B0B0" w:sz="1"/>
+            </w:tcBorders>
+            <w:shd w:fill="1F4E79" w:val="clear"/>
+            <w:tcMar>
+              <w:top w:type="dxa" w:w="60"/>
+              <w:left w:type="dxa" w:w="100"/>
+              <w:bottom w:type="dxa" w:w="60"/>
+              <w:right w:type="dxa" w:w="100"/>
+            </w:tcMar>
+          </w:tcPr>
+          <w:p>
+            <w:r>
+              <w:rPr>
+                <w:b/>
+                <w:bCs/>
+                <w:color w:val="FFFFFF"/>
+                <w:sz w:val="18"/>
+                <w:szCs w:val="18"/>
+              </w:rPr>
+              <w:t xml:space="preserve">MAI culmination age</w:t>
+            </w:r>
+          </w:p>
+        </w:tc>
+        <w:tc>
+          <w:tcPr>
+            <w:tcW w:type="dxa" w:w="1850"/>
+            <w:tcBorders>
+              <w:top w:val="single" w:color="B0B0B0" w:sz="1"/>
+              <w:left w:val="single" w:color="B0B0B0" w:sz="1"/>
+              <w:bottom w:val="single" w:color="B0B0B0" w:sz="1"/>
+              <w:right w:val="single" w:color="B0B0B0" w:sz="1"/>
+            </w:tcBorders>
+            <w:shd w:fill="1F4E79" w:val="clear"/>
+            <w:tcMar>
+              <w:top w:type="dxa" w:w="60"/>
+              <w:left w:type="dxa" w:w="100"/>
+              <w:bottom w:type="dxa" w:w="60"/>
+              <w:right w:type="dxa" w:w="100"/>
+            </w:tcMar>
+          </w:tcPr>
+          <w:p>
+            <w:r>
+              <w:rPr>
+                <w:b/>
+                <w:bCs/>
+                <w:color w:val="FFFFFF"/>
+                <w:sz w:val="18"/>
+                <w:szCs w:val="18"/>
+              </w:rPr>
+              <w:t xml:space="preserve">MAI peak (m3/ha/yr)</w:t>
+            </w:r>
+          </w:p>
+        </w:tc>
+        <w:tc>
+          <w:tcPr>
+            <w:tcW w:type="dxa" w:w="1450"/>
+            <w:tcBorders>
+              <w:top w:val="single" w:color="B0B0B0" w:sz="1"/>
+              <w:left w:val="single" w:color="B0B0B0" w:sz="1"/>
+              <w:bottom w:val="single" w:color="B0B0B0" w:sz="1"/>
+              <w:right w:val="single" w:color="B0B0B0" w:sz="1"/>
+            </w:tcBorders>
+            <w:shd w:fill="1F4E79" w:val="clear"/>
+            <w:tcMar>
+              <w:top w:type="dxa" w:w="60"/>
+              <w:left w:type="dxa" w:w="100"/>
+              <w:bottom w:type="dxa" w:w="60"/>
+              <w:right w:type="dxa" w:w="100"/>
+            </w:tcMar>
+          </w:tcPr>
+          <w:p>
+            <w:r>
+              <w:rPr>
+                <w:b/>
+                <w:bCs/>
+                <w:color w:val="FFFFFF"/>
+                <w:sz w:val="18"/>
+                <w:szCs w:val="18"/>
+              </w:rPr>
+              <w:t xml:space="preserve">PAI peak age</w:t>
+            </w:r>
+          </w:p>
+        </w:tc>
+        <w:tc>
+          <w:tcPr>
+            <w:tcW w:type="dxa" w:w="1800"/>
+            <w:tcBorders>
+              <w:top w:val="single" w:color="B0B0B0" w:sz="1"/>
+              <w:left w:val="single" w:color="B0B0B0" w:sz="1"/>
+              <w:bottom w:val="single" w:color="B0B0B0" w:sz="1"/>
+              <w:right w:val="single" w:color="B0B0B0" w:sz="1"/>
+            </w:tcBorders>
+            <w:shd w:fill="1F4E79" w:val="clear"/>
+            <w:tcMar>
+              <w:top w:type="dxa" w:w="60"/>
+              <w:left w:type="dxa" w:w="100"/>
+              <w:bottom w:type="dxa" w:w="60"/>
+              <w:right w:type="dxa" w:w="100"/>
+            </w:tcMar>
+          </w:tcPr>
+          <w:p>
+            <w:r>
+              <w:rPr>
+                <w:b/>
+                <w:bCs/>
+                <w:color w:val="FFFFFF"/>
+                <w:sz w:val="18"/>
+                <w:szCs w:val="18"/>
+              </w:rPr>
+              <w:t xml:space="preserve">Volume age 200</w:t>
+            </w:r>
+          </w:p>
+        </w:tc>
+      </w:tr>
+      <w:tr>
+        <w:tc>
+          <w:tcPr>
+            <w:tcW w:type="dxa" w:w="2360"/>
+            <w:tcBorders>
+              <w:top w:val="single" w:color="B0B0B0" w:sz="1"/>
+              <w:left w:val="single" w:color="B0B0B0" w:sz="1"/>
+              <w:bottom w:val="single" w:color="B0B0B0" w:sz="1"/>
+              <w:right w:val="single" w:color="B0B0B0" w:sz="1"/>
+            </w:tcBorders>
+            <w:tcMar>
+              <w:top w:type="dxa" w:w="60"/>
+              <w:left w:type="dxa" w:w="100"/>
+              <w:bottom w:type="dxa" w:w="60"/>
+              <w:right w:type="dxa" w:w="100"/>
+            </w:tcMar>
+          </w:tcPr>
+          <w:p>
+            <w:r>
+              <w:rPr>
+                <w:sz w:val="18"/>
+                <w:szCs w:val="18"/>
+              </w:rPr>
+              <w:t xml:space="preserve">Natural BYI 100</w:t>
+            </w:r>
+          </w:p>
+        </w:tc>
+        <w:tc>
+          <w:tcPr>
+            <w:tcW w:type="dxa" w:w="1900"/>
+            <w:tcBorders>
+              <w:top w:val="single" w:color="B0B0B0" w:sz="1"/>
+              <w:left w:val="single" w:color="B0B0B0" w:sz="1"/>
+              <w:bottom w:val="single" w:color="B0B0B0" w:sz="1"/>
+              <w:right w:val="single" w:color="B0B0B0" w:sz="1"/>
+            </w:tcBorders>
+            <w:tcMar>
+              <w:top w:type="dxa" w:w="60"/>
+              <w:left w:type="dxa" w:w="100"/>
+              <w:bottom w:type="dxa" w:w="60"/>
+              <w:right w:type="dxa" w:w="100"/>
+            </w:tcMar>
+          </w:tcPr>
+          <w:p>
+            <w:r>
+              <w:rPr>
+                <w:sz w:val="18"/>
+                <w:szCs w:val="18"/>
+              </w:rPr>
+              <w:t xml:space="preserve">15</w:t>
+            </w:r>
+          </w:p>
+        </w:tc>
+        <w:tc>
+          <w:tcPr>
+            <w:tcW w:type="dxa" w:w="1850"/>
+            <w:tcBorders>
+              <w:top w:val="single" w:color="B0B0B0" w:sz="1"/>
+              <w:left w:val="single" w:color="B0B0B0" w:sz="1"/>
+              <w:bottom w:val="single" w:color="B0B0B0" w:sz="1"/>
+              <w:right w:val="single" w:color="B0B0B0" w:sz="1"/>
+            </w:tcBorders>
+            <w:tcMar>
+              <w:top w:type="dxa" w:w="60"/>
+              <w:left w:type="dxa" w:w="100"/>
+              <w:bottom w:type="dxa" w:w="60"/>
+              <w:right w:type="dxa" w:w="100"/>
+            </w:tcMar>
+          </w:tcPr>
+          <w:p>
+            <w:r>
+              <w:rPr>
+                <w:sz w:val="18"/>
+                <w:szCs w:val="18"/>
+              </w:rPr>
+              <w:t xml:space="preserve">4.3</w:t>
+            </w:r>
+          </w:p>
+        </w:tc>
+        <w:tc>
+          <w:tcPr>
+            <w:tcW w:type="dxa" w:w="1450"/>
+            <w:tcBorders>
+              <w:top w:val="single" w:color="B0B0B0" w:sz="1"/>
+              <w:left w:val="single" w:color="B0B0B0" w:sz="1"/>
+              <w:bottom w:val="single" w:color="B0B0B0" w:sz="1"/>
+              <w:right w:val="single" w:color="B0B0B0" w:sz="1"/>
+            </w:tcBorders>
+            <w:tcMar>
+              <w:top w:type="dxa" w:w="60"/>
+              <w:left w:type="dxa" w:w="100"/>
+              <w:bottom w:type="dxa" w:w="60"/>
+              <w:right w:type="dxa" w:w="100"/>
+            </w:tcMar>
+          </w:tcPr>
+          <w:p>
+            <w:r>
+              <w:rPr>
+                <w:sz w:val="18"/>
+                <w:szCs w:val="18"/>
+              </w:rPr>
+              <w:t xml:space="preserve">13</w:t>
+            </w:r>
+          </w:p>
+        </w:tc>
+        <w:tc>
+          <w:tcPr>
+            <w:tcW w:type="dxa" w:w="1800"/>
+            <w:tcBorders>
+              <w:top w:val="single" w:color="B0B0B0" w:sz="1"/>
+              <w:left w:val="single" w:color="B0B0B0" w:sz="1"/>
+              <w:bottom w:val="single" w:color="B0B0B0" w:sz="1"/>
+              <w:right w:val="single" w:color="B0B0B0" w:sz="1"/>
+            </w:tcBorders>
+            <w:tcMar>
+              <w:top w:type="dxa" w:w="60"/>
+              <w:left w:type="dxa" w:w="100"/>
+              <w:bottom w:type="dxa" w:w="60"/>
+              <w:right w:type="dxa" w:w="100"/>
+            </w:tcMar>
+          </w:tcPr>
+          <w:p>
+            <w:r>
+              <w:rPr>
+                <w:sz w:val="18"/>
+                <w:szCs w:val="18"/>
+              </w:rPr>
+              <w:t xml:space="preserve">171</w:t>
+            </w:r>
+          </w:p>
+        </w:tc>
+      </w:tr>
+      <w:tr>
+        <w:tc>
+          <w:tcPr>
+            <w:tcW w:type="dxa" w:w="2360"/>
+            <w:tcBorders>
+              <w:top w:val="single" w:color="B0B0B0" w:sz="1"/>
+              <w:left w:val="single" w:color="B0B0B0" w:sz="1"/>
+              <w:bottom w:val="single" w:color="B0B0B0" w:sz="1"/>
+              <w:right w:val="single" w:color="B0B0B0" w:sz="1"/>
+            </w:tcBorders>
+            <w:shd w:fill="EAF1F8" w:val="clear"/>
+            <w:tcMar>
+              <w:top w:type="dxa" w:w="60"/>
+              <w:left w:type="dxa" w:w="100"/>
+              <w:bottom w:type="dxa" w:w="60"/>
+              <w:right w:type="dxa" w:w="100"/>
+            </w:tcMar>
+          </w:tcPr>
+          <w:p>
+            <w:r>
+              <w:rPr>
+                <w:sz w:val="18"/>
+                <w:szCs w:val="18"/>
+              </w:rPr>
+              <w:t xml:space="preserve">Natural BYI 264</w:t>
+            </w:r>
+          </w:p>
+        </w:tc>
+        <w:tc>
+          <w:tcPr>
+            <w:tcW w:type="dxa" w:w="1900"/>
+            <w:tcBorders>
+              <w:top w:val="single" w:color="B0B0B0" w:sz="1"/>
+              <w:left w:val="single" w:color="B0B0B0" w:sz="1"/>
+              <w:bottom w:val="single" w:color="B0B0B0" w:sz="1"/>
+              <w:right w:val="single" w:color="B0B0B0" w:sz="1"/>
+            </w:tcBorders>
+            <w:shd w:fill="EAF1F8" w:val="clear"/>
+            <w:tcMar>
+              <w:top w:type="dxa" w:w="60"/>
+              <w:left w:type="dxa" w:w="100"/>
+              <w:bottom w:type="dxa" w:w="60"/>
+              <w:right w:type="dxa" w:w="100"/>
+            </w:tcMar>
+          </w:tcPr>
+          <w:p>
+            <w:r>
+              <w:rPr>
+                <w:sz w:val="18"/>
+                <w:szCs w:val="18"/>
+              </w:rPr>
+              <w:t xml:space="preserve">11</w:t>
+            </w:r>
+          </w:p>
+        </w:tc>
+        <w:tc>
+          <w:tcPr>
+            <w:tcW w:type="dxa" w:w="1850"/>
+            <w:tcBorders>
+              <w:top w:val="single" w:color="B0B0B0" w:sz="1"/>
+              <w:left w:val="single" w:color="B0B0B0" w:sz="1"/>
+              <w:bottom w:val="single" w:color="B0B0B0" w:sz="1"/>
+              <w:right w:val="single" w:color="B0B0B0" w:sz="1"/>
+            </w:tcBorders>
+            <w:shd w:fill="EAF1F8" w:val="clear"/>
+            <w:tcMar>
+              <w:top w:type="dxa" w:w="60"/>
+              <w:left w:type="dxa" w:w="100"/>
+              <w:bottom w:type="dxa" w:w="60"/>
+              <w:right w:type="dxa" w:w="100"/>
+            </w:tcMar>
+          </w:tcPr>
+          <w:p>
+            <w:r>
+              <w:rPr>
+                <w:sz w:val="18"/>
+                <w:szCs w:val="18"/>
+              </w:rPr>
+              <w:t xml:space="preserve">6.5</w:t>
+            </w:r>
+          </w:p>
+        </w:tc>
+        <w:tc>
+          <w:tcPr>
+            <w:tcW w:type="dxa" w:w="1450"/>
+            <w:tcBorders>
+              <w:top w:val="single" w:color="B0B0B0" w:sz="1"/>
+              <w:left w:val="single" w:color="B0B0B0" w:sz="1"/>
+              <w:bottom w:val="single" w:color="B0B0B0" w:sz="1"/>
+              <w:right w:val="single" w:color="B0B0B0" w:sz="1"/>
+            </w:tcBorders>
+            <w:shd w:fill="EAF1F8" w:val="clear"/>
+            <w:tcMar>
+              <w:top w:type="dxa" w:w="60"/>
+              <w:left w:type="dxa" w:w="100"/>
+              <w:bottom w:type="dxa" w:w="60"/>
+              <w:right w:type="dxa" w:w="100"/>
+            </w:tcMar>
+          </w:tcPr>
+          <w:p>
+            <w:r>
+              <w:rPr>
+                <w:sz w:val="18"/>
+                <w:szCs w:val="18"/>
+              </w:rPr>
+              <w:t xml:space="preserve">9</w:t>
+            </w:r>
+          </w:p>
+        </w:tc>
+        <w:tc>
+          <w:tcPr>
+            <w:tcW w:type="dxa" w:w="1800"/>
+            <w:tcBorders>
+              <w:top w:val="single" w:color="B0B0B0" w:sz="1"/>
+              <w:left w:val="single" w:color="B0B0B0" w:sz="1"/>
+              <w:bottom w:val="single" w:color="B0B0B0" w:sz="1"/>
+              <w:right w:val="single" w:color="B0B0B0" w:sz="1"/>
+            </w:tcBorders>
+            <w:shd w:fill="EAF1F8" w:val="clear"/>
+            <w:tcMar>
+              <w:top w:type="dxa" w:w="60"/>
+              <w:left w:type="dxa" w:w="100"/>
+              <w:bottom w:type="dxa" w:w="60"/>
+              <w:right w:type="dxa" w:w="100"/>
+            </w:tcMar>
+          </w:tcPr>
+          <w:p>
+            <w:r>
+              <w:rPr>
+                <w:sz w:val="18"/>
+                <w:szCs w:val="18"/>
+              </w:rPr>
+              <w:t xml:space="preserve">158</w:t>
+            </w:r>
+          </w:p>
+        </w:tc>
+      </w:tr>
+      <w:tr>
+        <w:tc>
+          <w:tcPr>
+            <w:tcW w:type="dxa" w:w="2360"/>
+            <w:tcBorders>
+              <w:top w:val="single" w:color="B0B0B0" w:sz="1"/>
+              <w:left w:val="single" w:color="B0B0B0" w:sz="1"/>
+              <w:bottom w:val="single" w:color="B0B0B0" w:sz="1"/>
+              <w:right w:val="single" w:color="B0B0B0" w:sz="1"/>
+            </w:tcBorders>
+            <w:tcMar>
+              <w:top w:type="dxa" w:w="60"/>
+              <w:left w:type="dxa" w:w="100"/>
+              <w:bottom w:type="dxa" w:w="60"/>
+              <w:right w:type="dxa" w:w="100"/>
+            </w:tcMar>
+          </w:tcPr>
+          <w:p>
+            <w:r>
+              <w:rPr>
+                <w:sz w:val="18"/>
+                <w:szCs w:val="18"/>
+              </w:rPr>
+              <w:t xml:space="preserve">Natural BYI 450</w:t>
+            </w:r>
+          </w:p>
+        </w:tc>
+        <w:tc>
+          <w:tcPr>
+            <w:tcW w:type="dxa" w:w="1900"/>
+            <w:tcBorders>
+              <w:top w:val="single" w:color="B0B0B0" w:sz="1"/>
+              <w:left w:val="single" w:color="B0B0B0" w:sz="1"/>
+              <w:bottom w:val="single" w:color="B0B0B0" w:sz="1"/>
+              <w:right w:val="single" w:color="B0B0B0" w:sz="1"/>
+            </w:tcBorders>
+            <w:tcMar>
+              <w:top w:type="dxa" w:w="60"/>
+              <w:left w:type="dxa" w:w="100"/>
+              <w:bottom w:type="dxa" w:w="60"/>
+              <w:right w:type="dxa" w:w="100"/>
+            </w:tcMar>
+          </w:tcPr>
+          <w:p>
+            <w:r>
+              <w:rPr>
+                <w:sz w:val="18"/>
+                <w:szCs w:val="18"/>
+              </w:rPr>
+              <w:t xml:space="preserve">9</w:t>
+            </w:r>
+          </w:p>
+        </w:tc>
+        <w:tc>
+          <w:tcPr>
+            <w:tcW w:type="dxa" w:w="1850"/>
+            <w:tcBorders>
+              <w:top w:val="single" w:color="B0B0B0" w:sz="1"/>
+              <w:left w:val="single" w:color="B0B0B0" w:sz="1"/>
+              <w:bottom w:val="single" w:color="B0B0B0" w:sz="1"/>
+              <w:right w:val="single" w:color="B0B0B0" w:sz="1"/>
+            </w:tcBorders>
+            <w:tcMar>
+              <w:top w:type="dxa" w:w="60"/>
+              <w:left w:type="dxa" w:w="100"/>
+              <w:bottom w:type="dxa" w:w="60"/>
+              <w:right w:type="dxa" w:w="100"/>
+            </w:tcMar>
+          </w:tcPr>
+          <w:p>
+            <w:r>
+              <w:rPr>
+                <w:sz w:val="18"/>
+                <w:szCs w:val="18"/>
+              </w:rPr>
+              <w:t xml:space="preserve">8.2</w:t>
+            </w:r>
+          </w:p>
+        </w:tc>
+        <w:tc>
+          <w:tcPr>
+            <w:tcW w:type="dxa" w:w="1450"/>
+            <w:tcBorders>
+              <w:top w:val="single" w:color="B0B0B0" w:sz="1"/>
+              <w:left w:val="single" w:color="B0B0B0" w:sz="1"/>
+              <w:bottom w:val="single" w:color="B0B0B0" w:sz="1"/>
+              <w:right w:val="single" w:color="B0B0B0" w:sz="1"/>
+            </w:tcBorders>
+            <w:tcMar>
+              <w:top w:type="dxa" w:w="60"/>
+              <w:left w:type="dxa" w:w="100"/>
+              <w:bottom w:type="dxa" w:w="60"/>
+              <w:right w:type="dxa" w:w="100"/>
+            </w:tcMar>
+          </w:tcPr>
+          <w:p>
+            <w:r>
+              <w:rPr>
+                <w:sz w:val="18"/>
+                <w:szCs w:val="18"/>
+              </w:rPr>
+              <w:t xml:space="preserve">7</w:t>
+            </w:r>
+          </w:p>
+        </w:tc>
+        <w:tc>
+          <w:tcPr>
+            <w:tcW w:type="dxa" w:w="1800"/>
+            <w:tcBorders>
+              <w:top w:val="single" w:color="B0B0B0" w:sz="1"/>
+              <w:left w:val="single" w:color="B0B0B0" w:sz="1"/>
+              <w:bottom w:val="single" w:color="B0B0B0" w:sz="1"/>
+              <w:right w:val="single" w:color="B0B0B0" w:sz="1"/>
+            </w:tcBorders>
+            <w:tcMar>
+              <w:top w:type="dxa" w:w="60"/>
+              <w:left w:type="dxa" w:w="100"/>
+              <w:bottom w:type="dxa" w:w="60"/>
+              <w:right w:type="dxa" w:w="100"/>
+            </w:tcMar>
+          </w:tcPr>
+          <w:p>
+            <w:r>
+              <w:rPr>
+                <w:sz w:val="18"/>
+                <w:szCs w:val="18"/>
+              </w:rPr>
+              <w:t xml:space="preserve">140</w:t>
+            </w:r>
+          </w:p>
+        </w:tc>
+      </w:tr>
+      <w:tr>
+        <w:tc>
+          <w:tcPr>
+            <w:tcW w:type="dxa" w:w="2360"/>
+            <w:tcBorders>
+              <w:top w:val="single" w:color="B0B0B0" w:sz="1"/>
+              <w:left w:val="single" w:color="B0B0B0" w:sz="1"/>
+              <w:bottom w:val="single" w:color="B0B0B0" w:sz="1"/>
+              <w:right w:val="single" w:color="B0B0B0" w:sz="1"/>
+            </w:tcBorders>
+            <w:shd w:fill="EAF1F8" w:val="clear"/>
+            <w:tcMar>
+              <w:top w:type="dxa" w:w="60"/>
+              <w:left w:type="dxa" w:w="100"/>
+              <w:bottom w:type="dxa" w:w="60"/>
+              <w:right w:type="dxa" w:w="100"/>
+            </w:tcMar>
+          </w:tcPr>
+          <w:p>
+            <w:r>
+              <w:rPr>
+                <w:sz w:val="18"/>
+                <w:szCs w:val="18"/>
+              </w:rPr>
+              <w:t xml:space="preserve">Plantation BYI 100</w:t>
+            </w:r>
+          </w:p>
+        </w:tc>
+        <w:tc>
+          <w:tcPr>
+            <w:tcW w:type="dxa" w:w="1900"/>
+            <w:tcBorders>
+              <w:top w:val="single" w:color="B0B0B0" w:sz="1"/>
+              <w:left w:val="single" w:color="B0B0B0" w:sz="1"/>
+              <w:bottom w:val="single" w:color="B0B0B0" w:sz="1"/>
+              <w:right w:val="single" w:color="B0B0B0" w:sz="1"/>
+            </w:tcBorders>
+            <w:shd w:fill="EAF1F8" w:val="clear"/>
+            <w:tcMar>
+              <w:top w:type="dxa" w:w="60"/>
+              <w:left w:type="dxa" w:w="100"/>
+              <w:bottom w:type="dxa" w:w="60"/>
+              <w:right w:type="dxa" w:w="100"/>
+            </w:tcMar>
+          </w:tcPr>
+          <w:p>
+            <w:r>
+              <w:rPr>
+                <w:sz w:val="18"/>
+                <w:szCs w:val="18"/>
+              </w:rPr>
+              <w:t xml:space="preserve">10</w:t>
+            </w:r>
+          </w:p>
+        </w:tc>
+        <w:tc>
+          <w:tcPr>
+            <w:tcW w:type="dxa" w:w="1850"/>
+            <w:tcBorders>
+              <w:top w:val="single" w:color="B0B0B0" w:sz="1"/>
+              <w:left w:val="single" w:color="B0B0B0" w:sz="1"/>
+              <w:bottom w:val="single" w:color="B0B0B0" w:sz="1"/>
+              <w:right w:val="single" w:color="B0B0B0" w:sz="1"/>
+            </w:tcBorders>
+            <w:shd w:fill="EAF1F8" w:val="clear"/>
+            <w:tcMar>
+              <w:top w:type="dxa" w:w="60"/>
+              <w:left w:type="dxa" w:w="100"/>
+              <w:bottom w:type="dxa" w:w="60"/>
+              <w:right w:type="dxa" w:w="100"/>
+            </w:tcMar>
+          </w:tcPr>
+          <w:p>
+            <w:r>
+              <w:rPr>
+                <w:sz w:val="18"/>
+                <w:szCs w:val="18"/>
+              </w:rPr>
+              <w:t xml:space="preserve">5.4</w:t>
+            </w:r>
+          </w:p>
+        </w:tc>
+        <w:tc>
+          <w:tcPr>
+            <w:tcW w:type="dxa" w:w="1450"/>
+            <w:tcBorders>
+              <w:top w:val="single" w:color="B0B0B0" w:sz="1"/>
+              <w:left w:val="single" w:color="B0B0B0" w:sz="1"/>
+              <w:bottom w:val="single" w:color="B0B0B0" w:sz="1"/>
+              <w:right w:val="single" w:color="B0B0B0" w:sz="1"/>
+            </w:tcBorders>
+            <w:shd w:fill="EAF1F8" w:val="clear"/>
+            <w:tcMar>
+              <w:top w:type="dxa" w:w="60"/>
+              <w:left w:type="dxa" w:w="100"/>
+              <w:bottom w:type="dxa" w:w="60"/>
+              <w:right w:type="dxa" w:w="100"/>
+            </w:tcMar>
+          </w:tcPr>
+          <w:p>
+            <w:r>
+              <w:rPr>
+                <w:sz w:val="18"/>
+                <w:szCs w:val="18"/>
+              </w:rPr>
+              <w:t xml:space="preserve">8</w:t>
+            </w:r>
+          </w:p>
+        </w:tc>
+        <w:tc>
+          <w:tcPr>
+            <w:tcW w:type="dxa" w:w="1800"/>
+            <w:tcBorders>
+              <w:top w:val="single" w:color="B0B0B0" w:sz="1"/>
+              <w:left w:val="single" w:color="B0B0B0" w:sz="1"/>
+              <w:bottom w:val="single" w:color="B0B0B0" w:sz="1"/>
+              <w:right w:val="single" w:color="B0B0B0" w:sz="1"/>
+            </w:tcBorders>
+            <w:shd w:fill="EAF1F8" w:val="clear"/>
+            <w:tcMar>
+              <w:top w:type="dxa" w:w="60"/>
+              <w:left w:type="dxa" w:w="100"/>
+              <w:bottom w:type="dxa" w:w="60"/>
+              <w:right w:type="dxa" w:w="100"/>
+            </w:tcMar>
+          </w:tcPr>
+          <w:p>
+            <w:r>
+              <w:rPr>
+                <w:sz w:val="18"/>
+                <w:szCs w:val="18"/>
+              </w:rPr>
+              <w:t xml:space="preserve">110</w:t>
+            </w:r>
+          </w:p>
+        </w:tc>
+      </w:tr>
+      <w:tr>
+        <w:tc>
+          <w:tcPr>
+            <w:tcW w:type="dxa" w:w="2360"/>
+            <w:tcBorders>
+              <w:top w:val="single" w:color="B0B0B0" w:sz="1"/>
+              <w:left w:val="single" w:color="B0B0B0" w:sz="1"/>
+              <w:bottom w:val="single" w:color="B0B0B0" w:sz="1"/>
+              <w:right w:val="single" w:color="B0B0B0" w:sz="1"/>
+            </w:tcBorders>
+            <w:tcMar>
+              <w:top w:type="dxa" w:w="60"/>
+              <w:left w:type="dxa" w:w="100"/>
+              <w:bottom w:type="dxa" w:w="60"/>
+              <w:right w:type="dxa" w:w="100"/>
+            </w:tcMar>
+          </w:tcPr>
+          <w:p>
+            <w:r>
+              <w:rPr>
+                <w:sz w:val="18"/>
+                <w:szCs w:val="18"/>
+              </w:rPr>
+              <w:t xml:space="preserve">Plantation BYI 264</w:t>
+            </w:r>
+          </w:p>
+        </w:tc>
+        <w:tc>
+          <w:tcPr>
+            <w:tcW w:type="dxa" w:w="1900"/>
+            <w:tcBorders>
+              <w:top w:val="single" w:color="B0B0B0" w:sz="1"/>
+              <w:left w:val="single" w:color="B0B0B0" w:sz="1"/>
+              <w:bottom w:val="single" w:color="B0B0B0" w:sz="1"/>
+              <w:right w:val="single" w:color="B0B0B0" w:sz="1"/>
+            </w:tcBorders>
+            <w:tcMar>
+              <w:top w:type="dxa" w:w="60"/>
+              <w:left w:type="dxa" w:w="100"/>
+              <w:bottom w:type="dxa" w:w="60"/>
+              <w:right w:type="dxa" w:w="100"/>
+            </w:tcMar>
+          </w:tcPr>
+          <w:p>
+            <w:r>
+              <w:rPr>
+                <w:sz w:val="18"/>
+                <w:szCs w:val="18"/>
+              </w:rPr>
+              <w:t xml:space="preserve">7</w:t>
+            </w:r>
+          </w:p>
+        </w:tc>
+        <w:tc>
+          <w:tcPr>
+            <w:tcW w:type="dxa" w:w="1850"/>
+            <w:tcBorders>
+              <w:top w:val="single" w:color="B0B0B0" w:sz="1"/>
+              <w:left w:val="single" w:color="B0B0B0" w:sz="1"/>
+              <w:bottom w:val="single" w:color="B0B0B0" w:sz="1"/>
+              <w:right w:val="single" w:color="B0B0B0" w:sz="1"/>
+            </w:tcBorders>
+            <w:tcMar>
+              <w:top w:type="dxa" w:w="60"/>
+              <w:left w:type="dxa" w:w="100"/>
+              <w:bottom w:type="dxa" w:w="60"/>
+              <w:right w:type="dxa" w:w="100"/>
+            </w:tcMar>
+          </w:tcPr>
+          <w:p>
+            <w:r>
+              <w:rPr>
+                <w:sz w:val="18"/>
+                <w:szCs w:val="18"/>
+              </w:rPr>
+              <w:t xml:space="preserve">8.1</w:t>
+            </w:r>
+          </w:p>
+        </w:tc>
+        <w:tc>
+          <w:tcPr>
+            <w:tcW w:type="dxa" w:w="1450"/>
+            <w:tcBorders>
+              <w:top w:val="single" w:color="B0B0B0" w:sz="1"/>
+              <w:left w:val="single" w:color="B0B0B0" w:sz="1"/>
+              <w:bottom w:val="single" w:color="B0B0B0" w:sz="1"/>
+              <w:right w:val="single" w:color="B0B0B0" w:sz="1"/>
+            </w:tcBorders>
+            <w:tcMar>
+              <w:top w:type="dxa" w:w="60"/>
+              <w:left w:type="dxa" w:w="100"/>
+              <w:bottom w:type="dxa" w:w="60"/>
+              <w:right w:type="dxa" w:w="100"/>
+            </w:tcMar>
+          </w:tcPr>
+          <w:p>
+            <w:r>
+              <w:rPr>
+                <w:sz w:val="18"/>
+                <w:szCs w:val="18"/>
+              </w:rPr>
+              <w:t xml:space="preserve">6</w:t>
+            </w:r>
+          </w:p>
+        </w:tc>
+        <w:tc>
+          <w:tcPr>
+            <w:tcW w:type="dxa" w:w="1800"/>
+            <w:tcBorders>
+              <w:top w:val="single" w:color="B0B0B0" w:sz="1"/>
+              <w:left w:val="single" w:color="B0B0B0" w:sz="1"/>
+              <w:bottom w:val="single" w:color="B0B0B0" w:sz="1"/>
+              <w:right w:val="single" w:color="B0B0B0" w:sz="1"/>
+            </w:tcBorders>
+            <w:tcMar>
+              <w:top w:type="dxa" w:w="60"/>
+              <w:left w:type="dxa" w:w="100"/>
+              <w:bottom w:type="dxa" w:w="60"/>
+              <w:right w:type="dxa" w:w="100"/>
+            </w:tcMar>
+          </w:tcPr>
+          <w:p>
+            <w:r>
+              <w:rPr>
+                <w:sz w:val="18"/>
+                <w:szCs w:val="18"/>
+              </w:rPr>
+              <w:t xml:space="preserve">106</w:t>
+            </w:r>
+          </w:p>
+        </w:tc>
+      </w:tr>
+      <w:tr>
+        <w:tc>
+          <w:tcPr>
+            <w:tcW w:type="dxa" w:w="2360"/>
+            <w:tcBorders>
+              <w:top w:val="single" w:color="B0B0B0" w:sz="1"/>
+              <w:left w:val="single" w:color="B0B0B0" w:sz="1"/>
+              <w:bottom w:val="single" w:color="B0B0B0" w:sz="1"/>
+              <w:right w:val="single" w:color="B0B0B0" w:sz="1"/>
+            </w:tcBorders>
+            <w:shd w:fill="EAF1F8" w:val="clear"/>
+            <w:tcMar>
+              <w:top w:type="dxa" w:w="60"/>
+              <w:left w:type="dxa" w:w="100"/>
+              <w:bottom w:type="dxa" w:w="60"/>
+              <w:right w:type="dxa" w:w="100"/>
+            </w:tcMar>
+          </w:tcPr>
+          <w:p>
+            <w:r>
+              <w:rPr>
+                <w:sz w:val="18"/>
+                <w:szCs w:val="18"/>
+              </w:rPr>
+              <w:t xml:space="preserve">Plantation BYI 450</w:t>
+            </w:r>
+          </w:p>
+        </w:tc>
+        <w:tc>
+          <w:tcPr>
+            <w:tcW w:type="dxa" w:w="1900"/>
+            <w:tcBorders>
+              <w:top w:val="single" w:color="B0B0B0" w:sz="1"/>
+              <w:left w:val="single" w:color="B0B0B0" w:sz="1"/>
+              <w:bottom w:val="single" w:color="B0B0B0" w:sz="1"/>
+              <w:right w:val="single" w:color="B0B0B0" w:sz="1"/>
+            </w:tcBorders>
+            <w:shd w:fill="EAF1F8" w:val="clear"/>
+            <w:tcMar>
+              <w:top w:type="dxa" w:w="60"/>
+              <w:left w:type="dxa" w:w="100"/>
+              <w:bottom w:type="dxa" w:w="60"/>
+              <w:right w:type="dxa" w:w="100"/>
+            </w:tcMar>
+          </w:tcPr>
+          <w:p>
+            <w:r>
+              <w:rPr>
+                <w:sz w:val="18"/>
+                <w:szCs w:val="18"/>
+              </w:rPr>
+              <w:t xml:space="preserve">7</w:t>
+            </w:r>
+          </w:p>
+        </w:tc>
+        <w:tc>
+          <w:tcPr>
+            <w:tcW w:type="dxa" w:w="1850"/>
+            <w:tcBorders>
+              <w:top w:val="single" w:color="B0B0B0" w:sz="1"/>
+              <w:left w:val="single" w:color="B0B0B0" w:sz="1"/>
+              <w:bottom w:val="single" w:color="B0B0B0" w:sz="1"/>
+              <w:right w:val="single" w:color="B0B0B0" w:sz="1"/>
+            </w:tcBorders>
+            <w:shd w:fill="EAF1F8" w:val="clear"/>
+            <w:tcMar>
+              <w:top w:type="dxa" w:w="60"/>
+              <w:left w:type="dxa" w:w="100"/>
+              <w:bottom w:type="dxa" w:w="60"/>
+              <w:right w:type="dxa" w:w="100"/>
+            </w:tcMar>
+          </w:tcPr>
+          <w:p>
+            <w:r>
+              <w:rPr>
+                <w:sz w:val="18"/>
+                <w:szCs w:val="18"/>
+              </w:rPr>
+              <w:t xml:space="preserve">10.3</w:t>
+            </w:r>
+          </w:p>
+        </w:tc>
+        <w:tc>
+          <w:tcPr>
+            <w:tcW w:type="dxa" w:w="1450"/>
+            <w:tcBorders>
+              <w:top w:val="single" w:color="B0B0B0" w:sz="1"/>
+              <w:left w:val="single" w:color="B0B0B0" w:sz="1"/>
+              <w:bottom w:val="single" w:color="B0B0B0" w:sz="1"/>
+              <w:right w:val="single" w:color="B0B0B0" w:sz="1"/>
+            </w:tcBorders>
+            <w:shd w:fill="EAF1F8" w:val="clear"/>
+            <w:tcMar>
+              <w:top w:type="dxa" w:w="60"/>
+              <w:left w:type="dxa" w:w="100"/>
+              <w:bottom w:type="dxa" w:w="60"/>
+              <w:right w:type="dxa" w:w="100"/>
+            </w:tcMar>
+          </w:tcPr>
+          <w:p>
+            <w:r>
+              <w:rPr>
+                <w:sz w:val="18"/>
+                <w:szCs w:val="18"/>
+              </w:rPr>
+              <w:t xml:space="preserve">5</w:t>
+            </w:r>
+          </w:p>
+        </w:tc>
+        <w:tc>
+          <w:tcPr>
+            <w:tcW w:type="dxa" w:w="1800"/>
+            <w:tcBorders>
+              <w:top w:val="single" w:color="B0B0B0" w:sz="1"/>
+              <w:left w:val="single" w:color="B0B0B0" w:sz="1"/>
+              <w:bottom w:val="single" w:color="B0B0B0" w:sz="1"/>
+              <w:right w:val="single" w:color="B0B0B0" w:sz="1"/>
+            </w:tcBorders>
+            <w:shd w:fill="EAF1F8" w:val="clear"/>
+            <w:tcMar>
+              <w:top w:type="dxa" w:w="60"/>
+              <w:left w:type="dxa" w:w="100"/>
+              <w:bottom w:type="dxa" w:w="60"/>
+              <w:right w:type="dxa" w:w="100"/>
+            </w:tcMar>
+          </w:tcPr>
+          <w:p>
+            <w:r>
+              <w:rPr>
+                <w:sz w:val="18"/>
+                <w:szCs w:val="18"/>
+              </w:rPr>
+              <w:t xml:space="preserve">104</w:t>
+            </w:r>
+          </w:p>
+        </w:tc>
+      </w:tr>
+    </w:tbl>
+    <w:p>
+      <w:pPr>
+        <w:spacing w:after="80" w:before="80"/>
+        <w:jc w:val="center"/>
+      </w:pPr>
+      <w:r>
+        <w:drawing>
+          <wp:inline distT="0" distB="0" distL="0" distR="0">
+            <wp:extent cx="4476750" cy="1752600"/>
+            <wp:effectExtent t="0" r="0" b="0" l="0"/>
+            <wp:docPr id="1" name="fig_mai_pai.png" descr="fig_mai_pai.png" title="fig_mai_pai.png"/>
+            <wp:cNvGraphicFramePr>
+              <a:graphicFrameLocks xmlns:a="http://schemas.openxmlformats.org/drawingml/2006/main" noChangeAspect="1"/>
+            </wp:cNvGraphicFramePr>
+            <a:graphic xmlns:a="http://schemas.openxmlformats.org/drawingml/2006/main">
+              <a:graphicData uri="http://schemas.openxmlformats.org/drawingml/2006/picture">
+                <pic:pic xmlns:pic="http://schemas.openxmlformats.org/drawingml/2006/picture">
+                  <pic:nvPicPr>
+                    <pic:cNvPr id="0" name="" descr=""/>
+                    <pic:cNvPicPr>
+                      <a:picLocks noChangeAspect="1" noChangeArrowheads="1"/>
+                    </pic:cNvPicPr>
+                  </pic:nvPicPr>
+                  <pic:blipFill>
+                    <a:blip r:embed="rId12" cstate="none"/>
+                    <a:srcRect/>
+                    <a:stretch>
+                      <a:fillRect/>
+                    </a:stretch>
+                  </pic:blipFill>
+                  <pic:spPr bwMode="auto">
+                    <a:xfrm>
+                      <a:off x="0" y="0"/>
+                      <a:ext cx="4476750" cy="1752600"/>
+                    </a:xfrm>
+                    <a:prstGeom prst="rect">
+                      <a:avLst/>
+                    </a:prstGeom>
+                  </pic:spPr>
+                </pic:pic>
+              </a:graphicData>
+            </a:graphic>
+          </wp:inline>
+        </w:drawing>
+      </w:r>
+    </w:p>
+    <w:p>
+      <w:pPr>
+        <w:spacing w:after="160"/>
+        <w:jc w:val="center"/>
+      </w:pPr>
+      <w:r>
+        <w:rPr>
+          <w:i/>
+          <w:iCs/>
+          <w:color w:val="555555"/>
+          <w:sz w:val="16"/>
+          <w:szCs w:val="16"/>
+        </w:rPr>
+        <w:t xml:space="preserve">Figure 5. PAI (thin) and MAI (bold) for natural and plantation stands by BYI; dotted lines mark MAI culmination. PAI peaks before MAI culminates in every case.</w:t>
+      </w:r>
+    </w:p>
+    <w:p>
+      <w:pPr>
+        <w:spacing w:after="120"/>
+      </w:pPr>
+      <w:r>
+        <w:t xml:space="preserve">Trends are correct: MAI peak rises with BYI (natural 4.3 to 8.2, plantation 5.4 to 10.3 m3/ha/yr), culmination occurs earlier on better sites and earlier for plantations than natural stands, and PAI peaks before MAI culminates. The absolute culmination ages are on the young side for koa (9 to 15 years natural), reflecting rapid early increment and a constant form factor (0.40) in the simple volume proxy; these should be checked against observed koa yield data and the manuscript Table 8 before being used for rotation guidance. The qualitative site and origin ordering is robust.</w:t>
       </w:r>
     </w:p>
     <w:p>

</xml_diff>

<commit_message>
Add individual-tree mortality allocation constrained to stand rate
- koa.SURV.allocate(): distributes calibrated stand mortality to trees by
  relative size (w=exp(-beta*(rDBH-1))), normalized so expf-weighted mean == the
  stand rate. Verified: realized stand mortality matches target exactly; over
  100 yr preserves SDI/TPH but raises natural QMD ~6 cm (small trees removed).
- project_psp 'calib_alloc' mode + run_alloc_test.py
- Report: survival equation block, allocation section (11.4), R-code Appendix B.
</commit_message>
<xml_diff>
--- a/fvsOL/inst/extdata/koa_stress_test/20260605_koa_FVS-HI_stress-test-report.docx
+++ b/fvsOL/inst/extdata/koa_stress_test/20260605_koa_FVS-HI_stress-test-report.docx
@@ -4725,14 +4725,99 @@
         <w:spacing w:after="120"/>
       </w:pPr>
       <w:r>
-        <w:rPr>
-          <w:i/>
-          <w:iCs/>
-        </w:rPr>
-        <w:t xml:space="preserve">mortality = base(origin) + maxlift × clamp((SDI/SDImax − 0.65) / 0.20, 0, 1),</w:t>
-      </w:r>
-      <w:r>
-        <w:t xml:space="preserve">  with base 0.005/yr natural, 0.003/yr plantation, maxlift 0.15/yr reached at 0.85 RD, capped at 0.20/yr.</w:t>
+        <w:t xml:space="preserve">Equations:</w:t>
+      </w:r>
+    </w:p>
+    <w:p>
+      <w:pPr>
+        <w:shd w:fill="F4F6F8" w:val="clear"/>
+        <w:spacing w:after="0"/>
+      </w:pPr>
+      <w:r>
+        <w:rPr>
+          <w:rFonts w:ascii="Consolas" w:cs="Consolas" w:eastAsia="Consolas" w:hAnsi="Consolas"/>
+          <w:sz w:val="17"/>
+          <w:szCs w:val="17"/>
+        </w:rPr>
+        <w:t xml:space="preserve">  SDI   = TPH * (QMD / 25)^1.6           SDImax = 500</w:t>
+      </w:r>
+    </w:p>
+    <w:p>
+      <w:pPr>
+        <w:shd w:fill="F4F6F8" w:val="clear"/>
+        <w:spacing w:after="0"/>
+      </w:pPr>
+      <w:r>
+        <w:rPr>
+          <w:rFonts w:ascii="Consolas" w:cs="Consolas" w:eastAsia="Consolas" w:hAnsi="Consolas"/>
+          <w:sz w:val="17"/>
+          <w:szCs w:val="17"/>
+        </w:rPr>
+        <w:t xml:space="preserve">  RD    = SDI / SDImax                   (relative density)</w:t>
+      </w:r>
+    </w:p>
+    <w:p>
+      <w:pPr>
+        <w:shd w:fill="F4F6F8" w:val="clear"/>
+        <w:spacing w:after="0"/>
+      </w:pPr>
+      <w:r>
+        <w:rPr>
+          <w:rFonts w:ascii="Consolas" w:cs="Consolas" w:eastAsia="Consolas" w:hAnsi="Consolas"/>
+          <w:sz w:val="17"/>
+          <w:szCs w:val="17"/>
+        </w:rPr>
+        <w:t xml:space="preserve">  f     = clamp( (RD - 0.65) / (0.85 - 0.65), 0, 1 )</w:t>
+      </w:r>
+    </w:p>
+    <w:p>
+      <w:pPr>
+        <w:shd w:fill="F4F6F8" w:val="clear"/>
+        <w:spacing w:after="0"/>
+      </w:pPr>
+      <w:r>
+        <w:rPr>
+          <w:rFonts w:ascii="Consolas" w:cs="Consolas" w:eastAsia="Consolas" w:hAnsi="Consolas"/>
+          <w:sz w:val="17"/>
+          <w:szCs w:val="17"/>
+        </w:rPr>
+        <w:t xml:space="preserve">  base  = 0.005  (natural)   or   0.003  (planted)   per year</w:t>
+      </w:r>
+    </w:p>
+    <w:p>
+      <w:pPr>
+        <w:shd w:fill="F4F6F8" w:val="clear"/>
+        <w:spacing w:after="0"/>
+      </w:pPr>
+      <w:r>
+        <w:rPr>
+          <w:rFonts w:ascii="Consolas" w:cs="Consolas" w:eastAsia="Consolas" w:hAnsi="Consolas"/>
+          <w:sz w:val="17"/>
+          <w:szCs w:val="17"/>
+        </w:rPr>
+        <w:t xml:space="preserve">  m     = min( base + 0.15 * f , 0.20 )  (annual mortality)</w:t>
+      </w:r>
+    </w:p>
+    <w:p>
+      <w:pPr>
+        <w:shd w:fill="F4F6F8" w:val="clear"/>
+        <w:spacing w:after="0"/>
+      </w:pPr>
+      <w:r>
+        <w:rPr>
+          <w:rFonts w:ascii="Consolas" w:cs="Consolas" w:eastAsia="Consolas" w:hAnsi="Consolas"/>
+          <w:sz w:val="17"/>
+          <w:szCs w:val="17"/>
+        </w:rPr>
+        <w:t xml:space="preserve">  S     = 1 - m                          (annual survival)</w:t>
+      </w:r>
+    </w:p>
+    <w:p>
+      <w:pPr>
+        <w:spacing w:after="120"/>
+      </w:pPr>
+      <w:r>
+        <w:t xml:space="preserve">Mortality is the origin background (0.5%/yr natural, 0.3%/yr planted) below 0.65 RD, increases linearly to about 15.5%/yr at 0.85 RD, and plateaus above (capped at 20%/yr). BYI does not appear; it acts through growth. Full R code in Appendix B.</w:t>
       </w:r>
     </w:p>
     <w:p>
@@ -5676,7 +5761,101 @@
         <w:pStyle w:val="Heading2"/>
       </w:pPr>
       <w:r>
-        <w:t xml:space="preserve">11.4 Volume increment: PAI and MAI culmination</w:t>
+        <w:t xml:space="preserve">11.4 Allocating stand mortality to individual trees</w:t>
+      </w:r>
+    </w:p>
+    <w:p>
+      <w:pPr>
+        <w:spacing w:after="120"/>
+      </w:pPr>
+      <w:r>
+        <w:t xml:space="preserve">The calibrated rate is a stand (density) mortality. To make self-thinning size-realistic for individual-tree FVS output while keeping the validated stand trajectory, the stand rate is allocated to trees by relative size and constrained so the expansion-factor-weighted mean equals the stand rate:</w:t>
+      </w:r>
+    </w:p>
+    <w:p>
+      <w:pPr>
+        <w:shd w:fill="F4F6F8" w:val="clear"/>
+        <w:spacing w:after="0"/>
+      </w:pPr>
+      <w:r>
+        <w:rPr>
+          <w:rFonts w:ascii="Consolas" w:cs="Consolas" w:eastAsia="Consolas" w:hAnsi="Consolas"/>
+          <w:sz w:val="17"/>
+          <w:szCs w:val="17"/>
+        </w:rPr>
+        <w:t xml:space="preserve">  m_stand = 1 - S_annual            (calibrated stand mortality)</w:t>
+      </w:r>
+    </w:p>
+    <w:p>
+      <w:pPr>
+        <w:shd w:fill="F4F6F8" w:val="clear"/>
+        <w:spacing w:after="0"/>
+      </w:pPr>
+      <w:r>
+        <w:rPr>
+          <w:rFonts w:ascii="Consolas" w:cs="Consolas" w:eastAsia="Consolas" w:hAnsi="Consolas"/>
+          <w:sz w:val="17"/>
+          <w:szCs w:val="17"/>
+        </w:rPr>
+        <w:t xml:space="preserve">  rDBH_i  = dbh_i / QMD</w:t>
+      </w:r>
+    </w:p>
+    <w:p>
+      <w:pPr>
+        <w:shd w:fill="F4F6F8" w:val="clear"/>
+        <w:spacing w:after="0"/>
+      </w:pPr>
+      <w:r>
+        <w:rPr>
+          <w:rFonts w:ascii="Consolas" w:cs="Consolas" w:eastAsia="Consolas" w:hAnsi="Consolas"/>
+          <w:sz w:val="17"/>
+          <w:szCs w:val="17"/>
+        </w:rPr>
+        <w:t xml:space="preserve">  w_i     = exp( -beta * (rDBH_i - 1) )   beta = 3</w:t>
+      </w:r>
+    </w:p>
+    <w:p>
+      <w:pPr>
+        <w:shd w:fill="F4F6F8" w:val="clear"/>
+        <w:spacing w:after="0"/>
+      </w:pPr>
+      <w:r>
+        <w:rPr>
+          <w:rFonts w:ascii="Consolas" w:cs="Consolas" w:eastAsia="Consolas" w:hAnsi="Consolas"/>
+          <w:sz w:val="17"/>
+          <w:szCs w:val="17"/>
+        </w:rPr>
+        <w:t xml:space="preserve">  p_i     = clamp( m_stand * w_i / mean_expf(w) , 0, 0.95 )</w:t>
+      </w:r>
+    </w:p>
+    <w:p>
+      <w:pPr>
+        <w:shd w:fill="F4F6F8" w:val="clear"/>
+        <w:spacing w:after="0"/>
+      </w:pPr>
+      <w:r>
+        <w:rPr>
+          <w:rFonts w:ascii="Consolas" w:cs="Consolas" w:eastAsia="Consolas" w:hAnsi="Consolas"/>
+          <w:sz w:val="17"/>
+          <w:szCs w:val="17"/>
+        </w:rPr>
+        <w:t xml:space="preserve">  removed = sum_i expf_i * p_i  ==  m_stand * sum_i expf_i   (constraint)</w:t>
+      </w:r>
+    </w:p>
+    <w:p>
+      <w:pPr>
+        <w:spacing w:after="120"/>
+      </w:pPr>
+      <w:r>
+        <w:t xml:space="preserve">Suppressed trees (rDBH below 1) get above-average mortality and dominant trees below-average, but the expansion-factor-weighted mean is held at the stand rate, so the density trajectory is unchanged by construction. Verified: realized stand mortality equals the calibrated target exactly (natural 0.0050/yr, plantation 0.0903/yr at the tested densities). Over 100 years the allocation preserves SDI and density but raises natural QMD from 59.9 to 66.5 cm by removing small trees first (plantations are at the 60 cm cap, so unchanged). This is the recommended option for per-tree output; the constants beta and the stand rate are the only knobs.</w:t>
+      </w:r>
+    </w:p>
+    <w:p>
+      <w:pPr>
+        <w:pStyle w:val="Heading2"/>
+      </w:pPr>
+      <w:r>
+        <w:t xml:space="preserve">11.5 Volume increment: PAI and MAI culmination</w:t>
       </w:r>
     </w:p>
     <w:p>
@@ -6884,7 +7063,7 @@
         <w:pStyle w:val="Heading1"/>
       </w:pPr>
       <w:r>
-        <w:t xml:space="preserve">Appendix: reproduce</w:t>
+        <w:t xml:space="preserve">Appendix A: reproduce</w:t>
       </w:r>
     </w:p>
     <w:p>
@@ -6892,7 +7071,1004 @@
         <w:spacing w:after="120"/>
       </w:pPr>
       <w:r>
-        <w:t xml:space="preserve">Branch koa-stress-test, folder fvsOL/inst/extdata/koa_stress_test: Rscript fidelity_check.R (port check); python3 run_stress_comprehensive.py (this report); python3 run_cfi.py (CFI validation). Python needs numpy, pandas, matplotlib; R needs no packages.</w:t>
+        <w:t xml:space="preserve">Branch koa-stress-test, folder fvsOL/inst/extdata/koa_stress_test: Rscript fidelity_check.R (port check); python3 run_stress_comprehensive.py; python3 run_final_longterm.py (200-yr stress test); python3 run_mai_pai.py; python3 run_cfi.py. Python needs numpy, pandas, matplotlib; R needs no packages.</w:t>
+      </w:r>
+    </w:p>
+    <w:p>
+      <w:pPr>
+        <w:pStyle w:val="Heading1"/>
+        <w:pageBreakBefore/>
+      </w:pPr>
+      <w:r>
+        <w:t xml:space="preserve">Appendix B: koa_survival_calibrated.R</w:t>
+      </w:r>
+    </w:p>
+    <w:p>
+      <w:pPr>
+        <w:spacing w:after="120"/>
+      </w:pPr>
+      <w:r>
+        <w:t xml:space="preserve">Drop-in survival code (replaces the published cloglog in HiGy.R calc_mortality):</w:t>
+      </w:r>
+    </w:p>
+    <w:p>
+      <w:pPr>
+        <w:shd w:fill="F4F6F8" w:val="clear"/>
+        <w:spacing w:after="0"/>
+      </w:pPr>
+      <w:r>
+        <w:rPr>
+          <w:rFonts w:ascii="Consolas" w:cs="Consolas" w:eastAsia="Consolas" w:hAnsi="Consolas"/>
+          <w:sz w:val="17"/>
+          <w:szCs w:val="17"/>
+        </w:rPr>
+        <w:t xml:space="preserve"># koa_survival_calibrated.R   (tuned 2026-06-05)</w:t>
+      </w:r>
+    </w:p>
+    <w:p>
+      <w:pPr>
+        <w:shd w:fill="F4F6F8" w:val="clear"/>
+        <w:spacing w:after="0"/>
+      </w:pPr>
+      <w:r>
+        <w:rPr>
+          <w:rFonts w:ascii="Consolas" w:cs="Consolas" w:eastAsia="Consolas" w:hAnsi="Consolas"/>
+          <w:sz w:val="17"/>
+          <w:szCs w:val="17"/>
+        </w:rPr>
+        <w:t xml:space="preserve"># Recommended operational survival for FVS-HI koa, to REPLACE the published</w:t>
+      </w:r>
+    </w:p>
+    <w:p>
+      <w:pPr>
+        <w:shd w:fill="F4F6F8" w:val="clear"/>
+        <w:spacing w:after="0"/>
+      </w:pPr>
+      <w:r>
+        <w:rPr>
+          <w:rFonts w:ascii="Consolas" w:cs="Consolas" w:eastAsia="Consolas" w:hAnsi="Consolas"/>
+          <w:sz w:val="17"/>
+          <w:szCs w:val="17"/>
+        </w:rPr>
+        <w:t xml:space="preserve"># cloglog (surv.parm / surv_prob) in HiGy.R.</w:t>
+      </w:r>
+    </w:p>
+    <w:p>
+      <w:pPr>
+        <w:shd w:fill="F4F6F8" w:val="clear"/>
+        <w:spacing w:after="0"/>
+      </w:pPr>
+      <w:r>
+        <w:rPr>
+          <w:rFonts w:ascii="Consolas" w:cs="Consolas" w:eastAsia="Consolas" w:hAnsi="Consolas"/>
+          <w:sz w:val="17"/>
+          <w:szCs w:val="17"/>
+        </w:rPr>
+        <w:t xml:space="preserve">#</w:t>
+      </w:r>
+    </w:p>
+    <w:p>
+      <w:pPr>
+        <w:shd w:fill="F4F6F8" w:val="clear"/>
+        <w:spacing w:after="0"/>
+      </w:pPr>
+      <w:r>
+        <w:rPr>
+          <w:rFonts w:ascii="Consolas" w:cs="Consolas" w:eastAsia="Consolas" w:hAnsi="Consolas"/>
+          <w:sz w:val="17"/>
+          <w:szCs w:val="17"/>
+        </w:rPr>
+        <w:t xml:space="preserve"># WHY NOT A FITTED GLM. The published per-tree cloglog discriminates well</w:t>
+      </w:r>
+    </w:p>
+    <w:p>
+      <w:pPr>
+        <w:shd w:fill="F4F6F8" w:val="clear"/>
+        <w:spacing w:after="0"/>
+      </w:pPr>
+      <w:r>
+        <w:rPr>
+          <w:rFonts w:ascii="Consolas" w:cs="Consolas" w:eastAsia="Consolas" w:hAnsi="Consolas"/>
+          <w:sz w:val="17"/>
+          <w:szCs w:val="17"/>
+        </w:rPr>
+        <w:t xml:space="preserve"># (AUC 0.95) but is numerically unstable applied per tree (annual survival 0.80</w:t>
+      </w:r>
+    </w:p>
+    <w:p>
+      <w:pPr>
+        <w:shd w:fill="F4F6F8" w:val="clear"/>
+        <w:spacing w:after="0"/>
+      </w:pPr>
+      <w:r>
+        <w:rPr>
+          <w:rFonts w:ascii="Consolas" w:cs="Consolas" w:eastAsia="Consolas" w:hAnsi="Consolas"/>
+          <w:sz w:val="17"/>
+          <w:szCs w:val="17"/>
+        </w:rPr>
+        <w:t xml:space="preserve"># at CR 0.5, ~0 at CR 0.7) and collapses real stands, especially plantations.</w:t>
+      </w:r>
+    </w:p>
+    <w:p>
+      <w:pPr>
+        <w:shd w:fill="F4F6F8" w:val="clear"/>
+        <w:spacing w:after="0"/>
+      </w:pPr>
+      <w:r>
+        <w:rPr>
+          <w:rFonts w:ascii="Consolas" w:cs="Consolas" w:eastAsia="Consolas" w:hAnsi="Consolas"/>
+          <w:sz w:val="17"/>
+          <w:szCs w:val="17"/>
+        </w:rPr>
+        <w:t xml:space="preserve"># Data diagnostics (tune_survival.R) show the survival signal cannot support a</w:t>
+      </w:r>
+    </w:p>
+    <w:p>
+      <w:pPr>
+        <w:shd w:fill="F4F6F8" w:val="clear"/>
+        <w:spacing w:after="0"/>
+      </w:pPr>
+      <w:r>
+        <w:rPr>
+          <w:rFonts w:ascii="Consolas" w:cs="Consolas" w:eastAsia="Consolas" w:hAnsi="Consolas"/>
+          <w:sz w:val="17"/>
+          <w:szCs w:val="17"/>
+        </w:rPr>
+        <w:t xml:space="preserve"># free per-tree GLM: only 280 deaths; mortality is lowest in small trees</w:t>
+      </w:r>
+    </w:p>
+    <w:p>
+      <w:pPr>
+        <w:shd w:fill="F4F6F8" w:val="clear"/>
+        <w:spacing w:after="0"/>
+      </w:pPr>
+      <w:r>
+        <w:rPr>
+          <w:rFonts w:ascii="Consolas" w:cs="Consolas" w:eastAsia="Consolas" w:hAnsi="Consolas"/>
+          <w:sz w:val="17"/>
+          <w:szCs w:val="17"/>
+        </w:rPr>
+        <w:t xml:space="preserve"># (0-5 cm: 0.04%/yr) not highest; and the apparent BYI effect is an artifact of</w:t>
+      </w:r>
+    </w:p>
+    <w:p>
+      <w:pPr>
+        <w:shd w:fill="F4F6F8" w:val="clear"/>
+        <w:spacing w:after="0"/>
+      </w:pPr>
+      <w:r>
+        <w:rPr>
+          <w:rFonts w:ascii="Consolas" w:cs="Consolas" w:eastAsia="Consolas" w:hAnsi="Consolas"/>
+          <w:sz w:val="17"/>
+          <w:szCs w:val="17"/>
+        </w:rPr>
+        <w:t xml:space="preserve"># ONE cluster of high-BYI natural plots (BYI&gt;408: 3.3%/yr vs ~0.15% otherwise),</w:t>
+      </w:r>
+    </w:p>
+    <w:p>
+      <w:pPr>
+        <w:shd w:fill="F4F6F8" w:val="clear"/>
+        <w:spacing w:after="0"/>
+      </w:pPr>
+      <w:r>
+        <w:rPr>
+          <w:rFonts w:ascii="Consolas" w:cs="Consolas" w:eastAsia="Consolas" w:hAnsi="Consolas"/>
+          <w:sz w:val="17"/>
+          <w:szCs w:val="17"/>
+        </w:rPr>
+        <w:t xml:space="preserve"># a cluster that contains no plantations, so a BYI mortality effect cannot even</w:t>
+      </w:r>
+    </w:p>
+    <w:p>
+      <w:pPr>
+        <w:shd w:fill="F4F6F8" w:val="clear"/>
+        <w:spacing w:after="0"/>
+      </w:pPr>
+      <w:r>
+        <w:rPr>
+          <w:rFonts w:ascii="Consolas" w:cs="Consolas" w:eastAsia="Consolas" w:hAnsi="Consolas"/>
+          <w:sz w:val="17"/>
+          <w:szCs w:val="17"/>
+        </w:rPr>
+        <w:t xml:space="preserve"># be estimated for plantations. Forcing BYI into a GLM yields absurd, unstable</w:t>
+      </w:r>
+    </w:p>
+    <w:p>
+      <w:pPr>
+        <w:shd w:fill="F4F6F8" w:val="clear"/>
+        <w:spacing w:after="0"/>
+      </w:pPr>
+      <w:r>
+        <w:rPr>
+          <w:rFonts w:ascii="Consolas" w:cs="Consolas" w:eastAsia="Consolas" w:hAnsi="Consolas"/>
+          <w:sz w:val="17"/>
+          <w:szCs w:val="17"/>
+        </w:rPr>
+        <w:t xml:space="preserve"># rate ratios (~890x per log unit).</w:t>
+      </w:r>
+    </w:p>
+    <w:p>
+      <w:pPr>
+        <w:shd w:fill="F4F6F8" w:val="clear"/>
+        <w:spacing w:after="0"/>
+      </w:pPr>
+      <w:r>
+        <w:rPr>
+          <w:rFonts w:ascii="Consolas" w:cs="Consolas" w:eastAsia="Consolas" w:hAnsi="Consolas"/>
+          <w:sz w:val="17"/>
+          <w:szCs w:val="17"/>
+        </w:rPr>
+        <w:t xml:space="preserve">#</w:t>
+      </w:r>
+    </w:p>
+    <w:p>
+      <w:pPr>
+        <w:shd w:fill="F4F6F8" w:val="clear"/>
+        <w:spacing w:after="0"/>
+      </w:pPr>
+      <w:r>
+        <w:rPr>
+          <w:rFonts w:ascii="Consolas" w:cs="Consolas" w:eastAsia="Consolas" w:hAnsi="Consolas"/>
+          <w:sz w:val="17"/>
+          <w:szCs w:val="17"/>
+        </w:rPr>
+        <w:t xml:space="preserve"># DESIGN. Annual mortality = a low density-independent background that differs</w:t>
+      </w:r>
+    </w:p>
+    <w:p>
+      <w:pPr>
+        <w:shd w:fill="F4F6F8" w:val="clear"/>
+        <w:spacing w:after="0"/>
+      </w:pPr>
+      <w:r>
+        <w:rPr>
+          <w:rFonts w:ascii="Consolas" w:cs="Consolas" w:eastAsia="Consolas" w:hAnsi="Consolas"/>
+          <w:sz w:val="17"/>
+          <w:szCs w:val="17"/>
+        </w:rPr>
+        <w:t xml:space="preserve"># by origin (plantations lower, as observed) PLUS a density-dependent</w:t>
+      </w:r>
+    </w:p>
+    <w:p>
+      <w:pPr>
+        <w:shd w:fill="F4F6F8" w:val="clear"/>
+        <w:spacing w:after="0"/>
+      </w:pPr>
+      <w:r>
+        <w:rPr>
+          <w:rFonts w:ascii="Consolas" w:cs="Consolas" w:eastAsia="Consolas" w:hAnsi="Consolas"/>
+          <w:sz w:val="17"/>
+          <w:szCs w:val="17"/>
+        </w:rPr>
+        <w:t xml:space="preserve"># self-thinning term that starts at 0.65 relative density (SDI/SDImax), increases</w:t>
+      </w:r>
+    </w:p>
+    <w:p>
+      <w:pPr>
+        <w:shd w:fill="F4F6F8" w:val="clear"/>
+        <w:spacing w:after="0"/>
+      </w:pPr>
+      <w:r>
+        <w:rPr>
+          <w:rFonts w:ascii="Consolas" w:cs="Consolas" w:eastAsia="Consolas" w:hAnsi="Consolas"/>
+          <w:sz w:val="17"/>
+          <w:szCs w:val="17"/>
+        </w:rPr>
+        <w:t xml:space="preserve"># LINEARLY to a maximum lift at 0.85 RD, and plateaus above. BYI is deliberately</w:t>
+      </w:r>
+    </w:p>
+    <w:p>
+      <w:pPr>
+        <w:shd w:fill="F4F6F8" w:val="clear"/>
+        <w:spacing w:after="0"/>
+      </w:pPr>
+      <w:r>
+        <w:rPr>
+          <w:rFonts w:ascii="Consolas" w:cs="Consolas" w:eastAsia="Consolas" w:hAnsi="Consolas"/>
+          <w:sz w:val="17"/>
+          <w:szCs w:val="17"/>
+        </w:rPr>
+        <w:t xml:space="preserve"># NOT a direct mortality driver; it influences long-term density correctly</w:t>
+      </w:r>
+    </w:p>
+    <w:p>
+      <w:pPr>
+        <w:shd w:fill="F4F6F8" w:val="clear"/>
+        <w:spacing w:after="0"/>
+      </w:pPr>
+      <w:r>
+        <w:rPr>
+          <w:rFonts w:ascii="Consolas" w:cs="Consolas" w:eastAsia="Consolas" w:hAnsi="Consolas"/>
+          <w:sz w:val="17"/>
+          <w:szCs w:val="17"/>
+        </w:rPr>
+        <w:t xml:space="preserve"># through GROWTH (higher BYI reaches the self-thinning boundary sooner). Verified</w:t>
+      </w:r>
+    </w:p>
+    <w:p>
+      <w:pPr>
+        <w:shd w:fill="F4F6F8" w:val="clear"/>
+        <w:spacing w:after="0"/>
+      </w:pPr>
+      <w:r>
+        <w:rPr>
+          <w:rFonts w:ascii="Consolas" w:cs="Consolas" w:eastAsia="Consolas" w:hAnsi="Consolas"/>
+          <w:sz w:val="17"/>
+          <w:szCs w:val="17"/>
+        </w:rPr>
+        <w:t xml:space="preserve"># on 200-year projections across origin and BYI: SDI peaks at 72 to 88% of</w:t>
+      </w:r>
+    </w:p>
+    <w:p>
+      <w:pPr>
+        <w:shd w:fill="F4F6F8" w:val="clear"/>
+        <w:spacing w:after="0"/>
+      </w:pPr>
+      <w:r>
+        <w:rPr>
+          <w:rFonts w:ascii="Consolas" w:cs="Consolas" w:eastAsia="Consolas" w:hAnsi="Consolas"/>
+          <w:sz w:val="17"/>
+          <w:szCs w:val="17"/>
+        </w:rPr>
+        <w:t xml:space="preserve"># SDImax then tracks the self-thinning line (no runaway, no collapse, QMD</w:t>
+      </w:r>
+    </w:p>
+    <w:p>
+      <w:pPr>
+        <w:shd w:fill="F4F6F8" w:val="clear"/>
+        <w:spacing w:after="0"/>
+      </w:pPr>
+      <w:r>
+        <w:rPr>
+          <w:rFonts w:ascii="Consolas" w:cs="Consolas" w:eastAsia="Consolas" w:hAnsi="Consolas"/>
+          <w:sz w:val="17"/>
+          <w:szCs w:val="17"/>
+        </w:rPr>
+        <w:t xml:space="preserve"># monotonic); natural QMD approaches ~90 cm, plantations plateau at the 60 cm cap.</w:t>
+      </w:r>
+    </w:p>
+    <w:p>
+      <w:pPr>
+        <w:shd w:fill="F4F6F8" w:val="clear"/>
+        <w:spacing w:after="0"/>
+      </w:pPr>
+      <w:r>
+        <w:rPr>
+          <w:rFonts w:ascii="Consolas" w:cs="Consolas" w:eastAsia="Consolas" w:hAnsi="Consolas"/>
+          <w:sz w:val="17"/>
+          <w:szCs w:val="17"/>
+        </w:rPr>
+        <w:t xml:space="preserve">#</w:t>
+      </w:r>
+    </w:p>
+    <w:p>
+      <w:pPr>
+        <w:shd w:fill="F4F6F8" w:val="clear"/>
+        <w:spacing w:after="0"/>
+      </w:pPr>
+      <w:r>
+        <w:rPr>
+          <w:rFonts w:ascii="Consolas" w:cs="Consolas" w:eastAsia="Consolas" w:hAnsi="Consolas"/>
+          <w:sz w:val="17"/>
+          <w:szCs w:val="17"/>
+        </w:rPr>
+        <w:t xml:space="preserve"># Inputs (metric): sdi (stand SDI), baph m2/ha (fallback if sdi missing),</w:t>
+      </w:r>
+    </w:p>
+    <w:p>
+      <w:pPr>
+        <w:shd w:fill="F4F6F8" w:val="clear"/>
+        <w:spacing w:after="0"/>
+      </w:pPr>
+      <w:r>
+        <w:rPr>
+          <w:rFonts w:ascii="Consolas" w:cs="Consolas" w:eastAsia="Consolas" w:hAnsi="Consolas"/>
+          <w:sz w:val="17"/>
+          <w:szCs w:val="17"/>
+        </w:rPr>
+        <w:t xml:space="preserve"># planted 0/1.</w:t>
+      </w:r>
+    </w:p>
+    <w:p>
+      <w:pPr>
+        <w:shd w:fill="F4F6F8" w:val="clear"/>
+        <w:spacing w:after="0"/>
+      </w:pPr>
+      <w:r>
+        <w:rPr>
+          <w:rFonts w:ascii="Consolas" w:cs="Consolas" w:eastAsia="Consolas" w:hAnsi="Consolas"/>
+          <w:sz w:val="17"/>
+          <w:szCs w:val="17"/>
+        </w:rPr>
+        <w:t xml:space="preserve"> </w:t>
+      </w:r>
+    </w:p>
+    <w:p>
+      <w:pPr>
+        <w:shd w:fill="F4F6F8" w:val="clear"/>
+        <w:spacing w:after="0"/>
+      </w:pPr>
+      <w:r>
+        <w:rPr>
+          <w:rFonts w:ascii="Consolas" w:cs="Consolas" w:eastAsia="Consolas" w:hAnsi="Consolas"/>
+          <w:sz w:val="17"/>
+          <w:szCs w:val="17"/>
+        </w:rPr>
+        <w:t xml:space="preserve">koa.SURV.calibrated &lt;- function(sdi = NA, baph = NA, planted = 0,</w:t>
+      </w:r>
+    </w:p>
+    <w:p>
+      <w:pPr>
+        <w:shd w:fill="F4F6F8" w:val="clear"/>
+        <w:spacing w:after="0"/>
+      </w:pPr>
+      <w:r>
+        <w:rPr>
+          <w:rFonts w:ascii="Consolas" w:cs="Consolas" w:eastAsia="Consolas" w:hAnsi="Consolas"/>
+          <w:sz w:val="17"/>
+          <w:szCs w:val="17"/>
+        </w:rPr>
+        <w:t xml:space="preserve">                                base_nat = 0.005, base_plt = 0.003,</w:t>
+      </w:r>
+    </w:p>
+    <w:p>
+      <w:pPr>
+        <w:shd w:fill="F4F6F8" w:val="clear"/>
+        <w:spacing w:after="0"/>
+      </w:pPr>
+      <w:r>
+        <w:rPr>
+          <w:rFonts w:ascii="Consolas" w:cs="Consolas" w:eastAsia="Consolas" w:hAnsi="Consolas"/>
+          <w:sz w:val="17"/>
+          <w:szCs w:val="17"/>
+        </w:rPr>
+        <w:t xml:space="preserve">                                SDImax = 500, onset = 0.65, full = 0.85,</w:t>
+      </w:r>
+    </w:p>
+    <w:p>
+      <w:pPr>
+        <w:shd w:fill="F4F6F8" w:val="clear"/>
+        <w:spacing w:after="0"/>
+      </w:pPr>
+      <w:r>
+        <w:rPr>
+          <w:rFonts w:ascii="Consolas" w:cs="Consolas" w:eastAsia="Consolas" w:hAnsi="Consolas"/>
+          <w:sz w:val="17"/>
+          <w:szCs w:val="17"/>
+        </w:rPr>
+        <w:t xml:space="preserve">                                maxlift = 0.15, mort_max = 0.20) {</w:t>
+      </w:r>
+    </w:p>
+    <w:p>
+      <w:pPr>
+        <w:shd w:fill="F4F6F8" w:val="clear"/>
+        <w:spacing w:after="0"/>
+      </w:pPr>
+      <w:r>
+        <w:rPr>
+          <w:rFonts w:ascii="Consolas" w:cs="Consolas" w:eastAsia="Consolas" w:hAnsi="Consolas"/>
+          <w:sz w:val="17"/>
+          <w:szCs w:val="17"/>
+        </w:rPr>
+        <w:t xml:space="preserve">  RD   &lt;- if (!is.na(sdi)) sdi / SDImax else baph / 60          # relative density</w:t>
+      </w:r>
+    </w:p>
+    <w:p>
+      <w:pPr>
+        <w:shd w:fill="F4F6F8" w:val="clear"/>
+        <w:spacing w:after="0"/>
+      </w:pPr>
+      <w:r>
+        <w:rPr>
+          <w:rFonts w:ascii="Consolas" w:cs="Consolas" w:eastAsia="Consolas" w:hAnsi="Consolas"/>
+          <w:sz w:val="17"/>
+          <w:szCs w:val="17"/>
+        </w:rPr>
+        <w:t xml:space="preserve">  base &lt;- ifelse(planted == 1, base_plt, base_nat)</w:t>
+      </w:r>
+    </w:p>
+    <w:p>
+      <w:pPr>
+        <w:shd w:fill="F4F6F8" w:val="clear"/>
+        <w:spacing w:after="0"/>
+      </w:pPr>
+      <w:r>
+        <w:rPr>
+          <w:rFonts w:ascii="Consolas" w:cs="Consolas" w:eastAsia="Consolas" w:hAnsi="Consolas"/>
+          <w:sz w:val="17"/>
+          <w:szCs w:val="17"/>
+        </w:rPr>
+        <w:t xml:space="preserve">  frac &lt;- pmin(pmax((RD - onset) / (full - onset), 0), 1)       # 0 at .65, 1 at .85+</w:t>
+      </w:r>
+    </w:p>
+    <w:p>
+      <w:pPr>
+        <w:shd w:fill="F4F6F8" w:val="clear"/>
+        <w:spacing w:after="0"/>
+      </w:pPr>
+      <w:r>
+        <w:rPr>
+          <w:rFonts w:ascii="Consolas" w:cs="Consolas" w:eastAsia="Consolas" w:hAnsi="Consolas"/>
+          <w:sz w:val="17"/>
+          <w:szCs w:val="17"/>
+        </w:rPr>
+        <w:t xml:space="preserve">  mort &lt;- pmin(pmax(base + maxlift * frac, 0), mort_max)        # annual mortality</w:t>
+      </w:r>
+    </w:p>
+    <w:p>
+      <w:pPr>
+        <w:shd w:fill="F4F6F8" w:val="clear"/>
+        <w:spacing w:after="0"/>
+      </w:pPr>
+      <w:r>
+        <w:rPr>
+          <w:rFonts w:ascii="Consolas" w:cs="Consolas" w:eastAsia="Consolas" w:hAnsi="Consolas"/>
+          <w:sz w:val="17"/>
+          <w:szCs w:val="17"/>
+        </w:rPr>
+        <w:t xml:space="preserve">  1 - mort                                                      # annual survival</w:t>
+      </w:r>
+    </w:p>
+    <w:p>
+      <w:pPr>
+        <w:shd w:fill="F4F6F8" w:val="clear"/>
+        <w:spacing w:after="0"/>
+      </w:pPr>
+      <w:r>
+        <w:rPr>
+          <w:rFonts w:ascii="Consolas" w:cs="Consolas" w:eastAsia="Consolas" w:hAnsi="Consolas"/>
+          <w:sz w:val="17"/>
+          <w:szCs w:val="17"/>
+        </w:rPr>
+        <w:t xml:space="preserve">}</w:t>
+      </w:r>
+    </w:p>
+    <w:p>
+      <w:pPr>
+        <w:shd w:fill="F4F6F8" w:val="clear"/>
+        <w:spacing w:after="0"/>
+      </w:pPr>
+      <w:r>
+        <w:rPr>
+          <w:rFonts w:ascii="Consolas" w:cs="Consolas" w:eastAsia="Consolas" w:hAnsi="Consolas"/>
+          <w:sz w:val="17"/>
+          <w:szCs w:val="17"/>
+        </w:rPr>
+        <w:t xml:space="preserve"> </w:t>
+      </w:r>
+    </w:p>
+    <w:p>
+      <w:pPr>
+        <w:shd w:fill="F4F6F8" w:val="clear"/>
+        <w:spacing w:after="0"/>
+      </w:pPr>
+      <w:r>
+        <w:rPr>
+          <w:rFonts w:ascii="Consolas" w:cs="Consolas" w:eastAsia="Consolas" w:hAnsi="Consolas"/>
+          <w:sz w:val="17"/>
+          <w:szCs w:val="17"/>
+        </w:rPr>
+        <w:t xml:space="preserve"># ---- Allocate the stand mortality rate to individual trees -------------------</w:t>
+      </w:r>
+    </w:p>
+    <w:p>
+      <w:pPr>
+        <w:shd w:fill="F4F6F8" w:val="clear"/>
+        <w:spacing w:after="0"/>
+      </w:pPr>
+      <w:r>
+        <w:rPr>
+          <w:rFonts w:ascii="Consolas" w:cs="Consolas" w:eastAsia="Consolas" w:hAnsi="Consolas"/>
+          <w:sz w:val="17"/>
+          <w:szCs w:val="17"/>
+        </w:rPr>
+        <w:t xml:space="preserve"># Distributes the calibrated STAND annual mortality across trees by relative</w:t>
+      </w:r>
+    </w:p>
+    <w:p>
+      <w:pPr>
+        <w:shd w:fill="F4F6F8" w:val="clear"/>
+        <w:spacing w:after="0"/>
+      </w:pPr>
+      <w:r>
+        <w:rPr>
+          <w:rFonts w:ascii="Consolas" w:cs="Consolas" w:eastAsia="Consolas" w:hAnsi="Consolas"/>
+          <w:sz w:val="17"/>
+          <w:szCs w:val="17"/>
+        </w:rPr>
+        <w:t xml:space="preserve"># size (suppressed trees die first), CONSTRAINED so the expansion-factor-weighted</w:t>
+      </w:r>
+    </w:p>
+    <w:p>
+      <w:pPr>
+        <w:shd w:fill="F4F6F8" w:val="clear"/>
+        <w:spacing w:after="0"/>
+      </w:pPr>
+      <w:r>
+        <w:rPr>
+          <w:rFonts w:ascii="Consolas" w:cs="Consolas" w:eastAsia="Consolas" w:hAnsi="Consolas"/>
+          <w:sz w:val="17"/>
+          <w:szCs w:val="17"/>
+        </w:rPr>
+        <w:t xml:space="preserve"># mean per-tree mortality equals the stand rate. This keeps the validated</w:t>
+      </w:r>
+    </w:p>
+    <w:p>
+      <w:pPr>
+        <w:shd w:fill="F4F6F8" w:val="clear"/>
+        <w:spacing w:after="0"/>
+      </w:pPr>
+      <w:r>
+        <w:rPr>
+          <w:rFonts w:ascii="Consolas" w:cs="Consolas" w:eastAsia="Consolas" w:hAnsi="Consolas"/>
+          <w:sz w:val="17"/>
+          <w:szCs w:val="17"/>
+        </w:rPr>
+        <w:t xml:space="preserve"># stand-level density trajectory while making self-thinning size-realistic</w:t>
+      </w:r>
+    </w:p>
+    <w:p>
+      <w:pPr>
+        <w:shd w:fill="F4F6F8" w:val="clear"/>
+        <w:spacing w:after="0"/>
+      </w:pPr>
+      <w:r>
+        <w:rPr>
+          <w:rFonts w:ascii="Consolas" w:cs="Consolas" w:eastAsia="Consolas" w:hAnsi="Consolas"/>
+          <w:sz w:val="17"/>
+          <w:szCs w:val="17"/>
+        </w:rPr>
+        <w:t xml:space="preserve"># (verified: realized stand mortality matches target exactly; over 100 yr it</w:t>
+      </w:r>
+    </w:p>
+    <w:p>
+      <w:pPr>
+        <w:shd w:fill="F4F6F8" w:val="clear"/>
+        <w:spacing w:after="0"/>
+      </w:pPr>
+      <w:r>
+        <w:rPr>
+          <w:rFonts w:ascii="Consolas" w:cs="Consolas" w:eastAsia="Consolas" w:hAnsi="Consolas"/>
+          <w:sz w:val="17"/>
+          <w:szCs w:val="17"/>
+        </w:rPr>
+        <w:t xml:space="preserve"># preserves SDI/TPH but raises natural QMD ~6 cm by removing small trees).</w:t>
+      </w:r>
+    </w:p>
+    <w:p>
+      <w:pPr>
+        <w:shd w:fill="F4F6F8" w:val="clear"/>
+        <w:spacing w:after="0"/>
+      </w:pPr>
+      <w:r>
+        <w:rPr>
+          <w:rFonts w:ascii="Consolas" w:cs="Consolas" w:eastAsia="Consolas" w:hAnsi="Consolas"/>
+          <w:sz w:val="17"/>
+          <w:szCs w:val="17"/>
+        </w:rPr>
+        <w:t xml:space="preserve">#</w:t>
+      </w:r>
+    </w:p>
+    <w:p>
+      <w:pPr>
+        <w:shd w:fill="F4F6F8" w:val="clear"/>
+        <w:spacing w:after="0"/>
+      </w:pPr>
+      <w:r>
+        <w:rPr>
+          <w:rFonts w:ascii="Consolas" w:cs="Consolas" w:eastAsia="Consolas" w:hAnsi="Consolas"/>
+          <w:sz w:val="17"/>
+          <w:szCs w:val="17"/>
+        </w:rPr>
+        <w:t xml:space="preserve">#   dbh    tree DBH (cm); qmd stand QMD (cm); rDBH = dbh/qmd</w:t>
+      </w:r>
+    </w:p>
+    <w:p>
+      <w:pPr>
+        <w:shd w:fill="F4F6F8" w:val="clear"/>
+        <w:spacing w:after="0"/>
+      </w:pPr>
+      <w:r>
+        <w:rPr>
+          <w:rFonts w:ascii="Consolas" w:cs="Consolas" w:eastAsia="Consolas" w:hAnsi="Consolas"/>
+          <w:sz w:val="17"/>
+          <w:szCs w:val="17"/>
+        </w:rPr>
+        <w:t xml:space="preserve">#   expf   tree expansion factor (trees/ha)</w:t>
+      </w:r>
+    </w:p>
+    <w:p>
+      <w:pPr>
+        <w:shd w:fill="F4F6F8" w:val="clear"/>
+        <w:spacing w:after="0"/>
+      </w:pPr>
+      <w:r>
+        <w:rPr>
+          <w:rFonts w:ascii="Consolas" w:cs="Consolas" w:eastAsia="Consolas" w:hAnsi="Consolas"/>
+          <w:sz w:val="17"/>
+          <w:szCs w:val="17"/>
+        </w:rPr>
+        <w:t xml:space="preserve">#   m_stand = 1 - koa.SURV.calibrated(sdi = sdi, planted = planted)</w:t>
+      </w:r>
+    </w:p>
+    <w:p>
+      <w:pPr>
+        <w:shd w:fill="F4F6F8" w:val="clear"/>
+        <w:spacing w:after="0"/>
+      </w:pPr>
+      <w:r>
+        <w:rPr>
+          <w:rFonts w:ascii="Consolas" w:cs="Consolas" w:eastAsia="Consolas" w:hAnsi="Consolas"/>
+          <w:sz w:val="17"/>
+          <w:szCs w:val="17"/>
+        </w:rPr>
+        <w:t xml:space="preserve">#   beta   concentration of mortality on small trees (default 3)</w:t>
+      </w:r>
+    </w:p>
+    <w:p>
+      <w:pPr>
+        <w:shd w:fill="F4F6F8" w:val="clear"/>
+        <w:spacing w:after="0"/>
+      </w:pPr>
+      <w:r>
+        <w:rPr>
+          <w:rFonts w:ascii="Consolas" w:cs="Consolas" w:eastAsia="Consolas" w:hAnsi="Consolas"/>
+          <w:sz w:val="17"/>
+          <w:szCs w:val="17"/>
+        </w:rPr>
+        <w:t xml:space="preserve"> </w:t>
+      </w:r>
+    </w:p>
+    <w:p>
+      <w:pPr>
+        <w:shd w:fill="F4F6F8" w:val="clear"/>
+        <w:spacing w:after="0"/>
+      </w:pPr>
+      <w:r>
+        <w:rPr>
+          <w:rFonts w:ascii="Consolas" w:cs="Consolas" w:eastAsia="Consolas" w:hAnsi="Consolas"/>
+          <w:sz w:val="17"/>
+          <w:szCs w:val="17"/>
+        </w:rPr>
+        <w:t xml:space="preserve">koa.SURV.allocate &lt;- function(dbh, expf, qmd, m_stand, beta = 3) {</w:t>
+      </w:r>
+    </w:p>
+    <w:p>
+      <w:pPr>
+        <w:shd w:fill="F4F6F8" w:val="clear"/>
+        <w:spacing w:after="0"/>
+      </w:pPr>
+      <w:r>
+        <w:rPr>
+          <w:rFonts w:ascii="Consolas" w:cs="Consolas" w:eastAsia="Consolas" w:hAnsi="Consolas"/>
+          <w:sz w:val="17"/>
+          <w:szCs w:val="17"/>
+        </w:rPr>
+        <w:t xml:space="preserve">  rDBH &lt;- dbh / pmax(qmd, 0.1)</w:t>
+      </w:r>
+    </w:p>
+    <w:p>
+      <w:pPr>
+        <w:shd w:fill="F4F6F8" w:val="clear"/>
+        <w:spacing w:after="0"/>
+      </w:pPr>
+      <w:r>
+        <w:rPr>
+          <w:rFonts w:ascii="Consolas" w:cs="Consolas" w:eastAsia="Consolas" w:hAnsi="Consolas"/>
+          <w:sz w:val="17"/>
+          <w:szCs w:val="17"/>
+        </w:rPr>
+        <w:t xml:space="preserve">  w    &lt;- exp(-beta * (rDBH - 1))                 # small trees (rDBH&lt;1) -&gt; w&gt;1</w:t>
+      </w:r>
+    </w:p>
+    <w:p>
+      <w:pPr>
+        <w:shd w:fill="F4F6F8" w:val="clear"/>
+        <w:spacing w:after="0"/>
+      </w:pPr>
+      <w:r>
+        <w:rPr>
+          <w:rFonts w:ascii="Consolas" w:cs="Consolas" w:eastAsia="Consolas" w:hAnsi="Consolas"/>
+          <w:sz w:val="17"/>
+          <w:szCs w:val="17"/>
+        </w:rPr>
+        <w:t xml:space="preserve">  wbar &lt;- sum(w * expf) / sum(expf)               # expf-weighted mean weight</w:t>
+      </w:r>
+    </w:p>
+    <w:p>
+      <w:pPr>
+        <w:shd w:fill="F4F6F8" w:val="clear"/>
+        <w:spacing w:after="0"/>
+      </w:pPr>
+      <w:r>
+        <w:rPr>
+          <w:rFonts w:ascii="Consolas" w:cs="Consolas" w:eastAsia="Consolas" w:hAnsi="Consolas"/>
+          <w:sz w:val="17"/>
+          <w:szCs w:val="17"/>
+        </w:rPr>
+        <w:t xml:space="preserve">  pmin(pmax(m_stand * w / wbar, 0), 0.95)         # per-tree annual mortality</w:t>
+      </w:r>
+    </w:p>
+    <w:p>
+      <w:pPr>
+        <w:shd w:fill="F4F6F8" w:val="clear"/>
+        <w:spacing w:after="0"/>
+      </w:pPr>
+      <w:r>
+        <w:rPr>
+          <w:rFonts w:ascii="Consolas" w:cs="Consolas" w:eastAsia="Consolas" w:hAnsi="Consolas"/>
+          <w:sz w:val="17"/>
+          <w:szCs w:val="17"/>
+        </w:rPr>
+        <w:t xml:space="preserve">}</w:t>
+      </w:r>
+    </w:p>
+    <w:p>
+      <w:pPr>
+        <w:shd w:fill="F4F6F8" w:val="clear"/>
+        <w:spacing w:after="0"/>
+      </w:pPr>
+      <w:r>
+        <w:rPr>
+          <w:rFonts w:ascii="Consolas" w:cs="Consolas" w:eastAsia="Consolas" w:hAnsi="Consolas"/>
+          <w:sz w:val="17"/>
+          <w:szCs w:val="17"/>
+        </w:rPr>
+        <w:t xml:space="preserve"> </w:t>
+      </w:r>
+    </w:p>
+    <w:p>
+      <w:pPr>
+        <w:shd w:fill="F4F6F8" w:val="clear"/>
+        <w:spacing w:after="0"/>
+      </w:pPr>
+      <w:r>
+        <w:rPr>
+          <w:rFonts w:ascii="Consolas" w:cs="Consolas" w:eastAsia="Consolas" w:hAnsi="Consolas"/>
+          <w:sz w:val="17"/>
+          <w:szCs w:val="17"/>
+        </w:rPr>
+        <w:t xml:space="preserve"># Drop-in for HiGy.R calc_mortality(): compute stand SDI from the plot summary</w:t>
+      </w:r>
+    </w:p>
+    <w:p>
+      <w:pPr>
+        <w:shd w:fill="F4F6F8" w:val="clear"/>
+        <w:spacing w:after="0"/>
+      </w:pPr>
+      <w:r>
+        <w:rPr>
+          <w:rFonts w:ascii="Consolas" w:cs="Consolas" w:eastAsia="Consolas" w:hAnsi="Consolas"/>
+          <w:sz w:val="17"/>
+          <w:szCs w:val="17"/>
+        </w:rPr>
+        <w:t xml:space="preserve">#   (sdi = tph.plot * (qmd/25)^1.6), then either</w:t>
+      </w:r>
+    </w:p>
+    <w:p>
+      <w:pPr>
+        <w:shd w:fill="F4F6F8" w:val="clear"/>
+        <w:spacing w:after="0"/>
+      </w:pPr>
+      <w:r>
+        <w:rPr>
+          <w:rFonts w:ascii="Consolas" w:cs="Consolas" w:eastAsia="Consolas" w:hAnsi="Consolas"/>
+          <w:sz w:val="17"/>
+          <w:szCs w:val="17"/>
+        </w:rPr>
+        <w:t xml:space="preserve">#   (a) uniform stand rate:</w:t>
+      </w:r>
+    </w:p>
+    <w:p>
+      <w:pPr>
+        <w:shd w:fill="F4F6F8" w:val="clear"/>
+        <w:spacing w:after="0"/>
+      </w:pPr>
+      <w:r>
+        <w:rPr>
+          <w:rFonts w:ascii="Consolas" w:cs="Consolas" w:eastAsia="Consolas" w:hAnsi="Consolas"/>
+          <w:sz w:val="17"/>
+          <w:szCs w:val="17"/>
+        </w:rPr>
+        <w:t xml:space="preserve">#       surv = koa.SURV.calibrated(sdi = sdi, planted = stand$planted)</w:t>
+      </w:r>
+    </w:p>
+    <w:p>
+      <w:pPr>
+        <w:shd w:fill="F4F6F8" w:val="clear"/>
+        <w:spacing w:after="0"/>
+      </w:pPr>
+      <w:r>
+        <w:rPr>
+          <w:rFonts w:ascii="Consolas" w:cs="Consolas" w:eastAsia="Consolas" w:hAnsi="Consolas"/>
+          <w:sz w:val="17"/>
+          <w:szCs w:val="17"/>
+        </w:rPr>
+        <w:t xml:space="preserve">#       dexpf = expf * (1 - surv) * mort.mult</w:t>
+      </w:r>
+    </w:p>
+    <w:p>
+      <w:pPr>
+        <w:shd w:fill="F4F6F8" w:val="clear"/>
+        <w:spacing w:after="0"/>
+      </w:pPr>
+      <w:r>
+        <w:rPr>
+          <w:rFonts w:ascii="Consolas" w:cs="Consolas" w:eastAsia="Consolas" w:hAnsi="Consolas"/>
+          <w:sz w:val="17"/>
+          <w:szCs w:val="17"/>
+        </w:rPr>
+        <w:t xml:space="preserve">#   (b) size-allocated (recommended for individual-tree realism):</w:t>
+      </w:r>
+    </w:p>
+    <w:p>
+      <w:pPr>
+        <w:shd w:fill="F4F6F8" w:val="clear"/>
+        <w:spacing w:after="0"/>
+      </w:pPr>
+      <w:r>
+        <w:rPr>
+          <w:rFonts w:ascii="Consolas" w:cs="Consolas" w:eastAsia="Consolas" w:hAnsi="Consolas"/>
+          <w:sz w:val="17"/>
+          <w:szCs w:val="17"/>
+        </w:rPr>
+        <w:t xml:space="preserve">#       m_stand = 1 - koa.SURV.calibrated(sdi = sdi, planted = stand$planted)</w:t>
+      </w:r>
+    </w:p>
+    <w:p>
+      <w:pPr>
+        <w:shd w:fill="F4F6F8" w:val="clear"/>
+        <w:spacing w:after="0"/>
+      </w:pPr>
+      <w:r>
+        <w:rPr>
+          <w:rFonts w:ascii="Consolas" w:cs="Consolas" w:eastAsia="Consolas" w:hAnsi="Consolas"/>
+          <w:sz w:val="17"/>
+          <w:szCs w:val="17"/>
+        </w:rPr>
+        <w:t xml:space="preserve">#       p_tree  = koa.SURV.allocate(dbh, expf, qmd, m_stand)</w:t>
+      </w:r>
+    </w:p>
+    <w:p>
+      <w:pPr>
+        <w:shd w:fill="F4F6F8" w:val="clear"/>
+        <w:spacing w:after="0"/>
+      </w:pPr>
+      <w:r>
+        <w:rPr>
+          <w:rFonts w:ascii="Consolas" w:cs="Consolas" w:eastAsia="Consolas" w:hAnsi="Consolas"/>
+          <w:sz w:val="17"/>
+          <w:szCs w:val="17"/>
+        </w:rPr>
+        <w:t xml:space="preserve">#       dexpf   = expf * p_tree * mort.mult</w:t>
+      </w:r>
+    </w:p>
+    <w:p>
+      <w:pPr>
+        <w:shd w:fill="F4F6F8" w:val="clear"/>
+        <w:spacing w:after="0"/>
+      </w:pPr>
+      <w:r>
+        <w:rPr>
+          <w:rFonts w:ascii="Consolas" w:cs="Consolas" w:eastAsia="Consolas" w:hAnsi="Consolas"/>
+          <w:sz w:val="17"/>
+          <w:szCs w:val="17"/>
+        </w:rPr>
+        <w:t xml:space="preserve"># Refine the constants as Kahikinui, KMR, and Kualoa remeasurements accrue.</w:t>
+      </w:r>
+    </w:p>
+    <w:p>
+      <w:pPr>
+        <w:shd w:fill="F4F6F8" w:val="clear"/>
+        <w:spacing w:after="0"/>
+      </w:pPr>
+      <w:r>
+        <w:rPr>
+          <w:rFonts w:ascii="Consolas" w:cs="Consolas" w:eastAsia="Consolas" w:hAnsi="Consolas"/>
+          <w:sz w:val="17"/>
+          <w:szCs w:val="17"/>
+        </w:rPr>
+        <w:t xml:space="preserve"> </w:t>
       </w:r>
     </w:p>
     <w:sectPr>

</xml_diff>

<commit_message>
Origin/BYI final refinement: origin-specific background, BYI via growth
- check_origin_byi.R / check_interaction.R: origin matters (direction flips with
  density: plantation background HIGHER 0.66 vs 0.22 %/yr; natural carries
  self-thinning). BYI not a direct term - plantations only at BYI<=191, so
  origin x BYI confounded/non-identifiable (p=0.39).
- Corrected base rates (nat 0.003, plt 0.006). Emergent (no BYI coef): plantations
  and high-BYI self-thin faster (onset 14->7 yr), survival lower at higher BYI.
- run_origin_byi_final.py + fig_emergent_byi; report section 11.6; updated PR desc.
</commit_message>
<xml_diff>
--- a/fvsOL/inst/extdata/koa_stress_test/20260605_koa_FVS-HI_stress-test-report.docx
+++ b/fvsOL/inst/extdata/koa_stress_test/20260605_koa_FVS-HI_stress-test-report.docx
@@ -4781,7 +4781,7 @@
           <w:sz w:val="17"/>
           <w:szCs w:val="17"/>
         </w:rPr>
-        <w:t xml:space="preserve">  base  = 0.005  (natural)   or   0.003  (planted)   per year</w:t>
+        <w:t xml:space="preserve">  base  = 0.003  (natural)   or   0.006  (planted)   per year</w:t>
       </w:r>
     </w:p>
     <w:p>
@@ -4817,7 +4817,7 @@
         <w:spacing w:after="120"/>
       </w:pPr>
       <w:r>
-        <w:t xml:space="preserve">Mortality is the origin background (0.5%/yr natural, 0.3%/yr planted) below 0.65 RD, increases linearly to about 15.5%/yr at 0.85 RD, and plateaus above (capped at 20%/yr). BYI does not appear; it acts through growth. Full R code in Appendix B.</w:t>
+        <w:t xml:space="preserve">Mortality is the origin background (0.3%/yr natural, 0.6%/yr planted; see section 11.6 for the data-checked origin direction) below 0.65 RD, increases linearly to about 15.6%/yr at 0.85 RD, and plateaus above (capped at 20%/yr). BYI does not appear as a direct term; it acts through growth. Full R code in Appendix B.</w:t>
       </w:r>
     </w:p>
     <w:p>
@@ -5753,7 +5753,7 @@
         <w:spacing w:after="120"/>
       </w:pPr>
       <w:r>
-        <w:t xml:space="preserve">Robustness checks across all six origin by BYI combinations pass: no runaway (peak 70 to 88% of SDImax), no collapse, and monotonic QMD over 200 years. Background annual mortality is 0.5% natural and 0.3% plantation, rising to about 15% per year at full self-thinning. Higher BYI reaches the self-thinning onset sooner and grows larger, so BYI shapes density through growth rather than a confounded mortality term. Plantations self-thin earlier from denser starts and plateau at the 60 cm cap. This is the long-term behavior the model was missing.</w:t>
+        <w:t xml:space="preserve">Robustness checks across all six origin by BYI combinations pass: no runaway (peak 70 to 88% of SDImax), no collapse, and monotonic QMD over 200 years. Background annual mortality is 0.3% natural and 0.6% plantation (origin direction confirmed in section 11.6), rising to about 15% per year at full self-thinning. Higher BYI reaches the self-thinning onset sooner and grows larger, so BYI shapes density through growth rather than a confounded mortality term. Plantations self-thin earlier from denser starts and plateau at the 60 cm cap. This is the long-term behavior the model was missing.</w:t>
       </w:r>
     </w:p>
     <w:p>
@@ -6920,10 +6920,18 @@
     </w:p>
     <w:p>
       <w:pPr>
-        <w:pStyle w:val="Heading1"/>
-      </w:pPr>
-      <w:r>
-        <w:t xml:space="preserve">12. Open code issues</w:t>
+        <w:pStyle w:val="Heading2"/>
+      </w:pPr>
+      <w:r>
+        <w:t xml:space="preserve">11.6 Does survival change by origin and BYI?</w:t>
+      </w:r>
+    </w:p>
+    <w:p>
+      <w:pPr>
+        <w:spacing w:after="120"/>
+      </w:pPr>
+      <w:r>
+        <w:t xml:space="preserve">This was checked directly on the survival data with exposure-based annual rates, separating density from origin and site.</w:t>
       </w:r>
     </w:p>
     <w:p>
@@ -6936,7 +6944,7 @@
         <w:spacing w:after="80"/>
       </w:pPr>
       <w:r>
-        <w:t xml:space="preserve">Unit-order bug in the first-cycle crown imputation in customRun_fvsRunHi.R: height is converted to feet before calc_hcb, which expects metres, biasing imputed crown ratios. Compute crown base while metric, convert to feet last.</w:t>
+        <w:t xml:space="preserve">Origin: yes. At low density (background, RD below 0.65) plantations have higher mortality than natural (0.66 versus 0.22 percent per year), reflecting young-stand establishment loss, so the background base is origin-specific with plantation higher. Natural stands appear higher only in the overall average because they carry the self-thinning load at high density.</w:t>
       </w:r>
     </w:p>
     <w:p>
@@ -6949,7 +6957,7 @@
         <w:spacing w:after="80"/>
       </w:pPr>
       <w:r>
-        <w:t xml:space="preserve">Hi.GY() calls AcadianGYOneStand() instead of HIGYOneStand(); latent but should be corrected or the wrapper removed.</w:t>
+        <w:t xml:space="preserve">BYI: no direct term. The apparent BYI effect is confined to high-BYI natural plots at high density (self-thinning), and plantations occur only at BYI at or below 191 (maximum 191; zero records above 399). Origin and BYI are therefore confounded at high BYI and the origin-by-BYI interaction is not identifiable (interaction coefficient non-significant, p = 0.39, with a very large standard error).</w:t>
       </w:r>
     </w:p>
     <w:p>
@@ -6962,7 +6970,85 @@
         <w:spacing w:after="80"/>
       </w:pPr>
       <w:r>
-        <w:t xml:space="preserve">Tree-size cap units: tree.size.cap AK=(90,92) is multiplied by inch-to-cm and foot-to-metre; if 90 was cm the DBH cap is effectively disabled at 228 cm.</w:t>
+        <w:t xml:space="preserve">The dynamics one expects do emerge through growth, not a BYI coefficient: plantations and higher-BYI sites self-thin faster, and survival is lower at higher BYI. Natural self-thinning onset falls from age 14 to age 7 as BYI rises from 100 to 550; plantations reach onset at age 5 to 8, earlier than natural at every BYI; realized natural mortality rises from 2.2 to 2.8 percent per year across the BYI range.</w:t>
+      </w:r>
+    </w:p>
+    <w:p>
+      <w:pPr>
+        <w:spacing w:after="80" w:before="80"/>
+        <w:jc w:val="center"/>
+      </w:pPr>
+      <w:r>
+        <w:drawing>
+          <wp:inline distT="0" distB="0" distL="0" distR="0">
+            <wp:extent cx="4476750" cy="1752600"/>
+            <wp:effectExtent t="0" r="0" b="0" l="0"/>
+            <wp:docPr id="1" name="fig_emergent_byi.png" descr="fig_emergent_byi.png" title="fig_emergent_byi.png"/>
+            <wp:cNvGraphicFramePr>
+              <a:graphicFrameLocks xmlns:a="http://schemas.openxmlformats.org/drawingml/2006/main" noChangeAspect="1"/>
+            </wp:cNvGraphicFramePr>
+            <a:graphic xmlns:a="http://schemas.openxmlformats.org/drawingml/2006/main">
+              <a:graphicData uri="http://schemas.openxmlformats.org/drawingml/2006/picture">
+                <pic:pic xmlns:pic="http://schemas.openxmlformats.org/drawingml/2006/picture">
+                  <pic:nvPicPr>
+                    <pic:cNvPr id="0" name="" descr=""/>
+                    <pic:cNvPicPr>
+                      <a:picLocks noChangeAspect="1" noChangeArrowheads="1"/>
+                    </pic:cNvPicPr>
+                  </pic:nvPicPr>
+                  <pic:blipFill>
+                    <a:blip r:embed="rId13" cstate="none"/>
+                    <a:srcRect/>
+                    <a:stretch>
+                      <a:fillRect/>
+                    </a:stretch>
+                  </pic:blipFill>
+                  <pic:spPr bwMode="auto">
+                    <a:xfrm>
+                      <a:off x="0" y="0"/>
+                      <a:ext cx="4476750" cy="1752600"/>
+                    </a:xfrm>
+                    <a:prstGeom prst="rect">
+                      <a:avLst/>
+                    </a:prstGeom>
+                  </pic:spPr>
+                </pic:pic>
+              </a:graphicData>
+            </a:graphic>
+          </wp:inline>
+        </w:drawing>
+      </w:r>
+    </w:p>
+    <w:p>
+      <w:pPr>
+        <w:spacing w:after="160"/>
+        <w:jc w:val="center"/>
+      </w:pPr>
+      <w:r>
+        <w:rPr>
+          <w:i/>
+          <w:iCs/>
+          <w:color w:val="555555"/>
+          <w:sz w:val="16"/>
+          <w:szCs w:val="16"/>
+        </w:rPr>
+        <w:t xml:space="preserve">Figure 6. Emergent BYI and origin effects from the calibrated model (no direct BYI term). Left: realized mean annual mortality rises with BYI and is higher for plantations. Right: self-thinning onset age falls with BYI and is earlier for plantations.</w:t>
+      </w:r>
+    </w:p>
+    <w:p>
+      <w:pPr>
+        <w:spacing w:after="120"/>
+      </w:pPr>
+      <w:r>
+        <w:t xml:space="preserve">So survival is origin-dependent and, through the growth to self-thinning pathway, lower on higher-BYI sites and earlier-thinning in plantations, matching the expected biology while avoiding an unidentifiable, unstable direct BYI mortality term.</w:t>
+      </w:r>
+    </w:p>
+    <w:p>
+      <w:pPr>
+        <w:pStyle w:val="Heading1"/>
+      </w:pPr>
+      <w:r>
+        <w:t xml:space="preserve">12. Open code issues</w:t>
       </w:r>
     </w:p>
     <w:p>
@@ -6975,6 +7061,45 @@
         <w:spacing w:after="80"/>
       </w:pPr>
       <w:r>
+        <w:t xml:space="preserve">Unit-order bug in the first-cycle crown imputation in customRun_fvsRunHi.R: height is converted to feet before calc_hcb, which expects metres, biasing imputed crown ratios. Compute crown base while metric, convert to feet last.</w:t>
+      </w:r>
+    </w:p>
+    <w:p>
+      <w:pPr>
+        <w:pStyle w:val="ListParagraph"/>
+        <w:numPr>
+          <w:ilvl w:val="0"/>
+          <w:numId w:val="2"/>
+        </w:numPr>
+        <w:spacing w:after="80"/>
+      </w:pPr>
+      <w:r>
+        <w:t xml:space="preserve">Hi.GY() calls AcadianGYOneStand() instead of HIGYOneStand(); latent but should be corrected or the wrapper removed.</w:t>
+      </w:r>
+    </w:p>
+    <w:p>
+      <w:pPr>
+        <w:pStyle w:val="ListParagraph"/>
+        <w:numPr>
+          <w:ilvl w:val="0"/>
+          <w:numId w:val="2"/>
+        </w:numPr>
+        <w:spacing w:after="80"/>
+      </w:pPr>
+      <w:r>
+        <w:t xml:space="preserve">Tree-size cap units: tree.size.cap AK=(90,92) is multiplied by inch-to-cm and foot-to-metre; if 90 was cm the DBH cap is effectively disabled at 228 cm.</w:t>
+      </w:r>
+    </w:p>
+    <w:p>
+      <w:pPr>
+        <w:pStyle w:val="ListParagraph"/>
+        <w:numPr>
+          <w:ilvl w:val="0"/>
+          <w:numId w:val="2"/>
+        </w:numPr>
+        <w:spacing w:after="80"/>
+      </w:pPr>
+      <w:r>
         <w:t xml:space="preserve">Species scope: only koa is parameterized; ohia and sandalwood map to OT and are held static. Document or add surrogates.</w:t>
       </w:r>
     </w:p>
@@ -7494,6 +7619,160 @@
           <w:sz w:val="17"/>
           <w:szCs w:val="17"/>
         </w:rPr>
+        <w:t xml:space="preserve"># ORIGIN AND BYI (data-checked). Origin: yes. At low density (background), the</w:t>
+      </w:r>
+    </w:p>
+    <w:p>
+      <w:pPr>
+        <w:shd w:fill="F4F6F8" w:val="clear"/>
+        <w:spacing w:after="0"/>
+      </w:pPr>
+      <w:r>
+        <w:rPr>
+          <w:rFonts w:ascii="Consolas" w:cs="Consolas" w:eastAsia="Consolas" w:hAnsi="Consolas"/>
+          <w:sz w:val="17"/>
+          <w:szCs w:val="17"/>
+        </w:rPr>
+        <w:t xml:space="preserve"># data show plantations HIGHER (0.66%/yr) than natural (0.22%/yr) -- young-stand</w:t>
+      </w:r>
+    </w:p>
+    <w:p>
+      <w:pPr>
+        <w:shd w:fill="F4F6F8" w:val="clear"/>
+        <w:spacing w:after="0"/>
+      </w:pPr>
+      <w:r>
+        <w:rPr>
+          <w:rFonts w:ascii="Consolas" w:cs="Consolas" w:eastAsia="Consolas" w:hAnsi="Consolas"/>
+          <w:sz w:val="17"/>
+          <w:szCs w:val="17"/>
+        </w:rPr>
+        <w:t xml:space="preserve"># establishment mortality -- so base_plt &gt; base_nat. Natural stands look higher</w:t>
+      </w:r>
+    </w:p>
+    <w:p>
+      <w:pPr>
+        <w:shd w:fill="F4F6F8" w:val="clear"/>
+        <w:spacing w:after="0"/>
+      </w:pPr>
+      <w:r>
+        <w:rPr>
+          <w:rFonts w:ascii="Consolas" w:cs="Consolas" w:eastAsia="Consolas" w:hAnsi="Consolas"/>
+          <w:sz w:val="17"/>
+          <w:szCs w:val="17"/>
+        </w:rPr>
+        <w:t xml:space="preserve"># overall only because they carry the self-thinning load. BYI: no direct term.</w:t>
+      </w:r>
+    </w:p>
+    <w:p>
+      <w:pPr>
+        <w:shd w:fill="F4F6F8" w:val="clear"/>
+        <w:spacing w:after="0"/>
+      </w:pPr>
+      <w:r>
+        <w:rPr>
+          <w:rFonts w:ascii="Consolas" w:cs="Consolas" w:eastAsia="Consolas" w:hAnsi="Consolas"/>
+          <w:sz w:val="17"/>
+          <w:szCs w:val="17"/>
+        </w:rPr>
+        <w:t xml:space="preserve"># Plantations occur only at BYI &lt;= 191 (max 191; zero records above 399), so an</w:t>
+      </w:r>
+    </w:p>
+    <w:p>
+      <w:pPr>
+        <w:shd w:fill="F4F6F8" w:val="clear"/>
+        <w:spacing w:after="0"/>
+      </w:pPr>
+      <w:r>
+        <w:rPr>
+          <w:rFonts w:ascii="Consolas" w:cs="Consolas" w:eastAsia="Consolas" w:hAnsi="Consolas"/>
+          <w:sz w:val="17"/>
+          <w:szCs w:val="17"/>
+        </w:rPr>
+        <w:t xml:space="preserve"># origin x BYI interaction is not identifiable (confounded). The real dynamics</w:t>
+      </w:r>
+    </w:p>
+    <w:p>
+      <w:pPr>
+        <w:shd w:fill="F4F6F8" w:val="clear"/>
+        <w:spacing w:after="0"/>
+      </w:pPr>
+      <w:r>
+        <w:rPr>
+          <w:rFonts w:ascii="Consolas" w:cs="Consolas" w:eastAsia="Consolas" w:hAnsi="Consolas"/>
+          <w:sz w:val="17"/>
+          <w:szCs w:val="17"/>
+        </w:rPr>
+        <w:t xml:space="preserve"># you would expect -- plantations and higher-BYI sites self-thin faster, and</w:t>
+      </w:r>
+    </w:p>
+    <w:p>
+      <w:pPr>
+        <w:shd w:fill="F4F6F8" w:val="clear"/>
+        <w:spacing w:after="0"/>
+      </w:pPr>
+      <w:r>
+        <w:rPr>
+          <w:rFonts w:ascii="Consolas" w:cs="Consolas" w:eastAsia="Consolas" w:hAnsi="Consolas"/>
+          <w:sz w:val="17"/>
+          <w:szCs w:val="17"/>
+        </w:rPr>
+        <w:t xml:space="preserve"># survival is lower at higher BYI -- EMERGE from growth driving stands into the</w:t>
+      </w:r>
+    </w:p>
+    <w:p>
+      <w:pPr>
+        <w:shd w:fill="F4F6F8" w:val="clear"/>
+        <w:spacing w:after="0"/>
+      </w:pPr>
+      <w:r>
+        <w:rPr>
+          <w:rFonts w:ascii="Consolas" w:cs="Consolas" w:eastAsia="Consolas" w:hAnsi="Consolas"/>
+          <w:sz w:val="17"/>
+          <w:szCs w:val="17"/>
+        </w:rPr>
+        <w:t xml:space="preserve"># self-thinning ramp sooner (verified: natural self-thinning onset age 14 -&gt; 7</w:t>
+      </w:r>
+    </w:p>
+    <w:p>
+      <w:pPr>
+        <w:shd w:fill="F4F6F8" w:val="clear"/>
+        <w:spacing w:after="0"/>
+      </w:pPr>
+      <w:r>
+        <w:rPr>
+          <w:rFonts w:ascii="Consolas" w:cs="Consolas" w:eastAsia="Consolas" w:hAnsi="Consolas"/>
+          <w:sz w:val="17"/>
+          <w:szCs w:val="17"/>
+        </w:rPr>
+        <w:t xml:space="preserve"># as BYI rises 100 -&gt; 550; plantations onset 5-8 yr, earlier at every BYI;</w:t>
+      </w:r>
+    </w:p>
+    <w:p>
+      <w:pPr>
+        <w:shd w:fill="F4F6F8" w:val="clear"/>
+        <w:spacing w:after="0"/>
+      </w:pPr>
+      <w:r>
+        <w:rPr>
+          <w:rFonts w:ascii="Consolas" w:cs="Consolas" w:eastAsia="Consolas" w:hAnsi="Consolas"/>
+          <w:sz w:val="17"/>
+          <w:szCs w:val="17"/>
+        </w:rPr>
+        <w:t xml:space="preserve"># realized natural mortality 2.2% -&gt; 2.8%/yr across BYI). No BYI coefficient.</w:t>
+      </w:r>
+    </w:p>
+    <w:p>
+      <w:pPr>
+        <w:shd w:fill="F4F6F8" w:val="clear"/>
+        <w:spacing w:after="0"/>
+      </w:pPr>
+      <w:r>
+        <w:rPr>
+          <w:rFonts w:ascii="Consolas" w:cs="Consolas" w:eastAsia="Consolas" w:hAnsi="Consolas"/>
+          <w:sz w:val="17"/>
+          <w:szCs w:val="17"/>
+        </w:rPr>
         <w:t xml:space="preserve">koa.SURV.calibrated &lt;- function(sdi = NA, baph = NA, planted = 0,</w:t>
       </w:r>
     </w:p>
@@ -7508,7 +7787,7 @@
           <w:sz w:val="17"/>
           <w:szCs w:val="17"/>
         </w:rPr>
-        <w:t xml:space="preserve">                                base_nat = 0.005, base_plt = 0.003,</w:t>
+        <w:t xml:space="preserve">                                base_nat = 0.003, base_plt = 0.006,</w:t>
       </w:r>
     </w:p>
     <w:p>

</xml_diff>

<commit_message>
Add koa ingrowth component (RD + origin), Li et al. 2011-based
- koa_ingrowth.R/.py: E=exp(5.3836-3.0933*RD-1.6359*planted), trees/ha/yr,
  reconstructed from AK.HT.csv (363 plot-periods). RD dominant (p<1e-4);
  plantations ~5x less (p=0.029). BYI not supported (main p=0.28, BYIxRD p=0.56);
  %koa BA no variation (pure koa). BYI acts through growth. Optional BYI knob off.
- project_psp ingrowth mode + run_ingrowth_longterm.py: 200-yr multi-cohort
  behavior, no runaway/collapse; sustains BA vs even-aged decline.
- fit_ingrowth* scripts, figure; report sections 12 (ingrowth) + 12.1 (max SDI by
  origin limitation); recommendations updated; Appendix C added.
</commit_message>
<xml_diff>
--- a/fvsOL/inst/extdata/koa_stress_test/20260605_koa_FVS-HI_stress-test-report.docx
+++ b/fvsOL/inst/extdata/koa_stress_test/20260605_koa_FVS-HI_stress-test-report.docx
@@ -7048,7 +7048,37 @@
         <w:pStyle w:val="Heading1"/>
       </w:pPr>
       <w:r>
-        <w:t xml:space="preserve">12. Open code issues</w:t>
+        <w:t xml:space="preserve">12. Ingrowth component (new)</w:t>
+      </w:r>
+    </w:p>
+    <w:p>
+      <w:pPr>
+        <w:spacing w:after="120"/>
+      </w:pPr>
+      <w:r>
+        <w:t xml:space="preserve">HiGy.R has no ingrowth, the main residual gap in young-stand basal area. Following Li, Weiskittel and Kershaw (2011), but reduced to a single annualized expectation keyed on relative density per the preferred form, koa ingrowth was reconstructed from AK.HT.csv remeasurements (363 plot-periods, 22 percent with ingrowth) and fit with a quasi-Poisson log model.</w:t>
+      </w:r>
+    </w:p>
+    <w:p>
+      <w:pPr>
+        <w:shd w:fill="F4F6F8" w:val="clear"/>
+        <w:spacing w:after="0"/>
+      </w:pPr>
+      <w:r>
+        <w:rPr>
+          <w:rFonts w:ascii="Consolas" w:cs="Consolas" w:eastAsia="Consolas" w:hAnsi="Consolas"/>
+          <w:sz w:val="17"/>
+          <w:szCs w:val="17"/>
+        </w:rPr>
+        <w:t xml:space="preserve">  E[ingrowth, trees/ha/yr] = exp( 5.3836 - 3.0933*RD - 1.6359*planted )</w:t>
+      </w:r>
+    </w:p>
+    <w:p>
+      <w:pPr>
+        <w:spacing w:after="120"/>
+      </w:pPr>
+      <w:r>
+        <w:t xml:space="preserve">Findings, with the data-checked answer to the origin and BYI questions:</w:t>
       </w:r>
     </w:p>
     <w:p>
@@ -7061,7 +7091,7 @@
         <w:spacing w:after="80"/>
       </w:pPr>
       <w:r>
-        <w:t xml:space="preserve">Unit-order bug in the first-cycle crown imputation in customRun_fvsRunHi.R: height is converted to feet before calc_hcb, which expects metres, biasing imputed crown ratios. Compute crown base while metric, convert to feet last.</w:t>
+        <w:t xml:space="preserve">RD is the dominant driver (p &lt; 0.0001): ingrowth falls from about 160 to 13 trees per hectare per year as relative density rises from 0.1 to 0.9, i.e. recruitment fills open stands and ceases at canopy closure.</w:t>
       </w:r>
     </w:p>
     <w:p>
@@ -7074,7 +7104,7 @@
         <w:spacing w:after="80"/>
       </w:pPr>
       <w:r>
-        <w:t xml:space="preserve">Hi.GY() calls AcadianGYOneStand() instead of HIGYOneStand(); latent but should be corrected or the wrapper removed.</w:t>
+        <w:t xml:space="preserve">Origin matters (p = 0.029): plantations have about five times less ingrowth (rate ratio 0.195), consistent with managed and weeded plantations.</w:t>
       </w:r>
     </w:p>
     <w:p>
@@ -7087,7 +7117,101 @@
         <w:spacing w:after="80"/>
       </w:pPr>
       <w:r>
-        <w:t xml:space="preserve">Tree-size cap units: tree.size.cap AK=(90,92) is multiplied by inch-to-cm and foot-to-metre; if 90 was cm the DBH cap is effectively disabled at 228 cm.</w:t>
+        <w:t xml:space="preserve">BYI is not supported: neither a BYI main effect (p = 0.28) nor a BYI by RD interaction (p = 0.56) is significant; the raw pattern peaks at intermediate BYI but is too noisy. Percent koa basal area has no variation (koa stands are essentially pure koa, median 1.0). BYI acts on ingrowth indirectly through growth, by raising relative density faster. An optional BYI multiplier is provided but defaults off.</w:t>
+      </w:r>
+    </w:p>
+    <w:p>
+      <w:pPr>
+        <w:spacing w:after="80" w:before="80"/>
+        <w:jc w:val="center"/>
+      </w:pPr>
+      <w:r>
+        <w:drawing>
+          <wp:inline distT="0" distB="0" distL="0" distR="0">
+            <wp:extent cx="4476750" cy="1714500"/>
+            <wp:effectExtent t="0" r="0" b="0" l="0"/>
+            <wp:docPr id="1" name="fig_ingrowth.png" descr="fig_ingrowth.png" title="fig_ingrowth.png"/>
+            <wp:cNvGraphicFramePr>
+              <a:graphicFrameLocks xmlns:a="http://schemas.openxmlformats.org/drawingml/2006/main" noChangeAspect="1"/>
+            </wp:cNvGraphicFramePr>
+            <a:graphic xmlns:a="http://schemas.openxmlformats.org/drawingml/2006/main">
+              <a:graphicData uri="http://schemas.openxmlformats.org/drawingml/2006/picture">
+                <pic:pic xmlns:pic="http://schemas.openxmlformats.org/drawingml/2006/picture">
+                  <pic:nvPicPr>
+                    <pic:cNvPr id="0" name="" descr=""/>
+                    <pic:cNvPicPr>
+                      <a:picLocks noChangeAspect="1" noChangeArrowheads="1"/>
+                    </pic:cNvPicPr>
+                  </pic:nvPicPr>
+                  <pic:blipFill>
+                    <a:blip r:embed="rId14" cstate="none"/>
+                    <a:srcRect/>
+                    <a:stretch>
+                      <a:fillRect/>
+                    </a:stretch>
+                  </pic:blipFill>
+                  <pic:spPr bwMode="auto">
+                    <a:xfrm>
+                      <a:off x="0" y="0"/>
+                      <a:ext cx="4476750" cy="1714500"/>
+                    </a:xfrm>
+                    <a:prstGeom prst="rect">
+                      <a:avLst/>
+                    </a:prstGeom>
+                  </pic:spPr>
+                </pic:pic>
+              </a:graphicData>
+            </a:graphic>
+          </wp:inline>
+        </w:drawing>
+      </w:r>
+    </w:p>
+    <w:p>
+      <w:pPr>
+        <w:spacing w:after="160"/>
+        <w:jc w:val="center"/>
+      </w:pPr>
+      <w:r>
+        <w:rPr>
+          <w:i/>
+          <w:iCs/>
+          <w:color w:val="555555"/>
+          <w:sz w:val="16"/>
+          <w:szCs w:val="16"/>
+        </w:rPr>
+        <w:t xml:space="preserve">Figure 7. Left: koa ingrowth versus relative density by origin. Right: ingrowth sustains long-term basal area (natural), preventing the even-aged decline to a few large trees.</w:t>
+      </w:r>
+    </w:p>
+    <w:p>
+      <w:pPr>
+        <w:spacing w:after="120"/>
+      </w:pPr>
+      <w:r>
+        <w:t xml:space="preserve">In 200-year projection the ingrowth model makes stands realistically multi-cohort, sustaining basal area and density rather than self-thinning to a few large stems, with no runaway or collapse across origin and BYI (SDI 69 to 83 percent of SDImax). Recruits enter at a 2.5 cm threshold with height from the height-diameter model. Drop-in code is koa_ingrowth.R (Appendix C).</w:t>
+      </w:r>
+    </w:p>
+    <w:p>
+      <w:pPr>
+        <w:pStyle w:val="Heading2"/>
+      </w:pPr>
+      <w:r>
+        <w:t xml:space="preserve">12.1 Maximum SDI by origin (data limitation)</w:t>
+      </w:r>
+    </w:p>
+    <w:p>
+      <w:pPr>
+        <w:spacing w:after="120"/>
+      </w:pPr>
+      <w:r>
+        <w:t xml:space="preserve">A higher maximum SDI for plantations is plausible but cannot be estimated here: plantations are sparse at high density (very few plantation records above 0.65 relative density), so a separate plantation SDImax is not identifiable. A single SDImax of 500 is used for both origins; this should be revisited as plantation remeasurements at high density accumulate. A sensitivity run with a higher plantation SDImax is straightforward to add if desired.</w:t>
+      </w:r>
+    </w:p>
+    <w:p>
+      <w:pPr>
+        <w:pStyle w:val="Heading1"/>
+      </w:pPr>
+      <w:r>
+        <w:t xml:space="preserve">13. Open code issues</w:t>
       </w:r>
     </w:p>
     <w:p>
@@ -7100,6 +7224,45 @@
         <w:spacing w:after="80"/>
       </w:pPr>
       <w:r>
+        <w:t xml:space="preserve">Unit-order bug in the first-cycle crown imputation in customRun_fvsRunHi.R: height is converted to feet before calc_hcb, which expects metres, biasing imputed crown ratios. Compute crown base while metric, convert to feet last.</w:t>
+      </w:r>
+    </w:p>
+    <w:p>
+      <w:pPr>
+        <w:pStyle w:val="ListParagraph"/>
+        <w:numPr>
+          <w:ilvl w:val="0"/>
+          <w:numId w:val="2"/>
+        </w:numPr>
+        <w:spacing w:after="80"/>
+      </w:pPr>
+      <w:r>
+        <w:t xml:space="preserve">Hi.GY() calls AcadianGYOneStand() instead of HIGYOneStand(); latent but should be corrected or the wrapper removed.</w:t>
+      </w:r>
+    </w:p>
+    <w:p>
+      <w:pPr>
+        <w:pStyle w:val="ListParagraph"/>
+        <w:numPr>
+          <w:ilvl w:val="0"/>
+          <w:numId w:val="2"/>
+        </w:numPr>
+        <w:spacing w:after="80"/>
+      </w:pPr>
+      <w:r>
+        <w:t xml:space="preserve">Tree-size cap units: tree.size.cap AK=(90,92) is multiplied by inch-to-cm and foot-to-metre; if 90 was cm the DBH cap is effectively disabled at 228 cm.</w:t>
+      </w:r>
+    </w:p>
+    <w:p>
+      <w:pPr>
+        <w:pStyle w:val="ListParagraph"/>
+        <w:numPr>
+          <w:ilvl w:val="0"/>
+          <w:numId w:val="2"/>
+        </w:numPr>
+        <w:spacing w:after="80"/>
+      </w:pPr>
+      <w:r>
         <w:t xml:space="preserve">Species scope: only koa is parameterized; ohia and sandalwood map to OT and are held static. Document or add surrogates.</w:t>
       </w:r>
     </w:p>
@@ -7108,7 +7271,7 @@
         <w:pStyle w:val="Heading1"/>
       </w:pPr>
       <w:r>
-        <w:t xml:space="preserve">13. Recommendations</w:t>
+        <w:t xml:space="preserve">14. Recommendations</w:t>
       </w:r>
     </w:p>
     <w:p>
@@ -7120,7 +7283,7 @@
         </w:numPr>
       </w:pPr>
       <w:r>
-        <w:t xml:space="preserve">Replace the published survival cloglog with the calibrated rate (koa_survival_calibrated.R). Do not ship the raw cloglog; a free refit is not better.</w:t>
+        <w:t xml:space="preserve">Replace the published survival cloglog with the calibrated rate (koa_survival_calibrated.R), allocated to trees by relative size (koa.SURV.allocate). Do not ship the raw cloglog; a free refit is not better.</w:t>
       </w:r>
     </w:p>
     <w:p>
@@ -7132,7 +7295,7 @@
         </w:numPr>
       </w:pPr>
       <w:r>
-        <w:t xml:space="preserve">Keep the current height, height-to-crown-base, and increment equations with conditional correction factors (matches the FINAL code and tracks Table 8).</w:t>
+        <w:t xml:space="preserve">Add the koa ingrowth equation (koa_ingrowth.R): RD plus origin, koa only; it removes the main young-stand basal area gap and gives realistic multi-cohort long-term behavior.</w:t>
       </w:r>
     </w:p>
     <w:p>
@@ -7144,7 +7307,7 @@
         </w:numPr>
       </w:pPr>
       <w:r>
-        <w:t xml:space="preserve">Add an ingrowth submodel, or document the no-ingrowth limitation; it is the main residual gap in young-stand basal area and density.</w:t>
+        <w:t xml:space="preserve">Keep the current height, height-to-crown-base, and increment equations with conditional correction factors (matches the FINAL code and tracks Table 8).</w:t>
       </w:r>
     </w:p>
     <w:p>
@@ -7156,7 +7319,7 @@
         </w:numPr>
       </w:pPr>
       <w:r>
-        <w:t xml:space="preserve">Fix the four code issues in section 11.</w:t>
+        <w:t xml:space="preserve">Fix the four code issues in section 13.</w:t>
       </w:r>
     </w:p>
     <w:p>
@@ -7168,7 +7331,7 @@
         </w:numPr>
       </w:pPr>
       <w:r>
-        <w:t xml:space="preserve">Reconcile the FVS_FINAL README and parameters.csv with the actual FINAL code (see discrepancies.md).</w:t>
+        <w:t xml:space="preserve">Reconcile the FVS_FINAL README and parameters.csv with the actual FINAL code (see discrepancies.md), and revisit a plantation-specific maximum SDI as high-density plantation data accumulate.</w:t>
       </w:r>
     </w:p>
     <w:p>
@@ -7196,7 +7359,7 @@
         <w:spacing w:after="120"/>
       </w:pPr>
       <w:r>
-        <w:t xml:space="preserve">Branch koa-stress-test, folder fvsOL/inst/extdata/koa_stress_test: Rscript fidelity_check.R (port check); python3 run_stress_comprehensive.py; python3 run_final_longterm.py (200-yr stress test); python3 run_mai_pai.py; python3 run_cfi.py. Python needs numpy, pandas, matplotlib; R needs no packages.</w:t>
+        <w:t xml:space="preserve">Branch koa-stress-test, folder fvsOL/inst/extdata/koa_stress_test: Rscript fidelity_check.R (port check); Rscript tune_survival.R; Rscript fit_ingrowth_byi.R (ingrowth + BYI/origin tests); python3 run_final_longterm.py (200-yr stress test); python3 run_mai_pai.py; python3 run_ingrowth_longterm.py; python3 run_cfi.py. Python needs numpy, pandas, matplotlib; R needs no packages.</w:t>
       </w:r>
     </w:p>
     <w:p>
@@ -8334,6 +8497,611 @@
           <w:szCs w:val="17"/>
         </w:rPr>
         <w:t xml:space="preserve"># Refine the constants as Kahikinui, KMR, and Kualoa remeasurements accrue.</w:t>
+      </w:r>
+    </w:p>
+    <w:p>
+      <w:pPr>
+        <w:shd w:fill="F4F6F8" w:val="clear"/>
+        <w:spacing w:after="0"/>
+      </w:pPr>
+      <w:r>
+        <w:rPr>
+          <w:rFonts w:ascii="Consolas" w:cs="Consolas" w:eastAsia="Consolas" w:hAnsi="Consolas"/>
+          <w:sz w:val="17"/>
+          <w:szCs w:val="17"/>
+        </w:rPr>
+        <w:t xml:space="preserve"> </w:t>
+      </w:r>
+    </w:p>
+    <w:p>
+      <w:pPr>
+        <w:pStyle w:val="Heading1"/>
+        <w:pageBreakBefore/>
+      </w:pPr>
+      <w:r>
+        <w:t xml:space="preserve">Appendix C: koa_ingrowth.R</w:t>
+      </w:r>
+    </w:p>
+    <w:p>
+      <w:pPr>
+        <w:spacing w:after="120"/>
+      </w:pPr>
+      <w:r>
+        <w:t xml:space="preserve">Drop-in ingrowth code (adds the recruitment component to HiGy.R):</w:t>
+      </w:r>
+    </w:p>
+    <w:p>
+      <w:pPr>
+        <w:shd w:fill="F4F6F8" w:val="clear"/>
+        <w:spacing w:after="0"/>
+      </w:pPr>
+      <w:r>
+        <w:rPr>
+          <w:rFonts w:ascii="Consolas" w:cs="Consolas" w:eastAsia="Consolas" w:hAnsi="Consolas"/>
+          <w:sz w:val="17"/>
+          <w:szCs w:val="17"/>
+        </w:rPr>
+        <w:t xml:space="preserve"># koa_ingrowth.R   (2026-06-05)</w:t>
+      </w:r>
+    </w:p>
+    <w:p>
+      <w:pPr>
+        <w:shd w:fill="F4F6F8" w:val="clear"/>
+        <w:spacing w:after="0"/>
+      </w:pPr>
+      <w:r>
+        <w:rPr>
+          <w:rFonts w:ascii="Consolas" w:cs="Consolas" w:eastAsia="Consolas" w:hAnsi="Consolas"/>
+          <w:sz w:val="17"/>
+          <w:szCs w:val="17"/>
+        </w:rPr>
+        <w:t xml:space="preserve"># Koa-only annualized ingrowth for FVS-HI, to add the missing recruitment</w:t>
+      </w:r>
+    </w:p>
+    <w:p>
+      <w:pPr>
+        <w:shd w:fill="F4F6F8" w:val="clear"/>
+        <w:spacing w:after="0"/>
+      </w:pPr>
+      <w:r>
+        <w:rPr>
+          <w:rFonts w:ascii="Consolas" w:cs="Consolas" w:eastAsia="Consolas" w:hAnsi="Consolas"/>
+          <w:sz w:val="17"/>
+          <w:szCs w:val="17"/>
+        </w:rPr>
+        <w:t xml:space="preserve"># component (HiGy.R currently has no ingrowth). Follows the two-stage / density</w:t>
+      </w:r>
+    </w:p>
+    <w:p>
+      <w:pPr>
+        <w:shd w:fill="F4F6F8" w:val="clear"/>
+        <w:spacing w:after="0"/>
+      </w:pPr>
+      <w:r>
+        <w:rPr>
+          <w:rFonts w:ascii="Consolas" w:cs="Consolas" w:eastAsia="Consolas" w:hAnsi="Consolas"/>
+          <w:sz w:val="17"/>
+          <w:szCs w:val="17"/>
+        </w:rPr>
+        <w:t xml:space="preserve"># logic of Li, Weiskittel &amp; Kershaw (2011, Can. J. For. Res. 41:2077-2089) but</w:t>
+      </w:r>
+    </w:p>
+    <w:p>
+      <w:pPr>
+        <w:shd w:fill="F4F6F8" w:val="clear"/>
+        <w:spacing w:after="0"/>
+      </w:pPr>
+      <w:r>
+        <w:rPr>
+          <w:rFonts w:ascii="Consolas" w:cs="Consolas" w:eastAsia="Consolas" w:hAnsi="Consolas"/>
+          <w:sz w:val="17"/>
+          <w:szCs w:val="17"/>
+        </w:rPr>
+        <w:t xml:space="preserve"># reduced to a single annualized expectation keyed on relative density (RD), per</w:t>
+      </w:r>
+    </w:p>
+    <w:p>
+      <w:pPr>
+        <w:shd w:fill="F4F6F8" w:val="clear"/>
+        <w:spacing w:after="0"/>
+      </w:pPr>
+      <w:r>
+        <w:rPr>
+          <w:rFonts w:ascii="Consolas" w:cs="Consolas" w:eastAsia="Consolas" w:hAnsi="Consolas"/>
+          <w:sz w:val="17"/>
+          <w:szCs w:val="17"/>
+        </w:rPr>
+        <w:t xml:space="preserve"># Aaron's preference.</w:t>
+      </w:r>
+    </w:p>
+    <w:p>
+      <w:pPr>
+        <w:shd w:fill="F4F6F8" w:val="clear"/>
+        <w:spacing w:after="0"/>
+      </w:pPr>
+      <w:r>
+        <w:rPr>
+          <w:rFonts w:ascii="Consolas" w:cs="Consolas" w:eastAsia="Consolas" w:hAnsi="Consolas"/>
+          <w:sz w:val="17"/>
+          <w:szCs w:val="17"/>
+        </w:rPr>
+        <w:t xml:space="preserve">#</w:t>
+      </w:r>
+    </w:p>
+    <w:p>
+      <w:pPr>
+        <w:shd w:fill="F4F6F8" w:val="clear"/>
+        <w:spacing w:after="0"/>
+      </w:pPr>
+      <w:r>
+        <w:rPr>
+          <w:rFonts w:ascii="Consolas" w:cs="Consolas" w:eastAsia="Consolas" w:hAnsi="Consolas"/>
+          <w:sz w:val="17"/>
+          <w:szCs w:val="17"/>
+        </w:rPr>
+        <w:t xml:space="preserve"># DATA. Reconstructed from AK.HT.csv remeasurements (363 plot-periods, 22%</w:t>
+      </w:r>
+    </w:p>
+    <w:p>
+      <w:pPr>
+        <w:shd w:fill="F4F6F8" w:val="clear"/>
+        <w:spacing w:after="0"/>
+      </w:pPr>
+      <w:r>
+        <w:rPr>
+          <w:rFonts w:ascii="Consolas" w:cs="Consolas" w:eastAsia="Consolas" w:hAnsi="Consolas"/>
+          <w:sz w:val="17"/>
+          <w:szCs w:val="17"/>
+        </w:rPr>
+        <w:t xml:space="preserve"># with ingrowth). Quasi-Poisson log model:</w:t>
+      </w:r>
+    </w:p>
+    <w:p>
+      <w:pPr>
+        <w:shd w:fill="F4F6F8" w:val="clear"/>
+        <w:spacing w:after="0"/>
+      </w:pPr>
+      <w:r>
+        <w:rPr>
+          <w:rFonts w:ascii="Consolas" w:cs="Consolas" w:eastAsia="Consolas" w:hAnsi="Consolas"/>
+          <w:sz w:val="17"/>
+          <w:szCs w:val="17"/>
+        </w:rPr>
+        <w:t xml:space="preserve">#</w:t>
+      </w:r>
+    </w:p>
+    <w:p>
+      <w:pPr>
+        <w:shd w:fill="F4F6F8" w:val="clear"/>
+        <w:spacing w:after="0"/>
+      </w:pPr>
+      <w:r>
+        <w:rPr>
+          <w:rFonts w:ascii="Consolas" w:cs="Consolas" w:eastAsia="Consolas" w:hAnsi="Consolas"/>
+          <w:sz w:val="17"/>
+          <w:szCs w:val="17"/>
+        </w:rPr>
+        <w:t xml:space="preserve">#   E[ingrowth, trees/ha/yr] = exp( 5.3836 - 3.0933*RD - 1.6359*planted )</w:t>
+      </w:r>
+    </w:p>
+    <w:p>
+      <w:pPr>
+        <w:shd w:fill="F4F6F8" w:val="clear"/>
+        <w:spacing w:after="0"/>
+      </w:pPr>
+      <w:r>
+        <w:rPr>
+          <w:rFonts w:ascii="Consolas" w:cs="Consolas" w:eastAsia="Consolas" w:hAnsi="Consolas"/>
+          <w:sz w:val="17"/>
+          <w:szCs w:val="17"/>
+        </w:rPr>
+        <w:t xml:space="preserve">#</w:t>
+      </w:r>
+    </w:p>
+    <w:p>
+      <w:pPr>
+        <w:shd w:fill="F4F6F8" w:val="clear"/>
+        <w:spacing w:after="0"/>
+      </w:pPr>
+      <w:r>
+        <w:rPr>
+          <w:rFonts w:ascii="Consolas" w:cs="Consolas" w:eastAsia="Consolas" w:hAnsi="Consolas"/>
+          <w:sz w:val="17"/>
+          <w:szCs w:val="17"/>
+        </w:rPr>
+        <w:t xml:space="preserve">#   RD = SDI / SDImax (SDImax = 500); planted = 0 natural, 1 plantation.</w:t>
+      </w:r>
+    </w:p>
+    <w:p>
+      <w:pPr>
+        <w:shd w:fill="F4F6F8" w:val="clear"/>
+        <w:spacing w:after="0"/>
+      </w:pPr>
+      <w:r>
+        <w:rPr>
+          <w:rFonts w:ascii="Consolas" w:cs="Consolas" w:eastAsia="Consolas" w:hAnsi="Consolas"/>
+          <w:sz w:val="17"/>
+          <w:szCs w:val="17"/>
+        </w:rPr>
+        <w:t xml:space="preserve">#</w:t>
+      </w:r>
+    </w:p>
+    <w:p>
+      <w:pPr>
+        <w:shd w:fill="F4F6F8" w:val="clear"/>
+        <w:spacing w:after="0"/>
+      </w:pPr>
+      <w:r>
+        <w:rPr>
+          <w:rFonts w:ascii="Consolas" w:cs="Consolas" w:eastAsia="Consolas" w:hAnsi="Consolas"/>
+          <w:sz w:val="17"/>
+          <w:szCs w:val="17"/>
+        </w:rPr>
+        <w:t xml:space="preserve"># FINDINGS. RD is the dominant driver (p &lt; 1e-4): ingrowth falls from ~160</w:t>
+      </w:r>
+    </w:p>
+    <w:p>
+      <w:pPr>
+        <w:shd w:fill="F4F6F8" w:val="clear"/>
+        <w:spacing w:after="0"/>
+      </w:pPr>
+      <w:r>
+        <w:rPr>
+          <w:rFonts w:ascii="Consolas" w:cs="Consolas" w:eastAsia="Consolas" w:hAnsi="Consolas"/>
+          <w:sz w:val="17"/>
+          <w:szCs w:val="17"/>
+        </w:rPr>
+        <w:t xml:space="preserve"># (open) to ~13 trees/ha/yr near canopy closure. Plantations have ~5x less</w:t>
+      </w:r>
+    </w:p>
+    <w:p>
+      <w:pPr>
+        <w:shd w:fill="F4F6F8" w:val="clear"/>
+        <w:spacing w:after="0"/>
+      </w:pPr>
+      <w:r>
+        <w:rPr>
+          <w:rFonts w:ascii="Consolas" w:cs="Consolas" w:eastAsia="Consolas" w:hAnsi="Consolas"/>
+          <w:sz w:val="17"/>
+          <w:szCs w:val="17"/>
+        </w:rPr>
+        <w:t xml:space="preserve"># ingrowth (rate ratio 0.195, p = 0.029) -- managed/weeded. BYI is NOT included:</w:t>
+      </w:r>
+    </w:p>
+    <w:p>
+      <w:pPr>
+        <w:shd w:fill="F4F6F8" w:val="clear"/>
+        <w:spacing w:after="0"/>
+      </w:pPr>
+      <w:r>
+        <w:rPr>
+          <w:rFonts w:ascii="Consolas" w:cs="Consolas" w:eastAsia="Consolas" w:hAnsi="Consolas"/>
+          <w:sz w:val="17"/>
+          <w:szCs w:val="17"/>
+        </w:rPr>
+        <w:t xml:space="preserve"># neither a BYI main effect (p = 0.28) nor a BYI x RD interaction (p = 0.56) is</w:t>
+      </w:r>
+    </w:p>
+    <w:p>
+      <w:pPr>
+        <w:shd w:fill="F4F6F8" w:val="clear"/>
+        <w:spacing w:after="0"/>
+      </w:pPr>
+      <w:r>
+        <w:rPr>
+          <w:rFonts w:ascii="Consolas" w:cs="Consolas" w:eastAsia="Consolas" w:hAnsi="Consolas"/>
+          <w:sz w:val="17"/>
+          <w:szCs w:val="17"/>
+        </w:rPr>
+        <w:t xml:space="preserve"># significant, and % koa BA has no variation (koa stands are ~pure koa). BYI acts</w:t>
+      </w:r>
+    </w:p>
+    <w:p>
+      <w:pPr>
+        <w:shd w:fill="F4F6F8" w:val="clear"/>
+        <w:spacing w:after="0"/>
+      </w:pPr>
+      <w:r>
+        <w:rPr>
+          <w:rFonts w:ascii="Consolas" w:cs="Consolas" w:eastAsia="Consolas" w:hAnsi="Consolas"/>
+          <w:sz w:val="17"/>
+          <w:szCs w:val="17"/>
+        </w:rPr>
+        <w:t xml:space="preserve"># on ingrowth indirectly through growth (it raises RD faster). byi_c &gt; 0 enables</w:t>
+      </w:r>
+    </w:p>
+    <w:p>
+      <w:pPr>
+        <w:shd w:fill="F4F6F8" w:val="clear"/>
+        <w:spacing w:after="0"/>
+      </w:pPr>
+      <w:r>
+        <w:rPr>
+          <w:rFonts w:ascii="Consolas" w:cs="Consolas" w:eastAsia="Consolas" w:hAnsi="Consolas"/>
+          <w:sz w:val="17"/>
+          <w:szCs w:val="17"/>
+        </w:rPr>
+        <w:t xml:space="preserve"># an OPTIONAL, untested BYI multiplier (Aaron's hypothesis: BYI raises ingrowth).</w:t>
+      </w:r>
+    </w:p>
+    <w:p>
+      <w:pPr>
+        <w:shd w:fill="F4F6F8" w:val="clear"/>
+        <w:spacing w:after="0"/>
+      </w:pPr>
+      <w:r>
+        <w:rPr>
+          <w:rFonts w:ascii="Consolas" w:cs="Consolas" w:eastAsia="Consolas" w:hAnsi="Consolas"/>
+          <w:sz w:val="17"/>
+          <w:szCs w:val="17"/>
+        </w:rPr>
+        <w:t xml:space="preserve">#</w:t>
+      </w:r>
+    </w:p>
+    <w:p>
+      <w:pPr>
+        <w:shd w:fill="F4F6F8" w:val="clear"/>
+        <w:spacing w:after="0"/>
+      </w:pPr>
+      <w:r>
+        <w:rPr>
+          <w:rFonts w:ascii="Consolas" w:cs="Consolas" w:eastAsia="Consolas" w:hAnsi="Consolas"/>
+          <w:sz w:val="17"/>
+          <w:szCs w:val="17"/>
+        </w:rPr>
+        <w:t xml:space="preserve"># Recruits enter at a threshold DBH (default 2.5 cm); set HT from koa.HT and an</w:t>
+      </w:r>
+    </w:p>
+    <w:p>
+      <w:pPr>
+        <w:shd w:fill="F4F6F8" w:val="clear"/>
+        <w:spacing w:after="0"/>
+      </w:pPr>
+      <w:r>
+        <w:rPr>
+          <w:rFonts w:ascii="Consolas" w:cs="Consolas" w:eastAsia="Consolas" w:hAnsi="Consolas"/>
+          <w:sz w:val="17"/>
+          <w:szCs w:val="17"/>
+        </w:rPr>
+        <w:t xml:space="preserve"># initial crown ratio, then add to the tree list before the next cycle.</w:t>
+      </w:r>
+    </w:p>
+    <w:p>
+      <w:pPr>
+        <w:shd w:fill="F4F6F8" w:val="clear"/>
+        <w:spacing w:after="0"/>
+      </w:pPr>
+      <w:r>
+        <w:rPr>
+          <w:rFonts w:ascii="Consolas" w:cs="Consolas" w:eastAsia="Consolas" w:hAnsi="Consolas"/>
+          <w:sz w:val="17"/>
+          <w:szCs w:val="17"/>
+        </w:rPr>
+        <w:t xml:space="preserve"> </w:t>
+      </w:r>
+    </w:p>
+    <w:p>
+      <w:pPr>
+        <w:shd w:fill="F4F6F8" w:val="clear"/>
+        <w:spacing w:after="0"/>
+      </w:pPr>
+      <w:r>
+        <w:rPr>
+          <w:rFonts w:ascii="Consolas" w:cs="Consolas" w:eastAsia="Consolas" w:hAnsi="Consolas"/>
+          <w:sz w:val="17"/>
+          <w:szCs w:val="17"/>
+        </w:rPr>
+        <w:t xml:space="preserve">koa.ingrowth &lt;- function(sdi = NA, baph = NA, planted = 0, SDImax = 500,</w:t>
+      </w:r>
+    </w:p>
+    <w:p>
+      <w:pPr>
+        <w:shd w:fill="F4F6F8" w:val="clear"/>
+        <w:spacing w:after="0"/>
+      </w:pPr>
+      <w:r>
+        <w:rPr>
+          <w:rFonts w:ascii="Consolas" w:cs="Consolas" w:eastAsia="Consolas" w:hAnsi="Consolas"/>
+          <w:sz w:val="17"/>
+          <w:szCs w:val="17"/>
+        </w:rPr>
+        <w:t xml:space="preserve">                         b0 = 5.3836, b_rd = -3.0933, b_planted = -1.6359,</w:t>
+      </w:r>
+    </w:p>
+    <w:p>
+      <w:pPr>
+        <w:shd w:fill="F4F6F8" w:val="clear"/>
+        <w:spacing w:after="0"/>
+      </w:pPr>
+      <w:r>
+        <w:rPr>
+          <w:rFonts w:ascii="Consolas" w:cs="Consolas" w:eastAsia="Consolas" w:hAnsi="Consolas"/>
+          <w:sz w:val="17"/>
+          <w:szCs w:val="17"/>
+        </w:rPr>
+        <w:t xml:space="preserve">                         byi = 264, byi_c = 0, byi_ref = 390, cap = 160) {</w:t>
+      </w:r>
+    </w:p>
+    <w:p>
+      <w:pPr>
+        <w:shd w:fill="F4F6F8" w:val="clear"/>
+        <w:spacing w:after="0"/>
+      </w:pPr>
+      <w:r>
+        <w:rPr>
+          <w:rFonts w:ascii="Consolas" w:cs="Consolas" w:eastAsia="Consolas" w:hAnsi="Consolas"/>
+          <w:sz w:val="17"/>
+          <w:szCs w:val="17"/>
+        </w:rPr>
+        <w:t xml:space="preserve">  RD &lt;- if (!is.na(sdi)) sdi / SDImax else baph / 60</w:t>
+      </w:r>
+    </w:p>
+    <w:p>
+      <w:pPr>
+        <w:shd w:fill="F4F6F8" w:val="clear"/>
+        <w:spacing w:after="0"/>
+      </w:pPr>
+      <w:r>
+        <w:rPr>
+          <w:rFonts w:ascii="Consolas" w:cs="Consolas" w:eastAsia="Consolas" w:hAnsi="Consolas"/>
+          <w:sz w:val="17"/>
+          <w:szCs w:val="17"/>
+        </w:rPr>
+        <w:t xml:space="preserve">  e  &lt;- exp(b0 + b_rd * RD + b_planted * (planted == 1))</w:t>
+      </w:r>
+    </w:p>
+    <w:p>
+      <w:pPr>
+        <w:shd w:fill="F4F6F8" w:val="clear"/>
+        <w:spacing w:after="0"/>
+      </w:pPr>
+      <w:r>
+        <w:rPr>
+          <w:rFonts w:ascii="Consolas" w:cs="Consolas" w:eastAsia="Consolas" w:hAnsi="Consolas"/>
+          <w:sz w:val="17"/>
+          <w:szCs w:val="17"/>
+        </w:rPr>
+        <w:t xml:space="preserve">  if (byi_c != 0) e &lt;- e * (pmax(byi, 1) / byi_ref)^byi_c</w:t>
+      </w:r>
+    </w:p>
+    <w:p>
+      <w:pPr>
+        <w:shd w:fill="F4F6F8" w:val="clear"/>
+        <w:spacing w:after="0"/>
+      </w:pPr>
+      <w:r>
+        <w:rPr>
+          <w:rFonts w:ascii="Consolas" w:cs="Consolas" w:eastAsia="Consolas" w:hAnsi="Consolas"/>
+          <w:sz w:val="17"/>
+          <w:szCs w:val="17"/>
+        </w:rPr>
+        <w:t xml:space="preserve">  pmin(pmax(e, 0), cap)                       # expected recruits, trees/ha/yr</w:t>
+      </w:r>
+    </w:p>
+    <w:p>
+      <w:pPr>
+        <w:shd w:fill="F4F6F8" w:val="clear"/>
+        <w:spacing w:after="0"/>
+      </w:pPr>
+      <w:r>
+        <w:rPr>
+          <w:rFonts w:ascii="Consolas" w:cs="Consolas" w:eastAsia="Consolas" w:hAnsi="Consolas"/>
+          <w:sz w:val="17"/>
+          <w:szCs w:val="17"/>
+        </w:rPr>
+        <w:t xml:space="preserve">}</w:t>
+      </w:r>
+    </w:p>
+    <w:p>
+      <w:pPr>
+        <w:shd w:fill="F4F6F8" w:val="clear"/>
+        <w:spacing w:after="0"/>
+      </w:pPr>
+      <w:r>
+        <w:rPr>
+          <w:rFonts w:ascii="Consolas" w:cs="Consolas" w:eastAsia="Consolas" w:hAnsi="Consolas"/>
+          <w:sz w:val="17"/>
+          <w:szCs w:val="17"/>
+        </w:rPr>
+        <w:t xml:space="preserve"> </w:t>
+      </w:r>
+    </w:p>
+    <w:p>
+      <w:pPr>
+        <w:shd w:fill="F4F6F8" w:val="clear"/>
+        <w:spacing w:after="0"/>
+      </w:pPr>
+      <w:r>
+        <w:rPr>
+          <w:rFonts w:ascii="Consolas" w:cs="Consolas" w:eastAsia="Consolas" w:hAnsi="Consolas"/>
+          <w:sz w:val="17"/>
+          <w:szCs w:val="17"/>
+        </w:rPr>
+        <w:t xml:space="preserve"># Drop-in for HiGy.R (add an ingrowth step, e.g. at FVS stop point 6):</w:t>
+      </w:r>
+    </w:p>
+    <w:p>
+      <w:pPr>
+        <w:shd w:fill="F4F6F8" w:val="clear"/>
+        <w:spacing w:after="0"/>
+      </w:pPr>
+      <w:r>
+        <w:rPr>
+          <w:rFonts w:ascii="Consolas" w:cs="Consolas" w:eastAsia="Consolas" w:hAnsi="Consolas"/>
+          <w:sz w:val="17"/>
+          <w:szCs w:val="17"/>
+        </w:rPr>
+        <w:t xml:space="preserve">#   n.rec &lt;- koa.ingrowth(sdi = sdi, planted = stand$planted)   # trees/ha/yr</w:t>
+      </w:r>
+    </w:p>
+    <w:p>
+      <w:pPr>
+        <w:shd w:fill="F4F6F8" w:val="clear"/>
+        <w:spacing w:after="0"/>
+      </w:pPr>
+      <w:r>
+        <w:rPr>
+          <w:rFonts w:ascii="Consolas" w:cs="Consolas" w:eastAsia="Consolas" w:hAnsi="Consolas"/>
+          <w:sz w:val="17"/>
+          <w:szCs w:val="17"/>
+        </w:rPr>
+        <w:t xml:space="preserve">#   if (n.rec &gt; 0.01) add a recruit record: dbh = 2.5 cm,</w:t>
+      </w:r>
+    </w:p>
+    <w:p>
+      <w:pPr>
+        <w:shd w:fill="F4F6F8" w:val="clear"/>
+        <w:spacing w:after="0"/>
+      </w:pPr>
+      <w:r>
+        <w:rPr>
+          <w:rFonts w:ascii="Consolas" w:cs="Consolas" w:eastAsia="Consolas" w:hAnsi="Consolas"/>
+          <w:sz w:val="17"/>
+          <w:szCs w:val="17"/>
+        </w:rPr>
+        <w:t xml:space="preserve">#       ht = koa.HT(2.5, baph, qmd, byi), cr ~ 0.6, expf = n.rec</w:t>
+      </w:r>
+    </w:p>
+    <w:p>
+      <w:pPr>
+        <w:shd w:fill="F4F6F8" w:val="clear"/>
+        <w:spacing w:after="0"/>
+      </w:pPr>
+      <w:r>
+        <w:rPr>
+          <w:rFonts w:ascii="Consolas" w:cs="Consolas" w:eastAsia="Consolas" w:hAnsi="Consolas"/>
+          <w:sz w:val="17"/>
+          <w:szCs w:val="17"/>
+        </w:rPr>
+        <w:t xml:space="preserve"># Verified on 200-yr projections: stands become realistically multi-cohort</w:t>
+      </w:r>
+    </w:p>
+    <w:p>
+      <w:pPr>
+        <w:shd w:fill="F4F6F8" w:val="clear"/>
+        <w:spacing w:after="0"/>
+      </w:pPr>
+      <w:r>
+        <w:rPr>
+          <w:rFonts w:ascii="Consolas" w:cs="Consolas" w:eastAsia="Consolas" w:hAnsi="Consolas"/>
+          <w:sz w:val="17"/>
+          <w:szCs w:val="17"/>
+        </w:rPr>
+        <w:t xml:space="preserve"># (sustained BA/density rather than self-thinning to a few large trees), with no</w:t>
+      </w:r>
+    </w:p>
+    <w:p>
+      <w:pPr>
+        <w:shd w:fill="F4F6F8" w:val="clear"/>
+        <w:spacing w:after="0"/>
+      </w:pPr>
+      <w:r>
+        <w:rPr>
+          <w:rFonts w:ascii="Consolas" w:cs="Consolas" w:eastAsia="Consolas" w:hAnsi="Consolas"/>
+          <w:sz w:val="17"/>
+          <w:szCs w:val="17"/>
+        </w:rPr>
+        <w:t xml:space="preserve"># runaway or collapse across origin and BYI.</w:t>
       </w:r>
     </w:p>
     <w:p>

</xml_diff>

<commit_message>
Final long-term validation: 300-yr integrated stress + ingrowth turnover
- run_final_stress.py: 30 adversarial scenarios (5 starts x origin x BYI) to 300 yr.
  All robust; overstocked inputs (to 149% SDImax) self-correct in 3-5 yr; 100%
  reach steady state (SDI 69-82%, BA 21-26).
- run_ingrowth_behavior.py: ingrowth starts high, declines with RD, settles to
  turnover balance with mortality (~17.5/yr nat, ~5/yr plt; balance ~0).
- verify_consistency.py: R drop-ins match fitted CSVs + py modules (all OK).
- numpy projector engine (return_traj); report sections 12.2-12.3 + figures 8-9.
</commit_message>
<xml_diff>
--- a/fvsOL/inst/extdata/koa_stress_test/20260605_koa_FVS-HI_stress-test-report.docx
+++ b/fvsOL/inst/extdata/koa_stress_test/20260605_koa_FVS-HI_stress-test-report.docx
@@ -7204,6 +7204,162 @@
       </w:pPr>
       <w:r>
         <w:t xml:space="preserve">A higher maximum SDI for plantations is plausible but cannot be estimated here: plantations are sparse at high density (very few plantation records above 0.65 relative density), so a separate plantation SDImax is not identifiable. A single SDImax of 500 is used for both origins; this should be revisited as plantation remeasurements at high density accumulate. A sensitivity run with a higher plantation SDImax is straightforward to add if desired.</w:t>
+      </w:r>
+    </w:p>
+    <w:p>
+      <w:pPr>
+        <w:pStyle w:val="Heading2"/>
+      </w:pPr>
+      <w:r>
+        <w:t xml:space="preserve">12.2 Integrated system: 300-year adversarial stress test</w:t>
+      </w:r>
+    </w:p>
+    <w:p>
+      <w:pPr>
+        <w:spacing w:after="120"/>
+      </w:pPr>
+      <w:r>
+        <w:t xml:space="preserve">The full system (calibrated survival, size allocation, and ingrowth) was projected 300 years from five extreme starting states (dense small, sparse large, degraded, fully stocked, typical) crossed with both origins and three BYI levels, 30 scenarios. All 30 pass: no NaN or infinite values, no collapse, basal area bounded, quadratic mean diameter non-decreasing, and 100 percent reach a steady state. Stands initialized above the maximum SDI (the fully stocked start, up to 149 percent of SDImax) are drawn down to at or below the self-thinning line within 3 to 5 years and then settle, confirming the self-thinning mortality corrects overstocked inputs rather than letting them run away. Steady-state basal area is 21 to 26 m2/ha (SDI 69 to 82 percent of SDImax) across origin and site.</w:t>
+      </w:r>
+    </w:p>
+    <w:p>
+      <w:pPr>
+        <w:spacing w:after="80" w:before="80"/>
+        <w:jc w:val="center"/>
+      </w:pPr>
+      <w:r>
+        <w:drawing>
+          <wp:inline distT="0" distB="0" distL="0" distR="0">
+            <wp:extent cx="4476750" cy="1714500"/>
+            <wp:effectExtent t="0" r="0" b="0" l="0"/>
+            <wp:docPr id="1" name="fig_final_stress.png" descr="fig_final_stress.png" title="fig_final_stress.png"/>
+            <wp:cNvGraphicFramePr>
+              <a:graphicFrameLocks xmlns:a="http://schemas.openxmlformats.org/drawingml/2006/main" noChangeAspect="1"/>
+            </wp:cNvGraphicFramePr>
+            <a:graphic xmlns:a="http://schemas.openxmlformats.org/drawingml/2006/main">
+              <a:graphicData uri="http://schemas.openxmlformats.org/drawingml/2006/picture">
+                <pic:pic xmlns:pic="http://schemas.openxmlformats.org/drawingml/2006/picture">
+                  <pic:nvPicPr>
+                    <pic:cNvPr id="0" name="" descr=""/>
+                    <pic:cNvPicPr>
+                      <a:picLocks noChangeAspect="1" noChangeArrowheads="1"/>
+                    </pic:cNvPicPr>
+                  </pic:nvPicPr>
+                  <pic:blipFill>
+                    <a:blip r:embed="rId15" cstate="none"/>
+                    <a:srcRect/>
+                    <a:stretch>
+                      <a:fillRect/>
+                    </a:stretch>
+                  </pic:blipFill>
+                  <pic:spPr bwMode="auto">
+                    <a:xfrm>
+                      <a:off x="0" y="0"/>
+                      <a:ext cx="4476750" cy="1714500"/>
+                    </a:xfrm>
+                    <a:prstGeom prst="rect">
+                      <a:avLst/>
+                    </a:prstGeom>
+                  </pic:spPr>
+                </pic:pic>
+              </a:graphicData>
+            </a:graphic>
+          </wp:inline>
+        </w:drawing>
+      </w:r>
+    </w:p>
+    <w:p>
+      <w:pPr>
+        <w:spacing w:after="160"/>
+        <w:jc w:val="center"/>
+      </w:pPr>
+      <w:r>
+        <w:rPr>
+          <w:i/>
+          <w:iCs/>
+          <w:color w:val="555555"/>
+          <w:sz w:val="16"/>
+          <w:szCs w:val="16"/>
+        </w:rPr>
+        <w:t xml:space="preserve">Figure 8. Integrated 300-year behavior (typical start). Left: basal area converges to a stable steady state for every origin and BYI. Right: relative density stays below the self-thinning line after the initial correction.</w:t>
+      </w:r>
+    </w:p>
+    <w:p>
+      <w:pPr>
+        <w:pStyle w:val="Heading2"/>
+      </w:pPr>
+      <w:r>
+        <w:t xml:space="preserve">12.3 Ingrowth behavior over long-term projections</w:t>
+      </w:r>
+    </w:p>
+    <w:p>
+      <w:pPr>
+        <w:spacing w:after="120"/>
+      </w:pPr>
+      <w:r>
+        <w:t xml:space="preserve">Tracking the annual recruitment rate over 300 years shows the expected pattern: ingrowth starts high in the open young stand (about 31 to 39 trees per hectare per year for natural stands), declines as relative density rises and the canopy closes, and then settles to a steady rate. At equilibrium the steady ingrowth almost exactly balances the steady mortality (recruitment of about 17.5 versus mortality of about 17.5 trees per hectare per year for natural stands; balance within 0.2), so the stand becomes self-replacing with stable basal area and density rather than accumulating or declining. Plantations recruit about five times less (about 5 per year) and balance their lower mortality. This turnover balance is the behavior expected of a sound long-term ingrowth and mortality system.</w:t>
+      </w:r>
+    </w:p>
+    <w:p>
+      <w:pPr>
+        <w:spacing w:after="80" w:before="80"/>
+        <w:jc w:val="center"/>
+      </w:pPr>
+      <w:r>
+        <w:drawing>
+          <wp:inline distT="0" distB="0" distL="0" distR="0">
+            <wp:extent cx="4476750" cy="1714500"/>
+            <wp:effectExtent t="0" r="0" b="0" l="0"/>
+            <wp:docPr id="1" name="fig_ingrowth_behavior.png" descr="fig_ingrowth_behavior.png" title="fig_ingrowth_behavior.png"/>
+            <wp:cNvGraphicFramePr>
+              <a:graphicFrameLocks xmlns:a="http://schemas.openxmlformats.org/drawingml/2006/main" noChangeAspect="1"/>
+            </wp:cNvGraphicFramePr>
+            <a:graphic xmlns:a="http://schemas.openxmlformats.org/drawingml/2006/main">
+              <a:graphicData uri="http://schemas.openxmlformats.org/drawingml/2006/picture">
+                <pic:pic xmlns:pic="http://schemas.openxmlformats.org/drawingml/2006/picture">
+                  <pic:nvPicPr>
+                    <pic:cNvPr id="0" name="" descr=""/>
+                    <pic:cNvPicPr>
+                      <a:picLocks noChangeAspect="1" noChangeArrowheads="1"/>
+                    </pic:cNvPicPr>
+                  </pic:nvPicPr>
+                  <pic:blipFill>
+                    <a:blip r:embed="rId16" cstate="none"/>
+                    <a:srcRect/>
+                    <a:stretch>
+                      <a:fillRect/>
+                    </a:stretch>
+                  </pic:blipFill>
+                  <pic:spPr bwMode="auto">
+                    <a:xfrm>
+                      <a:off x="0" y="0"/>
+                      <a:ext cx="4476750" cy="1714500"/>
+                    </a:xfrm>
+                    <a:prstGeom prst="rect">
+                      <a:avLst/>
+                    </a:prstGeom>
+                  </pic:spPr>
+                </pic:pic>
+              </a:graphicData>
+            </a:graphic>
+          </wp:inline>
+        </w:drawing>
+      </w:r>
+    </w:p>
+    <w:p>
+      <w:pPr>
+        <w:spacing w:after="160"/>
+        <w:jc w:val="center"/>
+      </w:pPr>
+      <w:r>
+        <w:rPr>
+          <w:i/>
+          <w:iCs/>
+          <w:color w:val="555555"/>
+          <w:sz w:val="16"/>
+          <w:szCs w:val="16"/>
+        </w:rPr>
+        <w:t xml:space="preserve">Figure 9. Ingrowth over 300 years. Left: recruitment starts high, declines with density, and settles to a steady rate (natural higher than plantation). Right (natural): steady ingrowth balances mortality at equilibrium (turnover).</w:t>
       </w:r>
     </w:p>
     <w:p>

</xml_diff>